<commit_message>
add title and line
</commit_message>
<xml_diff>
--- a/Doc's/Program CharterV1.docx
+++ b/Doc's/Program CharterV1.docx
@@ -17,23 +17,123 @@
     <w:p>
       <w:pPr>
         <w:spacing w:after="142"/>
+        <w:jc w:val="center"/>
+        <w:rPr>
+          <w:rFonts w:asciiTheme="majorHAnsi" w:hAnsiTheme="majorHAnsi"/>
+          <w:b/>
+          <w:bCs/>
+          <w:color w:val="156082" w:themeColor="accent1"/>
+          <w:sz w:val="48"/>
+          <w:szCs w:val="28"/>
+        </w:rPr>
       </w:pPr>
+      <w:r>
+        <w:rPr>
+          <w:rFonts w:asciiTheme="majorHAnsi" w:hAnsiTheme="majorHAnsi"/>
+          <w:b/>
+          <w:bCs/>
+          <w:noProof/>
+          <w:color w:val="156082" w:themeColor="accent1"/>
+          <w:sz w:val="48"/>
+          <w:szCs w:val="28"/>
+        </w:rPr>
+        <mc:AlternateContent>
+          <mc:Choice Requires="wps">
+            <w:drawing>
+              <wp:anchor distT="0" distB="0" distL="114300" distR="114300" simplePos="0" relativeHeight="251659264" behindDoc="0" locked="0" layoutInCell="1" allowOverlap="1" wp14:anchorId="3EB448EB" wp14:editId="15B17DD0">
+                <wp:simplePos x="0" y="0"/>
+                <wp:positionH relativeFrom="column">
+                  <wp:posOffset>762000</wp:posOffset>
+                </wp:positionH>
+                <wp:positionV relativeFrom="paragraph">
+                  <wp:posOffset>441960</wp:posOffset>
+                </wp:positionV>
+                <wp:extent cx="6431280" cy="0"/>
+                <wp:effectExtent l="0" t="0" r="0" b="0"/>
+                <wp:wrapNone/>
+                <wp:docPr id="1526137454" name="Straight Connector 9"/>
+                <wp:cNvGraphicFramePr/>
+                <a:graphic xmlns:a="http://schemas.openxmlformats.org/drawingml/2006/main">
+                  <a:graphicData uri="http://schemas.microsoft.com/office/word/2010/wordprocessingShape">
+                    <wps:wsp>
+                      <wps:cNvCnPr/>
+                      <wps:spPr>
+                        <a:xfrm>
+                          <a:off x="0" y="0"/>
+                          <a:ext cx="6431280" cy="0"/>
+                        </a:xfrm>
+                        <a:prstGeom prst="line">
+                          <a:avLst/>
+                        </a:prstGeom>
+                      </wps:spPr>
+                      <wps:style>
+                        <a:lnRef idx="2">
+                          <a:schemeClr val="accent1"/>
+                        </a:lnRef>
+                        <a:fillRef idx="0">
+                          <a:schemeClr val="accent1"/>
+                        </a:fillRef>
+                        <a:effectRef idx="1">
+                          <a:schemeClr val="accent1"/>
+                        </a:effectRef>
+                        <a:fontRef idx="minor">
+                          <a:schemeClr val="tx1"/>
+                        </a:fontRef>
+                      </wps:style>
+                      <wps:bodyPr/>
+                    </wps:wsp>
+                  </a:graphicData>
+                </a:graphic>
+              </wp:anchor>
+            </w:drawing>
+          </mc:Choice>
+          <mc:Fallback>
+            <w:pict>
+              <v:line w14:anchorId="425E56B2" id="Straight Connector 9" o:spid="_x0000_s1026" style="position:absolute;z-index:251659264;visibility:visible;mso-wrap-style:square;mso-wrap-distance-left:9pt;mso-wrap-distance-top:0;mso-wrap-distance-right:9pt;mso-wrap-distance-bottom:0;mso-position-horizontal:absolute;mso-position-horizontal-relative:text;mso-position-vertical:absolute;mso-position-vertical-relative:text" from="60pt,34.8pt" to="566.4pt,34.8pt" o:gfxdata="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" strokecolor="#156082 [3204]" strokeweight="1.5pt">
+                <v:stroke joinstyle="miter"/>
+              </v:line>
+            </w:pict>
+          </mc:Fallback>
+        </mc:AlternateContent>
+      </w:r>
       <w:proofErr w:type="spellStart"/>
       <w:r>
         <w:rPr>
-          <w:color w:val="202020"/>
-          <w:sz w:val="45"/>
+          <w:rFonts w:asciiTheme="majorHAnsi" w:hAnsiTheme="majorHAnsi"/>
+          <w:b/>
+          <w:bCs/>
+          <w:color w:val="156082" w:themeColor="accent1"/>
+          <w:sz w:val="48"/>
+          <w:szCs w:val="28"/>
         </w:rPr>
         <w:t>Program</w:t>
       </w:r>
       <w:proofErr w:type="spellEnd"/>
       <w:r>
         <w:rPr>
-          <w:color w:val="202020"/>
-          <w:sz w:val="45"/>
+          <w:rFonts w:asciiTheme="majorHAnsi" w:hAnsiTheme="majorHAnsi"/>
+          <w:b/>
+          <w:bCs/>
+          <w:color w:val="156082" w:themeColor="accent1"/>
+          <w:sz w:val="48"/>
+          <w:szCs w:val="28"/>
         </w:rPr>
         <w:t xml:space="preserve"> Charter</w:t>
       </w:r>
+    </w:p>
+    <w:p>
+      <w:pPr>
+        <w:spacing w:after="142"/>
+        <w:jc w:val="center"/>
+        <w:rPr>
+          <w:rFonts w:asciiTheme="majorHAnsi" w:hAnsiTheme="majorHAnsi"/>
+          <w:b/>
+          <w:bCs/>
+          <w:color w:val="156082" w:themeColor="accent1"/>
+          <w:sz w:val="24"/>
+          <w:szCs w:val="28"/>
+        </w:rPr>
+      </w:pPr>
     </w:p>
     <w:p>
       <w:pPr>
@@ -1208,6 +1308,7 @@
         <w:rPr>
           <w:b/>
         </w:rPr>
+        <w:lastRenderedPageBreak/>
         <w:t>Program</w:t>
       </w:r>
       <w:proofErr w:type="spellEnd"/>
@@ -1604,7 +1705,6 @@
           <w:color w:val="202020"/>
           <w:sz w:val="24"/>
         </w:rPr>
-        <w:lastRenderedPageBreak/>
         <w:t xml:space="preserve">Success </w:t>
       </w:r>
       <w:proofErr w:type="spellStart"/>
@@ -4783,6 +4883,7 @@
           <w:color w:val="202020"/>
           <w:sz w:val="24"/>
         </w:rPr>
+        <w:lastRenderedPageBreak/>
         <w:t xml:space="preserve">                        </w:t>
       </w:r>
     </w:p>

</xml_diff>

<commit_message>
updated field and add new information
</commit_message>
<xml_diff>
--- a/Doc's/Program CharterV1.docx
+++ b/Doc's/Program CharterV1.docx
@@ -89,14 +89,13 @@
           </mc:Choice>
           <mc:Fallback>
             <w:pict>
-              <v:line w14:anchorId="425E56B2" id="Straight Connector 9" o:spid="_x0000_s1026" style="position:absolute;z-index:251659264;visibility:visible;mso-wrap-style:square;mso-wrap-distance-left:9pt;mso-wrap-distance-top:0;mso-wrap-distance-right:9pt;mso-wrap-distance-bottom:0;mso-position-horizontal:absolute;mso-position-horizontal-relative:text;mso-position-vertical:absolute;mso-position-vertical-relative:text" from="60pt,34.8pt" to="566.4pt,34.8pt" o:gfxdata="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" strokecolor="#156082 [3204]" strokeweight="1.5pt">
+              <v:line w14:anchorId="3E38FA06" id="Straight Connector 9" o:spid="_x0000_s1026" style="position:absolute;z-index:251659264;visibility:visible;mso-wrap-style:square;mso-wrap-distance-left:9pt;mso-wrap-distance-top:0;mso-wrap-distance-right:9pt;mso-wrap-distance-bottom:0;mso-position-horizontal:absolute;mso-position-horizontal-relative:text;mso-position-vertical:absolute;mso-position-vertical-relative:text" from="60pt,34.8pt" to="566.4pt,34.8pt" o:gfxdata="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" strokecolor="#156082 [3204]" strokeweight="1.5pt">
                 <v:stroke joinstyle="miter"/>
               </v:line>
             </w:pict>
           </mc:Fallback>
         </mc:AlternateContent>
       </w:r>
-      <w:proofErr w:type="spellStart"/>
       <w:r>
         <w:rPr>
           <w:rFonts w:asciiTheme="majorHAnsi" w:hAnsiTheme="majorHAnsi"/>
@@ -106,9 +105,19 @@
           <w:sz w:val="48"/>
           <w:szCs w:val="28"/>
         </w:rPr>
-        <w:t>Program</w:t>
+        <w:t>Pro</w:t>
       </w:r>
-      <w:proofErr w:type="spellEnd"/>
+      <w:r>
+        <w:rPr>
+          <w:rFonts w:asciiTheme="majorHAnsi" w:hAnsiTheme="majorHAnsi"/>
+          <w:b/>
+          <w:bCs/>
+          <w:color w:val="156082" w:themeColor="accent1"/>
+          <w:sz w:val="48"/>
+          <w:szCs w:val="28"/>
+        </w:rPr>
+        <w:t>ject</w:t>
+      </w:r>
       <w:r>
         <w:rPr>
           <w:rFonts w:asciiTheme="majorHAnsi" w:hAnsiTheme="majorHAnsi"/>
@@ -152,21 +161,8 @@
         <w:pStyle w:val="Heading1"/>
         <w:ind w:left="-5"/>
       </w:pPr>
-      <w:proofErr w:type="spellStart"/>
       <w:r>
-        <w:t>Program</w:t>
-      </w:r>
-      <w:proofErr w:type="spellEnd"/>
-      <w:r>
-        <w:t xml:space="preserve"> </w:t>
-      </w:r>
-      <w:proofErr w:type="spellStart"/>
-      <w:r>
-        <w:t>Organization</w:t>
-      </w:r>
-      <w:proofErr w:type="spellEnd"/>
-      <w:r>
-        <w:t xml:space="preserve"> </w:t>
+        <w:t>Document information</w:t>
       </w:r>
     </w:p>
     <w:tbl>
@@ -206,23 +202,13 @@
             <w:pPr>
               <w:spacing w:after="0"/>
             </w:pPr>
-            <w:proofErr w:type="spellStart"/>
             <w:r>
               <w:rPr>
                 <w:b/>
                 <w:color w:val="202020"/>
                 <w:sz w:val="24"/>
               </w:rPr>
-              <w:t>Program</w:t>
-            </w:r>
-            <w:proofErr w:type="spellEnd"/>
-            <w:r>
-              <w:rPr>
-                <w:b/>
-                <w:color w:val="202020"/>
-                <w:sz w:val="24"/>
-              </w:rPr>
-              <w:t xml:space="preserve"> Title</w:t>
+              <w:t>Project name</w:t>
             </w:r>
           </w:p>
         </w:tc>
@@ -251,7 +237,15 @@
                 <w:sz w:val="24"/>
                 <w:lang w:val="en-US"/>
               </w:rPr>
-              <w:t xml:space="preserve">Save One Day A Week </w:t>
+              <w:t>WashPedre</w:t>
+            </w:r>
+            <w:r>
+              <w:rPr>
+                <w:color w:val="202020"/>
+                <w:sz w:val="24"/>
+                <w:lang w:val="en-US"/>
+              </w:rPr>
+              <w:t xml:space="preserve"> </w:t>
             </w:r>
           </w:p>
         </w:tc>
@@ -276,34 +270,14 @@
             <w:pPr>
               <w:spacing w:after="0"/>
             </w:pPr>
-            <w:proofErr w:type="spellStart"/>
             <w:r>
               <w:rPr>
                 <w:b/>
                 <w:color w:val="202020"/>
                 <w:sz w:val="24"/>
               </w:rPr>
-              <w:t>Program</w:t>
-            </w:r>
-            <w:proofErr w:type="spellEnd"/>
-            <w:r>
-              <w:rPr>
-                <w:b/>
-                <w:color w:val="202020"/>
-                <w:sz w:val="24"/>
-              </w:rPr>
-              <w:t xml:space="preserve"> </w:t>
-            </w:r>
-            <w:proofErr w:type="spellStart"/>
-            <w:r>
-              <w:rPr>
-                <w:b/>
-                <w:color w:val="202020"/>
-                <w:sz w:val="24"/>
-              </w:rPr>
-              <w:t>Duration</w:t>
-            </w:r>
-            <w:proofErr w:type="spellEnd"/>
+              <w:t>Document code</w:t>
+            </w:r>
           </w:p>
         </w:tc>
         <w:tc>
@@ -327,7 +301,7 @@
                 <w:color w:val="202020"/>
                 <w:sz w:val="24"/>
               </w:rPr>
-              <w:t>May 1st - June 3rd</w:t>
+              <w:t>WPD-CHR-001</w:t>
             </w:r>
           </w:p>
         </w:tc>
@@ -352,23 +326,13 @@
             <w:pPr>
               <w:spacing w:after="0"/>
             </w:pPr>
-            <w:proofErr w:type="spellStart"/>
             <w:r>
               <w:rPr>
                 <w:b/>
                 <w:color w:val="202020"/>
                 <w:sz w:val="24"/>
               </w:rPr>
-              <w:t>Program</w:t>
-            </w:r>
-            <w:proofErr w:type="spellEnd"/>
-            <w:r>
-              <w:rPr>
-                <w:b/>
-                <w:color w:val="202020"/>
-                <w:sz w:val="24"/>
-              </w:rPr>
-              <w:t xml:space="preserve"> Manager</w:t>
+              <w:t>Version</w:t>
             </w:r>
           </w:p>
         </w:tc>
@@ -393,15 +357,7 @@
                 <w:color w:val="202020"/>
                 <w:sz w:val="24"/>
               </w:rPr>
-              <w:t>@</w:t>
-            </w:r>
-            <w:r>
-              <w:rPr>
-                <w:i/>
-                <w:color w:val="202020"/>
-                <w:sz w:val="24"/>
-              </w:rPr>
-              <w:t>mention</w:t>
+              <w:t>1.0</w:t>
             </w:r>
           </w:p>
         </w:tc>
@@ -426,34 +382,14 @@
             <w:pPr>
               <w:spacing w:after="0"/>
             </w:pPr>
-            <w:proofErr w:type="spellStart"/>
             <w:r>
               <w:rPr>
                 <w:b/>
                 <w:color w:val="202020"/>
                 <w:sz w:val="24"/>
               </w:rPr>
-              <w:t>Program</w:t>
-            </w:r>
-            <w:proofErr w:type="spellEnd"/>
-            <w:r>
-              <w:rPr>
-                <w:b/>
-                <w:color w:val="202020"/>
-                <w:sz w:val="24"/>
-              </w:rPr>
-              <w:t xml:space="preserve"> </w:t>
-            </w:r>
-            <w:proofErr w:type="gramStart"/>
-            <w:r>
-              <w:rPr>
-                <w:b/>
-                <w:color w:val="202020"/>
-                <w:sz w:val="24"/>
-              </w:rPr>
-              <w:t>Sponsor</w:t>
-            </w:r>
-            <w:proofErr w:type="gramEnd"/>
+              <w:t>Status</w:t>
+            </w:r>
           </w:p>
         </w:tc>
         <w:tc>
@@ -473,26 +409,14 @@
               <w:ind w:left="4"/>
             </w:pPr>
             <w:r>
-              <w:rPr>
-                <w:color w:val="202020"/>
-                <w:sz w:val="24"/>
-              </w:rPr>
-              <w:t>@</w:t>
-            </w:r>
-            <w:r>
-              <w:rPr>
-                <w:i/>
-                <w:color w:val="202020"/>
-                <w:sz w:val="24"/>
-              </w:rPr>
-              <w:t>mention</w:t>
+              <w:t>Draft</w:t>
             </w:r>
           </w:p>
         </w:tc>
       </w:tr>
       <w:tr>
         <w:trPr>
-          <w:trHeight w:val="898"/>
+          <w:trHeight w:val="680"/>
         </w:trPr>
         <w:tc>
           <w:tcPr>
@@ -509,16 +433,14 @@
             <w:pPr>
               <w:spacing w:after="0"/>
             </w:pPr>
-            <w:proofErr w:type="spellStart"/>
             <w:r>
               <w:rPr>
                 <w:b/>
                 <w:color w:val="202020"/>
                 <w:sz w:val="24"/>
               </w:rPr>
-              <w:t>Communication</w:t>
-            </w:r>
-            <w:proofErr w:type="spellEnd"/>
+              <w:t>Author</w:t>
+            </w:r>
           </w:p>
         </w:tc>
         <w:tc>
@@ -542,11 +464,9 @@
             </w:pPr>
             <w:r>
               <w:rPr>
-                <w:color w:val="202020"/>
-                <w:sz w:val="24"/>
                 <w:lang w:val="en-US"/>
               </w:rPr>
-              <w:t>#program-slack-channel</w:t>
+              <w:t>Job Isai Pulache Carreño</w:t>
             </w:r>
           </w:p>
           <w:p>
@@ -557,13 +477,67 @@
                 <w:lang w:val="en-US"/>
               </w:rPr>
             </w:pPr>
-            <w:r>
-              <w:rPr>
-                <w:color w:val="202020"/>
-                <w:sz w:val="24"/>
+          </w:p>
+        </w:tc>
+      </w:tr>
+      <w:tr>
+        <w:trPr>
+          <w:trHeight w:val="577"/>
+        </w:trPr>
+        <w:tc>
+          <w:tcPr>
+            <w:tcW w:w="3326" w:type="dxa"/>
+            <w:tcBorders>
+              <w:top w:val="single" w:sz="6" w:space="0" w:color="CECECE"/>
+              <w:left w:val="single" w:sz="6" w:space="0" w:color="CECECE"/>
+              <w:bottom w:val="single" w:sz="6" w:space="0" w:color="CECECE"/>
+              <w:right w:val="single" w:sz="6" w:space="0" w:color="CECECE"/>
+            </w:tcBorders>
+            <w:shd w:val="clear" w:color="auto" w:fill="D9DAFF"/>
+          </w:tcPr>
+          <w:p>
+            <w:pPr>
+              <w:spacing w:after="0"/>
+              <w:rPr>
+                <w:b/>
+                <w:color w:val="202020"/>
+                <w:sz w:val="24"/>
+              </w:rPr>
+            </w:pPr>
+            <w:r>
+              <w:rPr>
+                <w:b/>
+                <w:color w:val="202020"/>
+                <w:sz w:val="24"/>
+              </w:rPr>
+              <w:t>Date</w:t>
+            </w:r>
+          </w:p>
+        </w:tc>
+        <w:tc>
+          <w:tcPr>
+            <w:tcW w:w="7157" w:type="dxa"/>
+            <w:tcBorders>
+              <w:top w:val="single" w:sz="6" w:space="0" w:color="CECECE"/>
+              <w:left w:val="single" w:sz="6" w:space="0" w:color="CECECE"/>
+              <w:bottom w:val="single" w:sz="6" w:space="0" w:color="CECECE"/>
+              <w:right w:val="single" w:sz="6" w:space="0" w:color="CECECE"/>
+            </w:tcBorders>
+            <w:vAlign w:val="center"/>
+          </w:tcPr>
+          <w:p>
+            <w:pPr>
+              <w:spacing w:after="44"/>
+              <w:ind w:left="4"/>
+              <w:rPr>
                 <w:lang w:val="en-US"/>
               </w:rPr>
-              <w:t>Wednesday Standup Meeting (20 mins)</w:t>
+            </w:pPr>
+            <w:r>
+              <w:rPr>
+                <w:lang w:val="en-US"/>
+              </w:rPr>
+              <w:t>13 de Julio 2026</w:t>
             </w:r>
           </w:p>
         </w:tc>
@@ -580,25 +554,7 @@
           <w:color w:val="202020"/>
           <w:sz w:val="24"/>
         </w:rPr>
-        <w:t xml:space="preserve">Key </w:t>
-      </w:r>
-      <w:proofErr w:type="spellStart"/>
-      <w:r>
-        <w:rPr>
-          <w:b/>
-          <w:color w:val="202020"/>
-          <w:sz w:val="24"/>
-        </w:rPr>
-        <w:t>Stakeholders</w:t>
-      </w:r>
-      <w:proofErr w:type="spellEnd"/>
-      <w:r>
-        <w:rPr>
-          <w:b/>
-          <w:color w:val="202020"/>
-          <w:sz w:val="24"/>
-        </w:rPr>
-        <w:t>:</w:t>
+        <w:t>Key Stakeholders:</w:t>
       </w:r>
     </w:p>
     <w:tbl>
@@ -666,7 +622,6 @@
               <w:spacing w:after="0"/>
               <w:ind w:left="2"/>
             </w:pPr>
-            <w:proofErr w:type="spellStart"/>
             <w:r>
               <w:rPr>
                 <w:b/>
@@ -675,7 +630,6 @@
               </w:rPr>
               <w:t>Department</w:t>
             </w:r>
-            <w:proofErr w:type="spellEnd"/>
           </w:p>
         </w:tc>
         <w:tc>
@@ -695,41 +649,13 @@
               <w:spacing w:after="0"/>
               <w:ind w:left="2"/>
             </w:pPr>
-            <w:proofErr w:type="spellStart"/>
             <w:r>
               <w:rPr>
                 <w:b/>
                 <w:color w:val="202020"/>
                 <w:sz w:val="24"/>
               </w:rPr>
-              <w:t>Internal</w:t>
-            </w:r>
-            <w:proofErr w:type="spellEnd"/>
-            <w:r>
-              <w:rPr>
-                <w:b/>
-                <w:color w:val="202020"/>
-                <w:sz w:val="24"/>
-              </w:rPr>
-              <w:t>/</w:t>
-            </w:r>
-            <w:proofErr w:type="spellStart"/>
-            <w:r>
-              <w:rPr>
-                <w:b/>
-                <w:color w:val="202020"/>
-                <w:sz w:val="24"/>
-              </w:rPr>
-              <w:t>External</w:t>
-            </w:r>
-            <w:proofErr w:type="spellEnd"/>
-            <w:r>
-              <w:rPr>
-                <w:b/>
-                <w:color w:val="202020"/>
-                <w:sz w:val="24"/>
-              </w:rPr>
-              <w:t xml:space="preserve"> </w:t>
+              <w:t xml:space="preserve">Internal/External </w:t>
             </w:r>
           </w:p>
         </w:tc>
@@ -875,23 +801,13 @@
         <w:spacing w:after="0"/>
         <w:ind w:left="-5" w:hanging="10"/>
       </w:pPr>
-      <w:proofErr w:type="spellStart"/>
       <w:r>
         <w:rPr>
           <w:b/>
           <w:color w:val="202020"/>
           <w:sz w:val="24"/>
         </w:rPr>
-        <w:t>Program</w:t>
-      </w:r>
-      <w:proofErr w:type="spellEnd"/>
-      <w:r>
-        <w:rPr>
-          <w:b/>
-          <w:color w:val="202020"/>
-          <w:sz w:val="24"/>
-        </w:rPr>
-        <w:t xml:space="preserve"> Team:</w:t>
+        <w:t>Program Team:</w:t>
       </w:r>
     </w:p>
     <w:tbl>
@@ -959,7 +875,6 @@
               <w:spacing w:after="0"/>
               <w:ind w:left="2"/>
             </w:pPr>
-            <w:proofErr w:type="spellStart"/>
             <w:r>
               <w:rPr>
                 <w:b/>
@@ -968,7 +883,6 @@
               </w:rPr>
               <w:t>Department</w:t>
             </w:r>
-            <w:proofErr w:type="spellEnd"/>
           </w:p>
         </w:tc>
         <w:tc>
@@ -988,41 +902,13 @@
               <w:spacing w:after="0"/>
               <w:ind w:left="2"/>
             </w:pPr>
-            <w:proofErr w:type="spellStart"/>
             <w:r>
               <w:rPr>
                 <w:b/>
                 <w:color w:val="202020"/>
                 <w:sz w:val="24"/>
               </w:rPr>
-              <w:t>Internal</w:t>
-            </w:r>
-            <w:proofErr w:type="spellEnd"/>
-            <w:r>
-              <w:rPr>
-                <w:b/>
-                <w:color w:val="202020"/>
-                <w:sz w:val="24"/>
-              </w:rPr>
-              <w:t>/</w:t>
-            </w:r>
-            <w:proofErr w:type="spellStart"/>
-            <w:r>
-              <w:rPr>
-                <w:b/>
-                <w:color w:val="202020"/>
-                <w:sz w:val="24"/>
-              </w:rPr>
-              <w:t>External</w:t>
-            </w:r>
-            <w:proofErr w:type="spellEnd"/>
-            <w:r>
-              <w:rPr>
-                <w:b/>
-                <w:color w:val="202020"/>
-                <w:sz w:val="24"/>
-              </w:rPr>
-              <w:t xml:space="preserve"> </w:t>
+              <w:t xml:space="preserve">Internal/External </w:t>
             </w:r>
           </w:p>
         </w:tc>
@@ -1156,21 +1042,12 @@
         <w:spacing w:after="0"/>
         <w:ind w:left="-5" w:hanging="10"/>
       </w:pPr>
-      <w:proofErr w:type="spellStart"/>
       <w:r>
         <w:rPr>
           <w:color w:val="202020"/>
           <w:sz w:val="24"/>
         </w:rPr>
-        <w:t>Resources</w:t>
-      </w:r>
-      <w:proofErr w:type="spellEnd"/>
-      <w:r>
-        <w:rPr>
-          <w:color w:val="202020"/>
-          <w:sz w:val="24"/>
-        </w:rPr>
-        <w:t>:</w:t>
+        <w:t>Resources:</w:t>
       </w:r>
     </w:p>
     <w:tbl>
@@ -1303,7 +1180,6 @@
         <w:pStyle w:val="Heading1"/>
         <w:ind w:left="-5"/>
       </w:pPr>
-      <w:proofErr w:type="spellStart"/>
       <w:r>
         <w:rPr>
           <w:b/>
@@ -1311,15 +1187,9 @@
         <w:lastRenderedPageBreak/>
         <w:t>Program</w:t>
       </w:r>
-      <w:proofErr w:type="spellEnd"/>
       <w:r>
-        <w:t xml:space="preserve"> </w:t>
+        <w:t xml:space="preserve"> Overview</w:t>
       </w:r>
-      <w:proofErr w:type="spellStart"/>
-      <w:r>
-        <w:t>Overview</w:t>
-      </w:r>
-      <w:proofErr w:type="spellEnd"/>
     </w:p>
     <w:p>
       <w:pPr>
@@ -1331,306 +1201,14 @@
           <w:sz w:val="24"/>
           <w:lang w:val="en-US"/>
         </w:rPr>
-        <w:t xml:space="preserve">Lorem ipsum dolor </w:t>
-      </w:r>
-      <w:proofErr w:type="gramStart"/>
-      <w:r>
-        <w:rPr>
-          <w:color w:val="202020"/>
-          <w:sz w:val="24"/>
-          <w:lang w:val="en-US"/>
-        </w:rPr>
-        <w:t>sit</w:t>
-      </w:r>
-      <w:proofErr w:type="gramEnd"/>
-      <w:r>
-        <w:rPr>
-          <w:color w:val="202020"/>
-          <w:sz w:val="24"/>
-          <w:lang w:val="en-US"/>
-        </w:rPr>
-        <w:t xml:space="preserve"> </w:t>
-      </w:r>
-      <w:proofErr w:type="spellStart"/>
-      <w:r>
-        <w:rPr>
-          <w:color w:val="202020"/>
-          <w:sz w:val="24"/>
-          <w:lang w:val="en-US"/>
-        </w:rPr>
-        <w:t>amet</w:t>
-      </w:r>
-      <w:proofErr w:type="spellEnd"/>
-      <w:r>
-        <w:rPr>
-          <w:color w:val="202020"/>
-          <w:sz w:val="24"/>
-          <w:lang w:val="en-US"/>
-        </w:rPr>
-        <w:t xml:space="preserve">, </w:t>
-      </w:r>
-      <w:proofErr w:type="spellStart"/>
-      <w:r>
-        <w:rPr>
-          <w:color w:val="202020"/>
-          <w:sz w:val="24"/>
-          <w:lang w:val="en-US"/>
-        </w:rPr>
-        <w:t>consectetur</w:t>
-      </w:r>
-      <w:proofErr w:type="spellEnd"/>
-      <w:r>
-        <w:rPr>
-          <w:color w:val="202020"/>
-          <w:sz w:val="24"/>
-          <w:lang w:val="en-US"/>
-        </w:rPr>
-        <w:t xml:space="preserve"> </w:t>
-      </w:r>
-      <w:proofErr w:type="spellStart"/>
-      <w:r>
-        <w:rPr>
-          <w:color w:val="202020"/>
-          <w:sz w:val="24"/>
-          <w:lang w:val="en-US"/>
-        </w:rPr>
-        <w:t>adipiscing</w:t>
-      </w:r>
-      <w:proofErr w:type="spellEnd"/>
-      <w:r>
-        <w:rPr>
-          <w:color w:val="202020"/>
-          <w:sz w:val="24"/>
-          <w:lang w:val="en-US"/>
-        </w:rPr>
-        <w:t xml:space="preserve"> </w:t>
-      </w:r>
-      <w:proofErr w:type="spellStart"/>
-      <w:r>
-        <w:rPr>
-          <w:color w:val="202020"/>
-          <w:sz w:val="24"/>
-          <w:lang w:val="en-US"/>
-        </w:rPr>
-        <w:t>elit</w:t>
-      </w:r>
-      <w:proofErr w:type="spellEnd"/>
-      <w:r>
-        <w:rPr>
-          <w:color w:val="202020"/>
-          <w:sz w:val="24"/>
-          <w:lang w:val="en-US"/>
-        </w:rPr>
-        <w:t xml:space="preserve">, sed do </w:t>
-      </w:r>
-      <w:proofErr w:type="spellStart"/>
-      <w:r>
-        <w:rPr>
-          <w:color w:val="202020"/>
-          <w:sz w:val="24"/>
-          <w:lang w:val="en-US"/>
-        </w:rPr>
-        <w:t>eiusmod</w:t>
-      </w:r>
-      <w:proofErr w:type="spellEnd"/>
-      <w:r>
-        <w:rPr>
-          <w:color w:val="202020"/>
-          <w:sz w:val="24"/>
-          <w:lang w:val="en-US"/>
-        </w:rPr>
-        <w:t xml:space="preserve"> </w:t>
-      </w:r>
-      <w:proofErr w:type="spellStart"/>
-      <w:r>
-        <w:rPr>
-          <w:color w:val="202020"/>
-          <w:sz w:val="24"/>
-          <w:lang w:val="en-US"/>
-        </w:rPr>
-        <w:t>tempor</w:t>
-      </w:r>
-      <w:proofErr w:type="spellEnd"/>
-      <w:r>
-        <w:rPr>
-          <w:color w:val="202020"/>
-          <w:sz w:val="24"/>
-          <w:lang w:val="en-US"/>
-        </w:rPr>
-        <w:t xml:space="preserve"> </w:t>
-      </w:r>
-      <w:proofErr w:type="spellStart"/>
-      <w:r>
-        <w:rPr>
-          <w:color w:val="202020"/>
-          <w:sz w:val="24"/>
-          <w:lang w:val="en-US"/>
-        </w:rPr>
-        <w:t>incididunt</w:t>
-      </w:r>
-      <w:proofErr w:type="spellEnd"/>
-      <w:r>
-        <w:rPr>
-          <w:color w:val="202020"/>
-          <w:sz w:val="24"/>
-          <w:lang w:val="en-US"/>
-        </w:rPr>
-        <w:t xml:space="preserve"> </w:t>
-      </w:r>
-      <w:proofErr w:type="spellStart"/>
-      <w:r>
-        <w:rPr>
-          <w:color w:val="202020"/>
-          <w:sz w:val="24"/>
-          <w:lang w:val="en-US"/>
-        </w:rPr>
-        <w:t>ut</w:t>
-      </w:r>
-      <w:proofErr w:type="spellEnd"/>
-      <w:r>
-        <w:rPr>
-          <w:color w:val="202020"/>
-          <w:sz w:val="24"/>
-          <w:lang w:val="en-US"/>
-        </w:rPr>
-        <w:t xml:space="preserve"> labore et dolore magna </w:t>
-      </w:r>
-      <w:proofErr w:type="spellStart"/>
-      <w:r>
-        <w:rPr>
-          <w:color w:val="202020"/>
-          <w:sz w:val="24"/>
-          <w:lang w:val="en-US"/>
-        </w:rPr>
-        <w:t>aliqua</w:t>
-      </w:r>
-      <w:proofErr w:type="spellEnd"/>
-      <w:r>
-        <w:rPr>
-          <w:color w:val="202020"/>
-          <w:sz w:val="24"/>
-          <w:lang w:val="en-US"/>
-        </w:rPr>
-        <w:t xml:space="preserve">. </w:t>
+        <w:t xml:space="preserve">Lorem ipsum dolor sit amet, consectetur adipiscing elit, sed do eiusmod tempor incididunt ut labore et dolore magna aliqua. </w:t>
       </w:r>
       <w:r>
         <w:rPr>
           <w:color w:val="202020"/>
           <w:sz w:val="24"/>
         </w:rPr>
-        <w:t xml:space="preserve">Ut </w:t>
-      </w:r>
-      <w:proofErr w:type="spellStart"/>
-      <w:r>
-        <w:rPr>
-          <w:color w:val="202020"/>
-          <w:sz w:val="24"/>
-        </w:rPr>
-        <w:t>enim</w:t>
-      </w:r>
-      <w:proofErr w:type="spellEnd"/>
-      <w:r>
-        <w:rPr>
-          <w:color w:val="202020"/>
-          <w:sz w:val="24"/>
-        </w:rPr>
-        <w:t xml:space="preserve"> ad </w:t>
-      </w:r>
-      <w:proofErr w:type="spellStart"/>
-      <w:r>
-        <w:rPr>
-          <w:color w:val="202020"/>
-          <w:sz w:val="24"/>
-        </w:rPr>
-        <w:t>minim</w:t>
-      </w:r>
-      <w:proofErr w:type="spellEnd"/>
-      <w:r>
-        <w:rPr>
-          <w:color w:val="202020"/>
-          <w:sz w:val="24"/>
-        </w:rPr>
-        <w:t xml:space="preserve"> </w:t>
-      </w:r>
-      <w:proofErr w:type="spellStart"/>
-      <w:r>
-        <w:rPr>
-          <w:color w:val="202020"/>
-          <w:sz w:val="24"/>
-        </w:rPr>
-        <w:t>veniam</w:t>
-      </w:r>
-      <w:proofErr w:type="spellEnd"/>
-      <w:r>
-        <w:rPr>
-          <w:color w:val="202020"/>
-          <w:sz w:val="24"/>
-        </w:rPr>
-        <w:t xml:space="preserve">, quis </w:t>
-      </w:r>
-      <w:proofErr w:type="spellStart"/>
-      <w:r>
-        <w:rPr>
-          <w:color w:val="202020"/>
-          <w:sz w:val="24"/>
-        </w:rPr>
-        <w:t>nostrud</w:t>
-      </w:r>
-      <w:proofErr w:type="spellEnd"/>
-      <w:r>
-        <w:rPr>
-          <w:color w:val="202020"/>
-          <w:sz w:val="24"/>
-        </w:rPr>
-        <w:t xml:space="preserve"> </w:t>
-      </w:r>
-      <w:proofErr w:type="spellStart"/>
-      <w:r>
-        <w:rPr>
-          <w:color w:val="202020"/>
-          <w:sz w:val="24"/>
-        </w:rPr>
-        <w:t>exercitation</w:t>
-      </w:r>
-      <w:proofErr w:type="spellEnd"/>
-      <w:r>
-        <w:rPr>
-          <w:color w:val="202020"/>
-          <w:sz w:val="24"/>
-        </w:rPr>
-        <w:t xml:space="preserve"> </w:t>
-      </w:r>
-      <w:proofErr w:type="spellStart"/>
-      <w:r>
-        <w:rPr>
-          <w:color w:val="202020"/>
-          <w:sz w:val="24"/>
-        </w:rPr>
-        <w:t>ullamco</w:t>
-      </w:r>
-      <w:proofErr w:type="spellEnd"/>
-      <w:r>
-        <w:rPr>
-          <w:color w:val="202020"/>
-          <w:sz w:val="24"/>
-        </w:rPr>
-        <w:t xml:space="preserve"> </w:t>
-      </w:r>
-      <w:proofErr w:type="spellStart"/>
-      <w:r>
-        <w:rPr>
-          <w:color w:val="202020"/>
-          <w:sz w:val="24"/>
-        </w:rPr>
-        <w:t>laboris</w:t>
-      </w:r>
-      <w:proofErr w:type="spellEnd"/>
-      <w:r>
-        <w:rPr>
-          <w:color w:val="202020"/>
-          <w:sz w:val="24"/>
-        </w:rPr>
-        <w:t xml:space="preserve"> </w:t>
+        <w:t xml:space="preserve">Ut enim ad minim veniam, quis nostrud exercitation ullamco laboris </w:t>
       </w:r>
       <w:r>
         <w:rPr>
@@ -1644,55 +1222,7 @@
           <w:color w:val="202020"/>
           <w:sz w:val="24"/>
         </w:rPr>
-        <w:t xml:space="preserve"> ut </w:t>
-      </w:r>
-      <w:proofErr w:type="spellStart"/>
-      <w:r>
-        <w:rPr>
-          <w:color w:val="202020"/>
-          <w:sz w:val="24"/>
-        </w:rPr>
-        <w:t>aliquip</w:t>
-      </w:r>
-      <w:proofErr w:type="spellEnd"/>
-      <w:r>
-        <w:rPr>
-          <w:color w:val="202020"/>
-          <w:sz w:val="24"/>
-        </w:rPr>
-        <w:t xml:space="preserve"> ex </w:t>
-      </w:r>
-      <w:proofErr w:type="spellStart"/>
-      <w:r>
-        <w:rPr>
-          <w:color w:val="202020"/>
-          <w:sz w:val="24"/>
-        </w:rPr>
-        <w:t>ea</w:t>
-      </w:r>
-      <w:proofErr w:type="spellEnd"/>
-      <w:r>
-        <w:rPr>
-          <w:color w:val="202020"/>
-          <w:sz w:val="24"/>
-        </w:rPr>
-        <w:t xml:space="preserve"> commodo </w:t>
-      </w:r>
-      <w:proofErr w:type="spellStart"/>
-      <w:r>
-        <w:rPr>
-          <w:color w:val="202020"/>
-          <w:sz w:val="24"/>
-        </w:rPr>
-        <w:t>consequat</w:t>
-      </w:r>
-      <w:proofErr w:type="spellEnd"/>
-      <w:r>
-        <w:rPr>
-          <w:color w:val="202020"/>
-          <w:sz w:val="24"/>
-        </w:rPr>
-        <w:t>.</w:t>
+        <w:t xml:space="preserve"> ut aliquip ex ea commodo consequat.</w:t>
       </w:r>
     </w:p>
     <w:p>
@@ -1705,23 +1235,7 @@
           <w:color w:val="202020"/>
           <w:sz w:val="24"/>
         </w:rPr>
-        <w:t xml:space="preserve">Success </w:t>
-      </w:r>
-      <w:proofErr w:type="spellStart"/>
-      <w:r>
-        <w:rPr>
-          <w:color w:val="202020"/>
-          <w:sz w:val="24"/>
-        </w:rPr>
-        <w:t>Metrics</w:t>
-      </w:r>
-      <w:proofErr w:type="spellEnd"/>
-      <w:r>
-        <w:rPr>
-          <w:color w:val="202020"/>
-          <w:sz w:val="24"/>
-        </w:rPr>
-        <w:t>:</w:t>
+        <w:t>Success Metrics:</w:t>
       </w:r>
     </w:p>
     <w:tbl>
@@ -1789,7 +1303,6 @@
               <w:spacing w:after="0"/>
               <w:ind w:left="2"/>
             </w:pPr>
-            <w:proofErr w:type="spellStart"/>
             <w:r>
               <w:rPr>
                 <w:b/>
@@ -1798,7 +1311,6 @@
               </w:rPr>
               <w:t>Goal</w:t>
             </w:r>
-            <w:proofErr w:type="spellEnd"/>
           </w:p>
         </w:tc>
         <w:tc>
@@ -1824,61 +1336,7 @@
                 <w:color w:val="202020"/>
                 <w:sz w:val="24"/>
               </w:rPr>
-              <w:t xml:space="preserve">How </w:t>
-            </w:r>
-            <w:proofErr w:type="spellStart"/>
-            <w:r>
-              <w:rPr>
-                <w:b/>
-                <w:color w:val="202020"/>
-                <w:sz w:val="24"/>
-              </w:rPr>
-              <w:t>will</w:t>
-            </w:r>
-            <w:proofErr w:type="spellEnd"/>
-            <w:r>
-              <w:rPr>
-                <w:b/>
-                <w:color w:val="202020"/>
-                <w:sz w:val="24"/>
-              </w:rPr>
-              <w:t xml:space="preserve"> </w:t>
-            </w:r>
-            <w:proofErr w:type="spellStart"/>
-            <w:r>
-              <w:rPr>
-                <w:b/>
-                <w:color w:val="202020"/>
-                <w:sz w:val="24"/>
-              </w:rPr>
-              <w:t>we</w:t>
-            </w:r>
-            <w:proofErr w:type="spellEnd"/>
-            <w:r>
-              <w:rPr>
-                <w:b/>
-                <w:color w:val="202020"/>
-                <w:sz w:val="24"/>
-              </w:rPr>
-              <w:t xml:space="preserve"> </w:t>
-            </w:r>
-            <w:proofErr w:type="spellStart"/>
-            <w:r>
-              <w:rPr>
-                <w:b/>
-                <w:color w:val="202020"/>
-                <w:sz w:val="24"/>
-              </w:rPr>
-              <w:t>measure</w:t>
-            </w:r>
-            <w:proofErr w:type="spellEnd"/>
-            <w:r>
-              <w:rPr>
-                <w:b/>
-                <w:color w:val="202020"/>
-                <w:sz w:val="24"/>
-              </w:rPr>
-              <w:t>?</w:t>
+              <w:t>How will we measure?</w:t>
             </w:r>
           </w:p>
         </w:tc>
@@ -2017,23 +1475,7 @@
           <w:color w:val="202020"/>
           <w:sz w:val="24"/>
         </w:rPr>
-        <w:t xml:space="preserve">Scope </w:t>
-      </w:r>
-      <w:proofErr w:type="spellStart"/>
-      <w:r>
-        <w:rPr>
-          <w:color w:val="202020"/>
-          <w:sz w:val="24"/>
-        </w:rPr>
-        <w:t>of</w:t>
-      </w:r>
-      <w:proofErr w:type="spellEnd"/>
-      <w:r>
-        <w:rPr>
-          <w:color w:val="202020"/>
-          <w:sz w:val="24"/>
-        </w:rPr>
-        <w:t xml:space="preserve"> Work: </w:t>
+        <w:t xml:space="preserve">Scope of Work: </w:t>
       </w:r>
     </w:p>
     <w:tbl>
@@ -2157,7 +1599,6 @@
               <w:spacing w:after="0"/>
               <w:ind w:left="2"/>
             </w:pPr>
-            <w:proofErr w:type="spellStart"/>
             <w:r>
               <w:rPr>
                 <w:b/>
@@ -2166,7 +1607,6 @@
               </w:rPr>
               <w:t>Description</w:t>
             </w:r>
-            <w:proofErr w:type="spellEnd"/>
           </w:p>
         </w:tc>
         <w:tc>
@@ -2390,41 +1830,13 @@
             <w:pPr>
               <w:spacing w:after="0"/>
             </w:pPr>
-            <w:proofErr w:type="spellStart"/>
             <w:r>
               <w:rPr>
                 <w:b/>
                 <w:color w:val="202020"/>
                 <w:sz w:val="24"/>
               </w:rPr>
-              <w:t>Out</w:t>
-            </w:r>
-            <w:proofErr w:type="spellEnd"/>
-            <w:r>
-              <w:rPr>
-                <w:b/>
-                <w:color w:val="202020"/>
-                <w:sz w:val="24"/>
-              </w:rPr>
-              <w:t xml:space="preserve"> </w:t>
-            </w:r>
-            <w:proofErr w:type="spellStart"/>
-            <w:r>
-              <w:rPr>
-                <w:b/>
-                <w:color w:val="202020"/>
-                <w:sz w:val="24"/>
-              </w:rPr>
-              <w:t>of</w:t>
-            </w:r>
-            <w:proofErr w:type="spellEnd"/>
-            <w:r>
-              <w:rPr>
-                <w:b/>
-                <w:color w:val="202020"/>
-                <w:sz w:val="24"/>
-              </w:rPr>
-              <w:t xml:space="preserve"> Scope</w:t>
+              <w:t>Out of Scope</w:t>
             </w:r>
           </w:p>
         </w:tc>
@@ -2475,7 +1887,6 @@
               <w:spacing w:after="0"/>
               <w:ind w:left="158"/>
             </w:pPr>
-            <w:proofErr w:type="spellStart"/>
             <w:r>
               <w:rPr>
                 <w:b/>
@@ -2484,7 +1895,6 @@
               </w:rPr>
               <w:t>Description</w:t>
             </w:r>
-            <w:proofErr w:type="spellEnd"/>
           </w:p>
         </w:tc>
         <w:tc>
@@ -2668,21 +2078,12 @@
         <w:spacing w:after="0"/>
         <w:ind w:left="-5" w:hanging="10"/>
       </w:pPr>
-      <w:proofErr w:type="spellStart"/>
       <w:r>
         <w:rPr>
           <w:color w:val="202020"/>
           <w:sz w:val="24"/>
         </w:rPr>
-        <w:t>Deliverables</w:t>
-      </w:r>
-      <w:proofErr w:type="spellEnd"/>
-      <w:r>
-        <w:rPr>
-          <w:color w:val="202020"/>
-          <w:sz w:val="24"/>
-        </w:rPr>
-        <w:t>:</w:t>
+        <w:t>Deliverables:</w:t>
       </w:r>
     </w:p>
     <w:tbl>
@@ -2814,7 +2215,6 @@
               <w:spacing w:after="0"/>
               <w:ind w:left="2"/>
             </w:pPr>
-            <w:proofErr w:type="spellStart"/>
             <w:r>
               <w:rPr>
                 <w:b/>
@@ -2823,7 +2223,6 @@
               </w:rPr>
               <w:t>Event</w:t>
             </w:r>
-            <w:proofErr w:type="spellEnd"/>
           </w:p>
         </w:tc>
         <w:tc>
@@ -3060,7 +2459,6 @@
               <w:spacing w:after="0"/>
               <w:ind w:left="2"/>
             </w:pPr>
-            <w:proofErr w:type="spellStart"/>
             <w:r>
               <w:rPr>
                 <w:b/>
@@ -3069,7 +2467,6 @@
               </w:rPr>
               <w:t>Event</w:t>
             </w:r>
-            <w:proofErr w:type="spellEnd"/>
           </w:p>
         </w:tc>
       </w:tr>
@@ -3263,7 +2660,6 @@
               <w:spacing w:after="0"/>
               <w:ind w:left="2"/>
             </w:pPr>
-            <w:proofErr w:type="spellStart"/>
             <w:r>
               <w:rPr>
                 <w:b/>
@@ -3272,7 +2668,6 @@
               </w:rPr>
               <w:t>Event</w:t>
             </w:r>
-            <w:proofErr w:type="spellEnd"/>
           </w:p>
         </w:tc>
       </w:tr>
@@ -3372,21 +2767,12 @@
         <w:spacing w:after="0"/>
         <w:ind w:left="-5" w:hanging="10"/>
       </w:pPr>
-      <w:proofErr w:type="spellStart"/>
       <w:r>
         <w:rPr>
           <w:color w:val="202020"/>
           <w:sz w:val="24"/>
         </w:rPr>
-        <w:t>Milestones</w:t>
-      </w:r>
-      <w:proofErr w:type="spellEnd"/>
-      <w:r>
-        <w:rPr>
-          <w:color w:val="202020"/>
-          <w:sz w:val="24"/>
-        </w:rPr>
-        <w:t>:</w:t>
+        <w:t>Milestones:</w:t>
       </w:r>
     </w:p>
     <w:tbl>
@@ -3453,7 +2839,6 @@
               <w:spacing w:after="0"/>
               <w:ind w:left="2"/>
             </w:pPr>
-            <w:proofErr w:type="spellStart"/>
             <w:r>
               <w:rPr>
                 <w:b/>
@@ -3462,7 +2847,6 @@
               </w:rPr>
               <w:t>Event</w:t>
             </w:r>
-            <w:proofErr w:type="spellEnd"/>
           </w:p>
         </w:tc>
       </w:tr>
@@ -3559,21 +2943,12 @@
         <w:spacing w:after="0"/>
         <w:ind w:left="-5" w:hanging="10"/>
       </w:pPr>
-      <w:proofErr w:type="spellStart"/>
       <w:r>
         <w:rPr>
           <w:color w:val="202020"/>
           <w:sz w:val="24"/>
         </w:rPr>
-        <w:t>Risks</w:t>
-      </w:r>
-      <w:proofErr w:type="spellEnd"/>
-      <w:r>
-        <w:rPr>
-          <w:color w:val="202020"/>
-          <w:sz w:val="24"/>
-        </w:rPr>
-        <w:t xml:space="preserve"> &amp; Issues:</w:t>
+        <w:t>Risks &amp; Issues:</w:t>
       </w:r>
     </w:p>
     <w:tbl>
@@ -3614,23 +2989,13 @@
             <w:pPr>
               <w:spacing w:after="0"/>
             </w:pPr>
-            <w:proofErr w:type="spellStart"/>
             <w:r>
               <w:rPr>
                 <w:b/>
                 <w:color w:val="202020"/>
                 <w:sz w:val="24"/>
               </w:rPr>
-              <w:t>Potential</w:t>
-            </w:r>
-            <w:proofErr w:type="spellEnd"/>
-            <w:r>
-              <w:rPr>
-                <w:b/>
-                <w:color w:val="202020"/>
-                <w:sz w:val="24"/>
-              </w:rPr>
-              <w:t xml:space="preserve"> Risk</w:t>
+              <w:t>Potential Risk</w:t>
             </w:r>
           </w:p>
         </w:tc>
@@ -3651,34 +3016,14 @@
               <w:spacing w:after="0"/>
               <w:ind w:left="2"/>
             </w:pPr>
-            <w:proofErr w:type="spellStart"/>
             <w:r>
               <w:rPr>
                 <w:b/>
                 <w:color w:val="202020"/>
                 <w:sz w:val="24"/>
               </w:rPr>
-              <w:t>Perceived</w:t>
-            </w:r>
-            <w:proofErr w:type="spellEnd"/>
-            <w:r>
-              <w:rPr>
-                <w:b/>
-                <w:color w:val="202020"/>
-                <w:sz w:val="24"/>
-              </w:rPr>
-              <w:t xml:space="preserve"> </w:t>
-            </w:r>
-            <w:proofErr w:type="spellStart"/>
-            <w:r>
-              <w:rPr>
-                <w:b/>
-                <w:color w:val="202020"/>
-                <w:sz w:val="24"/>
-              </w:rPr>
-              <w:t>Impact</w:t>
-            </w:r>
-            <w:proofErr w:type="spellEnd"/>
+              <w:t>Perceived Impact</w:t>
+            </w:r>
           </w:p>
         </w:tc>
         <w:tc>
@@ -3698,34 +3043,14 @@
               <w:spacing w:after="0"/>
               <w:ind w:left="2"/>
             </w:pPr>
-            <w:proofErr w:type="spellStart"/>
             <w:r>
               <w:rPr>
                 <w:b/>
                 <w:color w:val="202020"/>
                 <w:sz w:val="24"/>
               </w:rPr>
-              <w:t>Mitigation</w:t>
-            </w:r>
-            <w:proofErr w:type="spellEnd"/>
-            <w:r>
-              <w:rPr>
-                <w:b/>
-                <w:color w:val="202020"/>
-                <w:sz w:val="24"/>
-              </w:rPr>
-              <w:t xml:space="preserve"> </w:t>
-            </w:r>
-            <w:proofErr w:type="spellStart"/>
-            <w:r>
-              <w:rPr>
-                <w:b/>
-                <w:color w:val="202020"/>
-                <w:sz w:val="24"/>
-              </w:rPr>
-              <w:t>Strategy</w:t>
-            </w:r>
-            <w:proofErr w:type="spellEnd"/>
+              <w:t>Mitigation Strategy</w:t>
+            </w:r>
           </w:p>
         </w:tc>
       </w:tr>
@@ -3858,13 +3183,8 @@
         <w:pStyle w:val="Heading1"/>
         <w:ind w:left="-5"/>
       </w:pPr>
-      <w:proofErr w:type="spellStart"/>
       <w:r>
-        <w:t>Sign</w:t>
-      </w:r>
-      <w:proofErr w:type="spellEnd"/>
-      <w:r>
-        <w:t>-Off</w:t>
+        <w:t>Sign-Off</w:t>
       </w:r>
     </w:p>
     <w:tbl>
@@ -3905,7 +3225,6 @@
             <w:pPr>
               <w:spacing w:after="0"/>
             </w:pPr>
-            <w:proofErr w:type="spellStart"/>
             <w:r>
               <w:rPr>
                 <w:b/>
@@ -3914,7 +3233,6 @@
               </w:rPr>
               <w:t>Approved</w:t>
             </w:r>
-            <w:proofErr w:type="spellEnd"/>
           </w:p>
         </w:tc>
         <w:tc>
@@ -5116,11 +4434,9 @@
         <w:r>
           <w:t xml:space="preserve">                                                                    </w:t>
         </w:r>
-        <w:proofErr w:type="spellStart"/>
         <w:r>
           <w:t>WashPedre</w:t>
         </w:r>
-        <w:proofErr w:type="spellEnd"/>
       </w:p>
     </w:sdtContent>
   </w:sdt>
@@ -5223,7 +4539,6 @@
         </wp:anchor>
       </w:drawing>
     </w:r>
-    <w:proofErr w:type="spellStart"/>
     <w:r>
       <w:rPr>
         <w:color w:val="156082" w:themeColor="accent1"/>
@@ -5231,17 +4546,7 @@
         <w:szCs w:val="28"/>
         <w:lang w:val="en-US"/>
       </w:rPr>
-      <w:t>WashPedre</w:t>
-    </w:r>
-    <w:proofErr w:type="spellEnd"/>
-    <w:r>
-      <w:rPr>
-        <w:color w:val="156082" w:themeColor="accent1"/>
-        <w:sz w:val="24"/>
-        <w:szCs w:val="28"/>
-        <w:lang w:val="en-US"/>
-      </w:rPr>
-      <w:t xml:space="preserve"> – Enterprise Operations Platform | </w:t>
+      <w:t xml:space="preserve">WashPedre – Enterprise Operations Platform | </w:t>
     </w:r>
     <w:r>
       <w:rPr>
@@ -5687,7 +4992,6 @@
   <w:style w:type="character" w:default="1" w:styleId="DefaultParagraphFont">
     <w:name w:val="Default Paragraph Font"/>
     <w:uiPriority w:val="1"/>
-    <w:semiHidden/>
     <w:unhideWhenUsed/>
   </w:style>
   <w:style w:type="table" w:default="1" w:styleId="TableNormal">

</xml_diff>

<commit_message>
update someone fields and add tecnology stack
</commit_message>
<xml_diff>
--- a/Doc's/Program CharterV1.docx
+++ b/Doc's/Program CharterV1.docx
@@ -89,7 +89,7 @@
           </mc:Choice>
           <mc:Fallback>
             <w:pict>
-              <v:line w14:anchorId="3E38FA06" id="Straight Connector 9" o:spid="_x0000_s1026" style="position:absolute;z-index:251659264;visibility:visible;mso-wrap-style:square;mso-wrap-distance-left:9pt;mso-wrap-distance-top:0;mso-wrap-distance-right:9pt;mso-wrap-distance-bottom:0;mso-position-horizontal:absolute;mso-position-horizontal-relative:text;mso-position-vertical:absolute;mso-position-vertical-relative:text" from="60pt,34.8pt" to="566.4pt,34.8pt" o:gfxdata="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" strokecolor="#156082 [3204]" strokeweight="1.5pt">
+              <v:line w14:anchorId="339E1454" id="Straight Connector 9" o:spid="_x0000_s1026" style="position:absolute;z-index:251659264;visibility:visible;mso-wrap-style:square;mso-wrap-distance-left:9pt;mso-wrap-distance-top:0;mso-wrap-distance-right:9pt;mso-wrap-distance-bottom:0;mso-position-horizontal:absolute;mso-position-horizontal-relative:text;mso-position-vertical:absolute;mso-position-vertical-relative:text" from="60pt,34.8pt" to="566.4pt,34.8pt" o:gfxdata="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" strokecolor="#156082 [3204]" strokeweight="1.5pt">
                 <v:stroke joinstyle="miter"/>
               </v:line>
             </w:pict>
@@ -803,247 +803,6 @@
       </w:pPr>
       <w:r>
         <w:rPr>
-          <w:b/>
-          <w:color w:val="202020"/>
-          <w:sz w:val="24"/>
-        </w:rPr>
-        <w:t>Program Team:</w:t>
-      </w:r>
-    </w:p>
-    <w:tbl>
-      <w:tblPr>
-        <w:tblStyle w:val="TableGrid"/>
-        <w:tblW w:w="10436" w:type="dxa"/>
-        <w:tblInd w:w="159" w:type="dxa"/>
-        <w:tblCellMar>
-          <w:top w:w="0" w:type="dxa"/>
-          <w:left w:w="156" w:type="dxa"/>
-          <w:bottom w:w="0" w:type="dxa"/>
-          <w:right w:w="115" w:type="dxa"/>
-        </w:tblCellMar>
-        <w:tblLook w:val="04A0" w:firstRow="1" w:lastRow="0" w:firstColumn="1" w:lastColumn="0" w:noHBand="0" w:noVBand="1"/>
-      </w:tblPr>
-      <w:tblGrid>
-        <w:gridCol w:w="3493"/>
-        <w:gridCol w:w="3885"/>
-        <w:gridCol w:w="3058"/>
-      </w:tblGrid>
-      <w:tr>
-        <w:trPr>
-          <w:trHeight w:val="536"/>
-        </w:trPr>
-        <w:tc>
-          <w:tcPr>
-            <w:tcW w:w="3493" w:type="dxa"/>
-            <w:tcBorders>
-              <w:top w:val="single" w:sz="6" w:space="0" w:color="CECECE"/>
-              <w:left w:val="single" w:sz="6" w:space="0" w:color="CECECE"/>
-              <w:bottom w:val="single" w:sz="6" w:space="0" w:color="CECECE"/>
-              <w:right w:val="single" w:sz="6" w:space="0" w:color="CECECE"/>
-            </w:tcBorders>
-            <w:shd w:val="clear" w:color="auto" w:fill="D9DAFF"/>
-            <w:vAlign w:val="center"/>
-          </w:tcPr>
-          <w:p>
-            <w:pPr>
-              <w:spacing w:after="0"/>
-            </w:pPr>
-            <w:r>
-              <w:rPr>
-                <w:b/>
-                <w:color w:val="202020"/>
-                <w:sz w:val="24"/>
-              </w:rPr>
-              <w:t>Name</w:t>
-            </w:r>
-          </w:p>
-        </w:tc>
-        <w:tc>
-          <w:tcPr>
-            <w:tcW w:w="3885" w:type="dxa"/>
-            <w:tcBorders>
-              <w:top w:val="single" w:sz="6" w:space="0" w:color="CECECE"/>
-              <w:left w:val="single" w:sz="6" w:space="0" w:color="CECECE"/>
-              <w:bottom w:val="single" w:sz="6" w:space="0" w:color="CECECE"/>
-              <w:right w:val="single" w:sz="6" w:space="0" w:color="CECECE"/>
-            </w:tcBorders>
-            <w:shd w:val="clear" w:color="auto" w:fill="D9DAFF"/>
-            <w:vAlign w:val="center"/>
-          </w:tcPr>
-          <w:p>
-            <w:pPr>
-              <w:spacing w:after="0"/>
-              <w:ind w:left="2"/>
-            </w:pPr>
-            <w:r>
-              <w:rPr>
-                <w:b/>
-                <w:color w:val="202020"/>
-                <w:sz w:val="24"/>
-              </w:rPr>
-              <w:t>Department</w:t>
-            </w:r>
-          </w:p>
-        </w:tc>
-        <w:tc>
-          <w:tcPr>
-            <w:tcW w:w="3058" w:type="dxa"/>
-            <w:tcBorders>
-              <w:top w:val="single" w:sz="6" w:space="0" w:color="CECECE"/>
-              <w:left w:val="single" w:sz="6" w:space="0" w:color="CECECE"/>
-              <w:bottom w:val="single" w:sz="6" w:space="0" w:color="CECECE"/>
-              <w:right w:val="single" w:sz="6" w:space="0" w:color="CECECE"/>
-            </w:tcBorders>
-            <w:shd w:val="clear" w:color="auto" w:fill="D9DAFF"/>
-            <w:vAlign w:val="center"/>
-          </w:tcPr>
-          <w:p>
-            <w:pPr>
-              <w:spacing w:after="0"/>
-              <w:ind w:left="2"/>
-            </w:pPr>
-            <w:r>
-              <w:rPr>
-                <w:b/>
-                <w:color w:val="202020"/>
-                <w:sz w:val="24"/>
-              </w:rPr>
-              <w:t xml:space="preserve">Internal/External </w:t>
-            </w:r>
-          </w:p>
-        </w:tc>
-      </w:tr>
-      <w:tr>
-        <w:trPr>
-          <w:trHeight w:val="542"/>
-        </w:trPr>
-        <w:tc>
-          <w:tcPr>
-            <w:tcW w:w="3493" w:type="dxa"/>
-            <w:tcBorders>
-              <w:top w:val="single" w:sz="6" w:space="0" w:color="CECECE"/>
-              <w:left w:val="single" w:sz="6" w:space="0" w:color="CECECE"/>
-              <w:bottom w:val="single" w:sz="6" w:space="0" w:color="CECECE"/>
-              <w:right w:val="single" w:sz="6" w:space="0" w:color="CECECE"/>
-            </w:tcBorders>
-          </w:tcPr>
-          <w:p/>
-        </w:tc>
-        <w:tc>
-          <w:tcPr>
-            <w:tcW w:w="3885" w:type="dxa"/>
-            <w:tcBorders>
-              <w:top w:val="single" w:sz="6" w:space="0" w:color="CECECE"/>
-              <w:left w:val="single" w:sz="6" w:space="0" w:color="CECECE"/>
-              <w:bottom w:val="single" w:sz="6" w:space="0" w:color="CECECE"/>
-              <w:right w:val="single" w:sz="6" w:space="0" w:color="CECECE"/>
-            </w:tcBorders>
-          </w:tcPr>
-          <w:p/>
-        </w:tc>
-        <w:tc>
-          <w:tcPr>
-            <w:tcW w:w="3058" w:type="dxa"/>
-            <w:tcBorders>
-              <w:top w:val="single" w:sz="6" w:space="0" w:color="CECECE"/>
-              <w:left w:val="single" w:sz="6" w:space="0" w:color="CECECE"/>
-              <w:bottom w:val="single" w:sz="6" w:space="0" w:color="CECECE"/>
-              <w:right w:val="single" w:sz="6" w:space="0" w:color="CECECE"/>
-            </w:tcBorders>
-          </w:tcPr>
-          <w:p/>
-        </w:tc>
-      </w:tr>
-      <w:tr>
-        <w:trPr>
-          <w:trHeight w:val="540"/>
-        </w:trPr>
-        <w:tc>
-          <w:tcPr>
-            <w:tcW w:w="3493" w:type="dxa"/>
-            <w:tcBorders>
-              <w:top w:val="single" w:sz="6" w:space="0" w:color="CECECE"/>
-              <w:left w:val="single" w:sz="6" w:space="0" w:color="CECECE"/>
-              <w:bottom w:val="single" w:sz="6" w:space="0" w:color="CECECE"/>
-              <w:right w:val="single" w:sz="6" w:space="0" w:color="CECECE"/>
-            </w:tcBorders>
-          </w:tcPr>
-          <w:p/>
-        </w:tc>
-        <w:tc>
-          <w:tcPr>
-            <w:tcW w:w="3885" w:type="dxa"/>
-            <w:tcBorders>
-              <w:top w:val="single" w:sz="6" w:space="0" w:color="CECECE"/>
-              <w:left w:val="single" w:sz="6" w:space="0" w:color="CECECE"/>
-              <w:bottom w:val="single" w:sz="6" w:space="0" w:color="CECECE"/>
-              <w:right w:val="single" w:sz="6" w:space="0" w:color="CECECE"/>
-            </w:tcBorders>
-          </w:tcPr>
-          <w:p/>
-        </w:tc>
-        <w:tc>
-          <w:tcPr>
-            <w:tcW w:w="3058" w:type="dxa"/>
-            <w:tcBorders>
-              <w:top w:val="single" w:sz="6" w:space="0" w:color="CECECE"/>
-              <w:left w:val="single" w:sz="6" w:space="0" w:color="CECECE"/>
-              <w:bottom w:val="single" w:sz="6" w:space="0" w:color="CECECE"/>
-              <w:right w:val="single" w:sz="6" w:space="0" w:color="CECECE"/>
-            </w:tcBorders>
-          </w:tcPr>
-          <w:p/>
-        </w:tc>
-      </w:tr>
-      <w:tr>
-        <w:trPr>
-          <w:trHeight w:val="540"/>
-        </w:trPr>
-        <w:tc>
-          <w:tcPr>
-            <w:tcW w:w="3493" w:type="dxa"/>
-            <w:tcBorders>
-              <w:top w:val="single" w:sz="6" w:space="0" w:color="CECECE"/>
-              <w:left w:val="single" w:sz="6" w:space="0" w:color="CECECE"/>
-              <w:bottom w:val="single" w:sz="6" w:space="0" w:color="CECECE"/>
-              <w:right w:val="single" w:sz="6" w:space="0" w:color="CECECE"/>
-            </w:tcBorders>
-          </w:tcPr>
-          <w:p/>
-        </w:tc>
-        <w:tc>
-          <w:tcPr>
-            <w:tcW w:w="3885" w:type="dxa"/>
-            <w:tcBorders>
-              <w:top w:val="single" w:sz="6" w:space="0" w:color="CECECE"/>
-              <w:left w:val="single" w:sz="6" w:space="0" w:color="CECECE"/>
-              <w:bottom w:val="single" w:sz="6" w:space="0" w:color="CECECE"/>
-              <w:right w:val="single" w:sz="6" w:space="0" w:color="CECECE"/>
-            </w:tcBorders>
-          </w:tcPr>
-          <w:p/>
-        </w:tc>
-        <w:tc>
-          <w:tcPr>
-            <w:tcW w:w="3058" w:type="dxa"/>
-            <w:tcBorders>
-              <w:top w:val="single" w:sz="6" w:space="0" w:color="CECECE"/>
-              <w:left w:val="single" w:sz="6" w:space="0" w:color="CECECE"/>
-              <w:bottom w:val="single" w:sz="6" w:space="0" w:color="CECECE"/>
-              <w:right w:val="single" w:sz="6" w:space="0" w:color="CECECE"/>
-            </w:tcBorders>
-          </w:tcPr>
-          <w:p/>
-        </w:tc>
-      </w:tr>
-    </w:tbl>
-    <w:p>
-      <w:pPr>
-        <w:spacing w:after="0"/>
-        <w:ind w:left="-5" w:hanging="10"/>
-      </w:pPr>
-      <w:r>
-        <w:rPr>
           <w:color w:val="202020"/>
           <w:sz w:val="24"/>
         </w:rPr>
@@ -1092,7 +851,7 @@
                 <w:color w:val="202020"/>
                 <w:sz w:val="24"/>
               </w:rPr>
-              <w:t>Quick Links</w:t>
+              <w:t>Tecnology stack</w:t>
             </w:r>
           </w:p>
         </w:tc>
@@ -1116,6 +875,10 @@
             <w:pPr>
               <w:spacing w:after="94"/>
               <w:ind w:left="112"/>
+              <w:rPr>
+                <w:color w:val="202020"/>
+                <w:sz w:val="24"/>
+              </w:rPr>
             </w:pPr>
             <w:r>
               <w:rPr>
@@ -1130,12 +893,23 @@
                 <w:sz w:val="24"/>
               </w:rPr>
               <w:t xml:space="preserve"> </w:t>
+            </w:r>
+            <w:r>
+              <w:rPr>
+                <w:color w:val="202020"/>
+                <w:sz w:val="24"/>
+              </w:rPr>
+              <w:t>React</w:t>
             </w:r>
           </w:p>
           <w:p>
             <w:pPr>
               <w:spacing w:after="94"/>
               <w:ind w:left="112"/>
+              <w:rPr>
+                <w:color w:val="202020"/>
+                <w:sz w:val="24"/>
+              </w:rPr>
             </w:pPr>
             <w:r>
               <w:rPr>
@@ -1151,11 +925,22 @@
               </w:rPr>
               <w:t xml:space="preserve"> </w:t>
             </w:r>
+            <w:r>
+              <w:rPr>
+                <w:color w:val="202020"/>
+                <w:sz w:val="24"/>
+              </w:rPr>
+              <w:t>Node.js</w:t>
+            </w:r>
           </w:p>
           <w:p>
             <w:pPr>
               <w:spacing w:after="0"/>
               <w:ind w:left="112"/>
+              <w:rPr>
+                <w:color w:val="202020"/>
+                <w:sz w:val="24"/>
+              </w:rPr>
             </w:pPr>
             <w:r>
               <w:rPr>
@@ -1171,6 +956,154 @@
               </w:rPr>
               <w:t xml:space="preserve"> </w:t>
             </w:r>
+            <w:r>
+              <w:rPr>
+                <w:color w:val="202020"/>
+                <w:sz w:val="24"/>
+              </w:rPr>
+              <w:t>PostgreSQL</w:t>
+            </w:r>
+          </w:p>
+          <w:p>
+            <w:pPr>
+              <w:spacing w:after="0"/>
+              <w:ind w:left="112"/>
+              <w:rPr>
+                <w:color w:val="202020"/>
+                <w:sz w:val="24"/>
+                <w:lang w:val="en-US"/>
+              </w:rPr>
+            </w:pPr>
+            <w:r>
+              <w:rPr>
+                <w:color w:val="202020"/>
+                <w:sz w:val="36"/>
+                <w:lang w:val="en-US"/>
+              </w:rPr>
+              <w:t>•</w:t>
+            </w:r>
+            <w:r>
+              <w:rPr>
+                <w:color w:val="202020"/>
+                <w:sz w:val="24"/>
+                <w:lang w:val="en-US"/>
+              </w:rPr>
+              <w:t xml:space="preserve"> </w:t>
+            </w:r>
+            <w:r>
+              <w:rPr>
+                <w:color w:val="202020"/>
+                <w:sz w:val="24"/>
+                <w:lang w:val="en-US"/>
+              </w:rPr>
+              <w:t>Express</w:t>
+            </w:r>
+          </w:p>
+          <w:p>
+            <w:pPr>
+              <w:spacing w:after="0"/>
+              <w:ind w:left="112"/>
+              <w:rPr>
+                <w:color w:val="202020"/>
+                <w:sz w:val="24"/>
+                <w:lang w:val="en-US"/>
+              </w:rPr>
+            </w:pPr>
+            <w:r>
+              <w:rPr>
+                <w:color w:val="202020"/>
+                <w:sz w:val="36"/>
+                <w:lang w:val="en-US"/>
+              </w:rPr>
+              <w:t>•</w:t>
+            </w:r>
+            <w:r>
+              <w:rPr>
+                <w:color w:val="202020"/>
+                <w:sz w:val="24"/>
+                <w:lang w:val="en-US"/>
+              </w:rPr>
+              <w:t>JWT</w:t>
+            </w:r>
+          </w:p>
+          <w:p>
+            <w:pPr>
+              <w:spacing w:after="0"/>
+              <w:ind w:left="112"/>
+              <w:rPr>
+                <w:color w:val="202020"/>
+                <w:sz w:val="24"/>
+                <w:lang w:val="en-US"/>
+              </w:rPr>
+            </w:pPr>
+            <w:r>
+              <w:rPr>
+                <w:color w:val="202020"/>
+                <w:sz w:val="36"/>
+                <w:lang w:val="en-US"/>
+              </w:rPr>
+              <w:t>•</w:t>
+            </w:r>
+            <w:r>
+              <w:rPr>
+                <w:color w:val="202020"/>
+                <w:sz w:val="24"/>
+                <w:lang w:val="en-US"/>
+              </w:rPr>
+              <w:t xml:space="preserve"> </w:t>
+            </w:r>
+            <w:r>
+              <w:rPr>
+                <w:color w:val="202020"/>
+                <w:sz w:val="24"/>
+                <w:lang w:val="en-US"/>
+              </w:rPr>
+              <w:t>Docker</w:t>
+            </w:r>
+          </w:p>
+          <w:p>
+            <w:pPr>
+              <w:spacing w:after="0"/>
+              <w:ind w:left="112"/>
+              <w:rPr>
+                <w:color w:val="202020"/>
+                <w:sz w:val="24"/>
+                <w:lang w:val="en-US"/>
+              </w:rPr>
+            </w:pPr>
+            <w:r>
+              <w:rPr>
+                <w:color w:val="202020"/>
+                <w:sz w:val="36"/>
+                <w:lang w:val="en-US"/>
+              </w:rPr>
+              <w:t>•</w:t>
+            </w:r>
+            <w:r>
+              <w:rPr>
+                <w:color w:val="202020"/>
+                <w:sz w:val="24"/>
+                <w:lang w:val="en-US"/>
+              </w:rPr>
+              <w:t>Git</w:t>
+            </w:r>
+            <w:r>
+              <w:rPr>
+                <w:color w:val="202020"/>
+                <w:sz w:val="24"/>
+                <w:lang w:val="en-US"/>
+              </w:rPr>
+              <w:t>Hub</w:t>
+            </w:r>
+          </w:p>
+          <w:p>
+            <w:pPr>
+              <w:spacing w:after="0"/>
+              <w:ind w:left="112"/>
+              <w:rPr>
+                <w:lang w:val="en-US"/>
+              </w:rPr>
+            </w:pPr>
           </w:p>
         </w:tc>
       </w:tr>

</xml_diff>

<commit_message>
updated all template for analytcs business
</commit_message>
<xml_diff>
--- a/Doc's/Program CharterV1.docx
+++ b/Doc's/Program CharterV1.docx
@@ -89,7 +89,7 @@
           </mc:Choice>
           <mc:Fallback>
             <w:pict>
-              <v:line w14:anchorId="339E1454" id="Straight Connector 9" o:spid="_x0000_s1026" style="position:absolute;z-index:251659264;visibility:visible;mso-wrap-style:square;mso-wrap-distance-left:9pt;mso-wrap-distance-top:0;mso-wrap-distance-right:9pt;mso-wrap-distance-bottom:0;mso-position-horizontal:absolute;mso-position-horizontal-relative:text;mso-position-vertical:absolute;mso-position-vertical-relative:text" from="60pt,34.8pt" to="566.4pt,34.8pt" o:gfxdata="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" strokecolor="#156082 [3204]" strokeweight="1.5pt">
+              <v:line w14:anchorId="7144D5F2" id="Straight Connector 9" o:spid="_x0000_s1026" style="position:absolute;z-index:251659264;visibility:visible;mso-wrap-style:square;mso-wrap-distance-left:9pt;mso-wrap-distance-top:0;mso-wrap-distance-right:9pt;mso-wrap-distance-bottom:0;mso-position-horizontal:absolute;mso-position-horizontal-relative:text;mso-position-vertical:absolute;mso-position-vertical-relative:text" from="60pt,34.8pt" to="566.4pt,34.8pt" o:gfxdata="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" strokecolor="#156082 [3204]" strokeweight="1.5pt">
                 <v:stroke joinstyle="miter"/>
               </v:line>
             </w:pict>
@@ -680,11 +680,7 @@
               <w:spacing w:after="0"/>
             </w:pPr>
             <w:r>
-              <w:rPr>
-                <w:color w:val="202020"/>
-                <w:sz w:val="24"/>
-              </w:rPr>
-              <w:t>`</w:t>
+              <w:t>Jefatura</w:t>
             </w:r>
           </w:p>
         </w:tc>
@@ -698,7 +694,11 @@
               <w:right w:val="single" w:sz="6" w:space="0" w:color="CECECE"/>
             </w:tcBorders>
           </w:tcPr>
-          <w:p/>
+          <w:p>
+            <w:r>
+              <w:t>Desarrollo</w:t>
+            </w:r>
+          </w:p>
         </w:tc>
         <w:tc>
           <w:tcPr>
@@ -710,7 +710,11 @@
               <w:right w:val="single" w:sz="6" w:space="0" w:color="CECECE"/>
             </w:tcBorders>
           </w:tcPr>
-          <w:p/>
+          <w:p>
+            <w:r>
+              <w:t>Internal</w:t>
+            </w:r>
+          </w:p>
         </w:tc>
       </w:tr>
       <w:tr>
@@ -727,7 +731,11 @@
               <w:right w:val="single" w:sz="6" w:space="0" w:color="CECECE"/>
             </w:tcBorders>
           </w:tcPr>
-          <w:p/>
+          <w:p>
+            <w:r>
+              <w:t>Supervisor</w:t>
+            </w:r>
+          </w:p>
         </w:tc>
         <w:tc>
           <w:tcPr>
@@ -739,7 +747,11 @@
               <w:right w:val="single" w:sz="6" w:space="0" w:color="CECECE"/>
             </w:tcBorders>
           </w:tcPr>
-          <w:p/>
+          <w:p>
+            <w:r>
+              <w:t>Lavado</w:t>
+            </w:r>
+          </w:p>
         </w:tc>
         <w:tc>
           <w:tcPr>
@@ -751,7 +763,11 @@
               <w:right w:val="single" w:sz="6" w:space="0" w:color="CECECE"/>
             </w:tcBorders>
           </w:tcPr>
-          <w:p/>
+          <w:p>
+            <w:r>
+              <w:t>Internal</w:t>
+            </w:r>
+          </w:p>
         </w:tc>
       </w:tr>
       <w:tr>
@@ -768,7 +784,11 @@
               <w:right w:val="single" w:sz="6" w:space="0" w:color="CECECE"/>
             </w:tcBorders>
           </w:tcPr>
-          <w:p/>
+          <w:p>
+            <w:r>
+              <w:t>Gerencia</w:t>
+            </w:r>
+          </w:p>
         </w:tc>
         <w:tc>
           <w:tcPr>
@@ -780,7 +800,11 @@
               <w:right w:val="single" w:sz="6" w:space="0" w:color="CECECE"/>
             </w:tcBorders>
           </w:tcPr>
-          <w:p/>
+          <w:p>
+            <w:r>
+              <w:t>Desarrollo</w:t>
+            </w:r>
+          </w:p>
         </w:tc>
         <w:tc>
           <w:tcPr>
@@ -792,7 +816,11 @@
               <w:right w:val="single" w:sz="6" w:space="0" w:color="CECECE"/>
             </w:tcBorders>
           </w:tcPr>
-          <w:p/>
+          <w:p>
+            <w:r>
+              <w:t>Internal</w:t>
+            </w:r>
+          </w:p>
         </w:tc>
       </w:tr>
     </w:tbl>
@@ -1162,6 +1190,106 @@
       <w:pPr>
         <w:spacing w:after="0"/>
         <w:ind w:left="-5" w:hanging="10"/>
+        <w:rPr>
+          <w:color w:val="202020"/>
+          <w:sz w:val="24"/>
+        </w:rPr>
+      </w:pPr>
+      <w:r>
+        <w:rPr>
+          <w:color w:val="202020"/>
+          <w:sz w:val="24"/>
+        </w:rPr>
+        <w:t>Business Background</w:t>
+      </w:r>
+      <w:r>
+        <w:rPr>
+          <w:color w:val="202020"/>
+          <w:sz w:val="24"/>
+        </w:rPr>
+        <w:t>:</w:t>
+      </w:r>
+    </w:p>
+    <w:p>
+      <w:pPr>
+        <w:spacing w:after="0"/>
+        <w:ind w:left="-5" w:hanging="10"/>
+        <w:rPr>
+          <w:color w:val="202020"/>
+          <w:sz w:val="24"/>
+        </w:rPr>
+      </w:pPr>
+    </w:p>
+    <w:p>
+      <w:pPr>
+        <w:spacing w:after="0"/>
+        <w:ind w:left="-5" w:hanging="10"/>
+        <w:rPr>
+          <w:color w:val="202020"/>
+          <w:sz w:val="24"/>
+        </w:rPr>
+      </w:pPr>
+    </w:p>
+    <w:p>
+      <w:pPr>
+        <w:spacing w:after="0"/>
+        <w:ind w:left="-5" w:hanging="10"/>
+        <w:rPr>
+          <w:color w:val="202020"/>
+          <w:sz w:val="24"/>
+        </w:rPr>
+      </w:pPr>
+    </w:p>
+    <w:p>
+      <w:pPr>
+        <w:spacing w:after="0"/>
+        <w:ind w:left="-5" w:hanging="10"/>
+      </w:pPr>
+      <w:r>
+        <w:rPr>
+          <w:color w:val="202020"/>
+          <w:sz w:val="24"/>
+        </w:rPr>
+        <w:t>Business Problem</w:t>
+      </w:r>
+      <w:r>
+        <w:rPr>
+          <w:color w:val="202020"/>
+          <w:sz w:val="24"/>
+        </w:rPr>
+        <w:t>:</w:t>
+      </w:r>
+    </w:p>
+    <w:p>
+      <w:pPr>
+        <w:spacing w:after="0"/>
+        <w:ind w:left="-5" w:hanging="10"/>
+      </w:pPr>
+    </w:p>
+    <w:p>
+      <w:pPr>
+        <w:spacing w:after="0"/>
+        <w:ind w:left="-5" w:hanging="10"/>
+        <w:rPr>
+          <w:color w:val="202020"/>
+          <w:sz w:val="24"/>
+        </w:rPr>
+      </w:pPr>
+    </w:p>
+    <w:p>
+      <w:pPr>
+        <w:spacing w:after="0"/>
+        <w:ind w:left="-5" w:hanging="10"/>
+        <w:rPr>
+          <w:color w:val="202020"/>
+          <w:sz w:val="24"/>
+        </w:rPr>
+      </w:pPr>
+    </w:p>
+    <w:p>
+      <w:pPr>
+        <w:spacing w:after="0"/>
+        <w:ind w:left="-5" w:hanging="10"/>
       </w:pPr>
       <w:r>
         <w:rPr>
@@ -1174,7 +1302,7 @@
     <w:tbl>
       <w:tblPr>
         <w:tblStyle w:val="TableGrid"/>
-        <w:tblW w:w="10616" w:type="dxa"/>
+        <w:tblW w:w="7393" w:type="dxa"/>
         <w:tblInd w:w="159" w:type="dxa"/>
         <w:tblCellMar>
           <w:top w:w="0" w:type="dxa"/>
@@ -1187,7 +1315,6 @@
       <w:tblGrid>
         <w:gridCol w:w="3508"/>
         <w:gridCol w:w="3885"/>
-        <w:gridCol w:w="3223"/>
       </w:tblGrid>
       <w:tr>
         <w:trPr>
@@ -1215,7 +1342,7 @@
                 <w:color w:val="202020"/>
                 <w:sz w:val="24"/>
               </w:rPr>
-              <w:t>Owner</w:t>
+              <w:t>KPI</w:t>
             </w:r>
           </w:p>
         </w:tc>
@@ -1243,33 +1370,6 @@
                 <w:sz w:val="24"/>
               </w:rPr>
               <w:t>Goal</w:t>
-            </w:r>
-          </w:p>
-        </w:tc>
-        <w:tc>
-          <w:tcPr>
-            <w:tcW w:w="3223" w:type="dxa"/>
-            <w:tcBorders>
-              <w:top w:val="single" w:sz="6" w:space="0" w:color="CECECE"/>
-              <w:left w:val="single" w:sz="6" w:space="0" w:color="CECECE"/>
-              <w:bottom w:val="single" w:sz="6" w:space="0" w:color="CECECE"/>
-              <w:right w:val="single" w:sz="6" w:space="0" w:color="CECECE"/>
-            </w:tcBorders>
-            <w:shd w:val="clear" w:color="auto" w:fill="D9DAFF"/>
-            <w:vAlign w:val="center"/>
-          </w:tcPr>
-          <w:p>
-            <w:pPr>
-              <w:spacing w:after="0"/>
-              <w:ind w:left="2"/>
-            </w:pPr>
-            <w:r>
-              <w:rPr>
-                <w:b/>
-                <w:color w:val="202020"/>
-                <w:sz w:val="24"/>
-              </w:rPr>
-              <w:t>How will we measure?</w:t>
             </w:r>
           </w:p>
         </w:tc>
@@ -1288,7 +1388,11 @@
               <w:right w:val="single" w:sz="6" w:space="0" w:color="CECECE"/>
             </w:tcBorders>
           </w:tcPr>
-          <w:p/>
+          <w:p>
+            <w:r>
+              <w:t>Digital register</w:t>
+            </w:r>
+          </w:p>
         </w:tc>
         <w:tc>
           <w:tcPr>
@@ -1300,19 +1404,11 @@
               <w:right w:val="single" w:sz="6" w:space="0" w:color="CECECE"/>
             </w:tcBorders>
           </w:tcPr>
-          <w:p/>
-        </w:tc>
-        <w:tc>
-          <w:tcPr>
-            <w:tcW w:w="3223" w:type="dxa"/>
-            <w:tcBorders>
-              <w:top w:val="single" w:sz="6" w:space="0" w:color="CECECE"/>
-              <w:left w:val="single" w:sz="6" w:space="0" w:color="CECECE"/>
-              <w:bottom w:val="single" w:sz="6" w:space="0" w:color="CECECE"/>
-              <w:right w:val="single" w:sz="6" w:space="0" w:color="CECECE"/>
-            </w:tcBorders>
-          </w:tcPr>
-          <w:p/>
+          <w:p>
+            <w:r>
+              <w:t>100%</w:t>
+            </w:r>
+          </w:p>
         </w:tc>
       </w:tr>
       <w:tr>
@@ -1329,7 +1425,11 @@
               <w:right w:val="single" w:sz="6" w:space="0" w:color="CECECE"/>
             </w:tcBorders>
           </w:tcPr>
-          <w:p/>
+          <w:p>
+            <w:r>
+              <w:t>Whatsapp Used</w:t>
+            </w:r>
+          </w:p>
         </w:tc>
         <w:tc>
           <w:tcPr>
@@ -1341,19 +1441,11 @@
               <w:right w:val="single" w:sz="6" w:space="0" w:color="CECECE"/>
             </w:tcBorders>
           </w:tcPr>
-          <w:p/>
-        </w:tc>
-        <w:tc>
-          <w:tcPr>
-            <w:tcW w:w="3223" w:type="dxa"/>
-            <w:tcBorders>
-              <w:top w:val="single" w:sz="6" w:space="0" w:color="CECECE"/>
-              <w:left w:val="single" w:sz="6" w:space="0" w:color="CECECE"/>
-              <w:bottom w:val="single" w:sz="6" w:space="0" w:color="CECECE"/>
-              <w:right w:val="single" w:sz="6" w:space="0" w:color="CECECE"/>
-            </w:tcBorders>
-          </w:tcPr>
-          <w:p/>
+          <w:p>
+            <w:r>
+              <w:t>0%</w:t>
+            </w:r>
+          </w:p>
         </w:tc>
       </w:tr>
       <w:tr>
@@ -1370,7 +1462,11 @@
               <w:right w:val="single" w:sz="6" w:space="0" w:color="CECECE"/>
             </w:tcBorders>
           </w:tcPr>
-          <w:p/>
+          <w:p>
+            <w:r>
+              <w:t>Register time</w:t>
+            </w:r>
+          </w:p>
         </w:tc>
         <w:tc>
           <w:tcPr>
@@ -1382,19 +1478,48 @@
               <w:right w:val="single" w:sz="6" w:space="0" w:color="CECECE"/>
             </w:tcBorders>
           </w:tcPr>
-          <w:p/>
-        </w:tc>
-        <w:tc>
-          <w:tcPr>
-            <w:tcW w:w="3223" w:type="dxa"/>
-            <w:tcBorders>
-              <w:top w:val="single" w:sz="6" w:space="0" w:color="CECECE"/>
-              <w:left w:val="single" w:sz="6" w:space="0" w:color="CECECE"/>
-              <w:bottom w:val="single" w:sz="6" w:space="0" w:color="CECECE"/>
-              <w:right w:val="single" w:sz="6" w:space="0" w:color="CECECE"/>
-            </w:tcBorders>
-          </w:tcPr>
-          <w:p/>
+          <w:p>
+            <w:r>
+              <w:t>-70%</w:t>
+            </w:r>
+          </w:p>
+        </w:tc>
+      </w:tr>
+      <w:tr>
+        <w:trPr>
+          <w:trHeight w:val="540"/>
+        </w:trPr>
+        <w:tc>
+          <w:tcPr>
+            <w:tcW w:w="3508" w:type="dxa"/>
+            <w:tcBorders>
+              <w:top w:val="single" w:sz="6" w:space="0" w:color="CECECE"/>
+              <w:left w:val="single" w:sz="6" w:space="0" w:color="CECECE"/>
+              <w:bottom w:val="single" w:sz="6" w:space="0" w:color="CECECE"/>
+              <w:right w:val="single" w:sz="6" w:space="0" w:color="CECECE"/>
+            </w:tcBorders>
+          </w:tcPr>
+          <w:p>
+            <w:r>
+              <w:t>Reports</w:t>
+            </w:r>
+          </w:p>
+        </w:tc>
+        <w:tc>
+          <w:tcPr>
+            <w:tcW w:w="3885" w:type="dxa"/>
+            <w:tcBorders>
+              <w:top w:val="single" w:sz="6" w:space="0" w:color="CECECE"/>
+              <w:left w:val="single" w:sz="6" w:space="0" w:color="CECECE"/>
+              <w:bottom w:val="single" w:sz="6" w:space="0" w:color="CECECE"/>
+              <w:right w:val="single" w:sz="6" w:space="0" w:color="CECECE"/>
+            </w:tcBorders>
+          </w:tcPr>
+          <w:p>
+            <w:r>
+              <w:t>Real time</w:t>
+            </w:r>
+          </w:p>
         </w:tc>
       </w:tr>
     </w:tbl>
@@ -1512,7 +1637,7 @@
                 <w:color w:val="202020"/>
                 <w:sz w:val="24"/>
               </w:rPr>
-              <w:t>Owner/Team</w:t>
+              <w:t>Functionalit</w:t>
             </w:r>
           </w:p>
         </w:tc>
@@ -1939,6 +2064,8 @@
             </w:tcBorders>
           </w:tcPr>
           <w:p/>
+          <w:p/>
+          <w:p/>
         </w:tc>
         <w:tc>
           <w:tcPr>
@@ -2006,6 +2133,54 @@
         </w:tc>
       </w:tr>
     </w:tbl>
+    <w:p>
+      <w:pPr>
+        <w:spacing w:after="0"/>
+        <w:ind w:left="-5" w:hanging="10"/>
+        <w:rPr>
+          <w:color w:val="202020"/>
+          <w:sz w:val="24"/>
+        </w:rPr>
+      </w:pPr>
+      <w:r>
+        <w:rPr>
+          <w:color w:val="202020"/>
+          <w:sz w:val="24"/>
+        </w:rPr>
+        <w:lastRenderedPageBreak/>
+        <w:t>Porpuse Solution:</w:t>
+      </w:r>
+    </w:p>
+    <w:p>
+      <w:pPr>
+        <w:spacing w:after="0"/>
+        <w:ind w:left="-5" w:hanging="10"/>
+        <w:rPr>
+          <w:color w:val="202020"/>
+          <w:sz w:val="24"/>
+        </w:rPr>
+      </w:pPr>
+    </w:p>
+    <w:p>
+      <w:pPr>
+        <w:spacing w:after="0"/>
+        <w:ind w:left="-5" w:hanging="10"/>
+        <w:rPr>
+          <w:color w:val="202020"/>
+          <w:sz w:val="24"/>
+        </w:rPr>
+      </w:pPr>
+    </w:p>
+    <w:p>
+      <w:pPr>
+        <w:spacing w:after="0"/>
+        <w:ind w:left="-5" w:hanging="10"/>
+        <w:rPr>
+          <w:color w:val="202020"/>
+          <w:sz w:val="24"/>
+        </w:rPr>
+      </w:pPr>
+    </w:p>
     <w:p>
       <w:pPr>
         <w:spacing w:after="0"/>
@@ -2090,7 +2265,7 @@
                 <w:color w:val="202020"/>
                 <w:sz w:val="24"/>
               </w:rPr>
-              <w:t>Team 1</w:t>
+              <w:t>Document</w:t>
             </w:r>
           </w:p>
         </w:tc>
@@ -2333,7 +2508,15 @@
                 <w:color w:val="202020"/>
                 <w:sz w:val="24"/>
               </w:rPr>
-              <w:t>Team 2</w:t>
+              <w:t>Document</w:t>
+            </w:r>
+            <w:r>
+              <w:rPr>
+                <w:b/>
+                <w:color w:val="202020"/>
+                <w:sz w:val="24"/>
+              </w:rPr>
+              <w:t xml:space="preserve"> </w:t>
             </w:r>
           </w:p>
         </w:tc>
@@ -2534,7 +2717,7 @@
                 <w:color w:val="202020"/>
                 <w:sz w:val="24"/>
               </w:rPr>
-              <w:t>Team 3</w:t>
+              <w:t>Document</w:t>
             </w:r>
           </w:p>
         </w:tc>
@@ -3117,6 +3300,7 @@
         <w:ind w:left="-5"/>
       </w:pPr>
       <w:r>
+        <w:lastRenderedPageBreak/>
         <w:t>Sign-Off</w:t>
       </w:r>
     </w:p>
@@ -4134,7 +4318,6 @@
           <w:color w:val="202020"/>
           <w:sz w:val="24"/>
         </w:rPr>
-        <w:lastRenderedPageBreak/>
         <w:t xml:space="preserve">                        </w:t>
       </w:r>
     </w:p>

</xml_diff>

<commit_message>
complete field project overview
</commit_message>
<xml_diff>
--- a/Doc's/Program CharterV1.docx
+++ b/Doc's/Program CharterV1.docx
@@ -89,7 +89,7 @@
           </mc:Choice>
           <mc:Fallback>
             <w:pict>
-              <v:line w14:anchorId="7144D5F2" id="Straight Connector 9" o:spid="_x0000_s1026" style="position:absolute;z-index:251659264;visibility:visible;mso-wrap-style:square;mso-wrap-distance-left:9pt;mso-wrap-distance-top:0;mso-wrap-distance-right:9pt;mso-wrap-distance-bottom:0;mso-position-horizontal:absolute;mso-position-horizontal-relative:text;mso-position-vertical:absolute;mso-position-vertical-relative:text" from="60pt,34.8pt" to="566.4pt,34.8pt" o:gfxdata="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" strokecolor="#156082 [3204]" strokeweight="1.5pt">
+              <v:line w14:anchorId="060FE929" id="Straight Connector 9" o:spid="_x0000_s1026" style="position:absolute;z-index:251659264;visibility:visible;mso-wrap-style:square;mso-wrap-distance-left:9pt;mso-wrap-distance-top:0;mso-wrap-distance-right:9pt;mso-wrap-distance-bottom:0;mso-position-horizontal:absolute;mso-position-horizontal-relative:text;mso-position-vertical:absolute;mso-position-vertical-relative:text" from="60pt,34.8pt" to="566.4pt,34.8pt" o:gfxdata="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" strokecolor="#156082 [3204]" strokeweight="1.5pt">
                 <v:stroke joinstyle="miter"/>
               </v:line>
             </w:pict>
@@ -161,9 +161,19 @@
         <w:pStyle w:val="Heading1"/>
         <w:ind w:left="-5"/>
       </w:pPr>
+      <w:proofErr w:type="spellStart"/>
       <w:r>
-        <w:t>Document information</w:t>
+        <w:t>Document</w:t>
       </w:r>
+      <w:proofErr w:type="spellEnd"/>
+      <w:r>
+        <w:t xml:space="preserve"> </w:t>
+      </w:r>
+      <w:proofErr w:type="spellStart"/>
+      <w:r>
+        <w:t>information</w:t>
+      </w:r>
+      <w:proofErr w:type="spellEnd"/>
     </w:p>
     <w:tbl>
       <w:tblPr>
@@ -208,8 +218,18 @@
                 <w:color w:val="202020"/>
                 <w:sz w:val="24"/>
               </w:rPr>
-              <w:t>Project name</w:t>
-            </w:r>
+              <w:t xml:space="preserve">Project </w:t>
+            </w:r>
+            <w:proofErr w:type="spellStart"/>
+            <w:r>
+              <w:rPr>
+                <w:b/>
+                <w:color w:val="202020"/>
+                <w:sz w:val="24"/>
+              </w:rPr>
+              <w:t>name</w:t>
+            </w:r>
+            <w:proofErr w:type="spellEnd"/>
           </w:p>
         </w:tc>
         <w:tc>
@@ -231,6 +251,7 @@
                 <w:lang w:val="en-US"/>
               </w:rPr>
             </w:pPr>
+            <w:proofErr w:type="spellStart"/>
             <w:r>
               <w:rPr>
                 <w:color w:val="202020"/>
@@ -239,6 +260,7 @@
               </w:rPr>
               <w:t>WashPedre</w:t>
             </w:r>
+            <w:proofErr w:type="spellEnd"/>
             <w:r>
               <w:rPr>
                 <w:color w:val="202020"/>
@@ -270,14 +292,34 @@
             <w:pPr>
               <w:spacing w:after="0"/>
             </w:pPr>
+            <w:proofErr w:type="spellStart"/>
             <w:r>
               <w:rPr>
                 <w:b/>
                 <w:color w:val="202020"/>
                 <w:sz w:val="24"/>
               </w:rPr>
-              <w:t>Document code</w:t>
-            </w:r>
+              <w:t>Document</w:t>
+            </w:r>
+            <w:proofErr w:type="spellEnd"/>
+            <w:r>
+              <w:rPr>
+                <w:b/>
+                <w:color w:val="202020"/>
+                <w:sz w:val="24"/>
+              </w:rPr>
+              <w:t xml:space="preserve"> </w:t>
+            </w:r>
+            <w:proofErr w:type="spellStart"/>
+            <w:r>
+              <w:rPr>
+                <w:b/>
+                <w:color w:val="202020"/>
+                <w:sz w:val="24"/>
+              </w:rPr>
+              <w:t>code</w:t>
+            </w:r>
+            <w:proofErr w:type="spellEnd"/>
           </w:p>
         </w:tc>
         <w:tc>
@@ -326,6 +368,7 @@
             <w:pPr>
               <w:spacing w:after="0"/>
             </w:pPr>
+            <w:proofErr w:type="spellStart"/>
             <w:r>
               <w:rPr>
                 <w:b/>
@@ -334,6 +377,7 @@
               </w:rPr>
               <w:t>Version</w:t>
             </w:r>
+            <w:proofErr w:type="spellEnd"/>
           </w:p>
         </w:tc>
         <w:tc>
@@ -382,6 +426,7 @@
             <w:pPr>
               <w:spacing w:after="0"/>
             </w:pPr>
+            <w:proofErr w:type="gramStart"/>
             <w:r>
               <w:rPr>
                 <w:b/>
@@ -390,6 +435,7 @@
               </w:rPr>
               <w:t>Status</w:t>
             </w:r>
+            <w:proofErr w:type="gramEnd"/>
           </w:p>
         </w:tc>
         <w:tc>
@@ -554,7 +600,25 @@
           <w:color w:val="202020"/>
           <w:sz w:val="24"/>
         </w:rPr>
-        <w:t>Key Stakeholders:</w:t>
+        <w:t xml:space="preserve">Key </w:t>
+      </w:r>
+      <w:proofErr w:type="spellStart"/>
+      <w:r>
+        <w:rPr>
+          <w:b/>
+          <w:color w:val="202020"/>
+          <w:sz w:val="24"/>
+        </w:rPr>
+        <w:t>Stakeholders</w:t>
+      </w:r>
+      <w:proofErr w:type="spellEnd"/>
+      <w:r>
+        <w:rPr>
+          <w:b/>
+          <w:color w:val="202020"/>
+          <w:sz w:val="24"/>
+        </w:rPr>
+        <w:t>:</w:t>
       </w:r>
     </w:p>
     <w:tbl>
@@ -622,6 +686,7 @@
               <w:spacing w:after="0"/>
               <w:ind w:left="2"/>
             </w:pPr>
+            <w:proofErr w:type="spellStart"/>
             <w:r>
               <w:rPr>
                 <w:b/>
@@ -630,6 +695,7 @@
               </w:rPr>
               <w:t>Department</w:t>
             </w:r>
+            <w:proofErr w:type="spellEnd"/>
           </w:p>
         </w:tc>
         <w:tc>
@@ -649,13 +715,41 @@
               <w:spacing w:after="0"/>
               <w:ind w:left="2"/>
             </w:pPr>
+            <w:proofErr w:type="spellStart"/>
             <w:r>
               <w:rPr>
                 <w:b/>
                 <w:color w:val="202020"/>
                 <w:sz w:val="24"/>
               </w:rPr>
-              <w:t xml:space="preserve">Internal/External </w:t>
+              <w:t>Internal</w:t>
+            </w:r>
+            <w:proofErr w:type="spellEnd"/>
+            <w:r>
+              <w:rPr>
+                <w:b/>
+                <w:color w:val="202020"/>
+                <w:sz w:val="24"/>
+              </w:rPr>
+              <w:t>/</w:t>
+            </w:r>
+            <w:proofErr w:type="spellStart"/>
+            <w:r>
+              <w:rPr>
+                <w:b/>
+                <w:color w:val="202020"/>
+                <w:sz w:val="24"/>
+              </w:rPr>
+              <w:t>External</w:t>
+            </w:r>
+            <w:proofErr w:type="spellEnd"/>
+            <w:r>
+              <w:rPr>
+                <w:b/>
+                <w:color w:val="202020"/>
+                <w:sz w:val="24"/>
+              </w:rPr>
+              <w:t xml:space="preserve"> </w:t>
             </w:r>
           </w:p>
         </w:tc>
@@ -711,9 +805,11 @@
             </w:tcBorders>
           </w:tcPr>
           <w:p>
+            <w:proofErr w:type="spellStart"/>
             <w:r>
               <w:t>Internal</w:t>
             </w:r>
+            <w:proofErr w:type="spellEnd"/>
           </w:p>
         </w:tc>
       </w:tr>
@@ -764,9 +860,11 @@
             </w:tcBorders>
           </w:tcPr>
           <w:p>
+            <w:proofErr w:type="spellStart"/>
             <w:r>
               <w:t>Internal</w:t>
             </w:r>
+            <w:proofErr w:type="spellEnd"/>
           </w:p>
         </w:tc>
       </w:tr>
@@ -817,9 +915,11 @@
             </w:tcBorders>
           </w:tcPr>
           <w:p>
+            <w:proofErr w:type="spellStart"/>
             <w:r>
               <w:t>Internal</w:t>
             </w:r>
+            <w:proofErr w:type="spellEnd"/>
           </w:p>
         </w:tc>
       </w:tr>
@@ -829,12 +929,21 @@
         <w:spacing w:after="0"/>
         <w:ind w:left="-5" w:hanging="10"/>
       </w:pPr>
+      <w:proofErr w:type="spellStart"/>
       <w:r>
         <w:rPr>
           <w:color w:val="202020"/>
           <w:sz w:val="24"/>
         </w:rPr>
-        <w:t>Resources:</w:t>
+        <w:t>Resources</w:t>
+      </w:r>
+      <w:proofErr w:type="spellEnd"/>
+      <w:r>
+        <w:rPr>
+          <w:color w:val="202020"/>
+          <w:sz w:val="24"/>
+        </w:rPr>
+        <w:t>:</w:t>
       </w:r>
     </w:p>
     <w:tbl>
@@ -873,14 +982,34 @@
             <w:pPr>
               <w:spacing w:after="0"/>
             </w:pPr>
+            <w:proofErr w:type="spellStart"/>
             <w:r>
               <w:rPr>
                 <w:b/>
                 <w:color w:val="202020"/>
                 <w:sz w:val="24"/>
               </w:rPr>
-              <w:t>Tecnology stack</w:t>
-            </w:r>
+              <w:t>Tecnology</w:t>
+            </w:r>
+            <w:proofErr w:type="spellEnd"/>
+            <w:r>
+              <w:rPr>
+                <w:b/>
+                <w:color w:val="202020"/>
+                <w:sz w:val="24"/>
+              </w:rPr>
+              <w:t xml:space="preserve"> </w:t>
+            </w:r>
+            <w:proofErr w:type="spellStart"/>
+            <w:r>
+              <w:rPr>
+                <w:b/>
+                <w:color w:val="202020"/>
+                <w:sz w:val="24"/>
+              </w:rPr>
+              <w:t>stack</w:t>
+            </w:r>
+            <w:proofErr w:type="spellEnd"/>
           </w:p>
         </w:tc>
       </w:tr>
@@ -922,6 +1051,7 @@
               </w:rPr>
               <w:t xml:space="preserve"> </w:t>
             </w:r>
+            <w:proofErr w:type="spellStart"/>
             <w:r>
               <w:rPr>
                 <w:color w:val="202020"/>
@@ -929,6 +1059,7 @@
               </w:rPr>
               <w:t>React</w:t>
             </w:r>
+            <w:proofErr w:type="spellEnd"/>
           </w:p>
           <w:p>
             <w:pPr>
@@ -1141,6 +1272,7 @@
         <w:pStyle w:val="Heading1"/>
         <w:ind w:left="-5"/>
       </w:pPr>
+      <w:proofErr w:type="spellStart"/>
       <w:r>
         <w:rPr>
           <w:b/>
@@ -1148,42 +1280,83 @@
         <w:lastRenderedPageBreak/>
         <w:t>Program</w:t>
       </w:r>
+      <w:proofErr w:type="spellEnd"/>
       <w:r>
-        <w:t xml:space="preserve"> Overview</w:t>
+        <w:t xml:space="preserve"> </w:t>
       </w:r>
+      <w:proofErr w:type="spellStart"/>
+      <w:r>
+        <w:t>Overview</w:t>
+      </w:r>
+      <w:proofErr w:type="spellEnd"/>
     </w:p>
     <w:p>
       <w:pPr>
         <w:spacing w:after="435" w:line="295" w:lineRule="auto"/>
       </w:pPr>
+      <w:proofErr w:type="spellStart"/>
       <w:r>
         <w:rPr>
           <w:color w:val="202020"/>
           <w:sz w:val="24"/>
-          <w:lang w:val="en-US"/>
         </w:rPr>
-        <w:t xml:space="preserve">Lorem ipsum dolor sit amet, consectetur adipiscing elit, sed do eiusmod tempor incididunt ut labore et dolore magna aliqua. </w:t>
+        <w:t>WashPedre</w:t>
+      </w:r>
+      <w:proofErr w:type="spellEnd"/>
+      <w:r>
+        <w:rPr>
+          <w:color w:val="202020"/>
+          <w:sz w:val="24"/>
+        </w:rPr>
+        <w:t xml:space="preserve"> es una Plataforma web o</w:t>
       </w:r>
       <w:r>
         <w:rPr>
           <w:color w:val="202020"/>
           <w:sz w:val="24"/>
         </w:rPr>
-        <w:t xml:space="preserve">Ut enim ad minim veniam, quis nostrud exercitation ullamco laboris </w:t>
+        <w:t>rientada a centralizar y optimizar el registro de las operaciones relacionadas con el lavado de jabas dentro de una empresa agroexportadora. El proyecto busca reemplazar procesos manuales basados en mensajería instantánea, digitación y hojas de cálculo por una solución integrada que permita capturar información en tiempo real, mejorar la trazabilidad de las operaciones y proporcionar operaciones para la toma de decisiones.</w:t>
       </w:r>
-      <w:r>
+    </w:p>
+    <w:p>
+      <w:pPr>
+        <w:spacing w:after="0"/>
+        <w:ind w:left="-5" w:hanging="10"/>
         <w:rPr>
+          <w:b/>
+          <w:bCs/>
           <w:color w:val="202020"/>
           <w:sz w:val="24"/>
         </w:rPr>
-        <w:t>ni si</w:t>
-      </w:r>
+      </w:pPr>
       <w:r>
         <w:rPr>
+          <w:b/>
+          <w:bCs/>
           <w:color w:val="202020"/>
           <w:sz w:val="24"/>
         </w:rPr>
-        <w:t xml:space="preserve"> ut aliquip ex ea commodo consequat.</w:t>
+        <w:t xml:space="preserve">Business </w:t>
+      </w:r>
+      <w:proofErr w:type="spellStart"/>
+      <w:r>
+        <w:rPr>
+          <w:b/>
+          <w:bCs/>
+          <w:color w:val="202020"/>
+          <w:sz w:val="24"/>
+        </w:rPr>
+        <w:t>Background</w:t>
+      </w:r>
+      <w:proofErr w:type="spellEnd"/>
+      <w:r>
+        <w:rPr>
+          <w:b/>
+          <w:bCs/>
+          <w:color w:val="202020"/>
+          <w:sz w:val="24"/>
+        </w:rPr>
+        <w:t>:</w:t>
       </w:r>
     </w:p>
     <w:p>
@@ -1195,13 +1368,1042 @@
           <w:sz w:val="24"/>
         </w:rPr>
       </w:pPr>
+    </w:p>
+    <w:p>
+      <w:pPr>
+        <w:spacing w:after="0"/>
+        <w:ind w:left="-5" w:hanging="10"/>
+        <w:rPr>
+          <w:color w:val="202020"/>
+          <w:sz w:val="24"/>
+        </w:rPr>
+      </w:pPr>
+    </w:p>
+    <w:p>
+      <w:pPr>
+        <w:spacing w:after="0"/>
+        <w:ind w:left="-5" w:hanging="10"/>
+        <w:rPr>
+          <w:color w:val="202020"/>
+          <w:sz w:val="24"/>
+        </w:rPr>
+      </w:pPr>
+    </w:p>
+    <w:p>
+      <w:pPr>
+        <w:spacing w:after="0"/>
+        <w:ind w:left="-5" w:hanging="10"/>
+        <w:rPr>
+          <w:b/>
+          <w:bCs/>
+          <w:lang w:val="en-US"/>
+        </w:rPr>
+      </w:pPr>
+      <w:r>
+        <w:rPr>
+          <w:b/>
+          <w:bCs/>
+          <w:color w:val="202020"/>
+          <w:sz w:val="24"/>
+          <w:lang w:val="en-US"/>
+        </w:rPr>
+        <w:t>Business Problem</w:t>
+      </w:r>
+      <w:r>
+        <w:rPr>
+          <w:b/>
+          <w:bCs/>
+          <w:color w:val="202020"/>
+          <w:sz w:val="24"/>
+          <w:lang w:val="en-US"/>
+        </w:rPr>
+        <w:t>:</w:t>
+      </w:r>
+    </w:p>
+    <w:p>
+      <w:pPr>
+        <w:spacing w:after="0"/>
+        <w:ind w:left="-5" w:hanging="10"/>
+        <w:rPr>
+          <w:lang w:val="en-US"/>
+        </w:rPr>
+      </w:pPr>
+    </w:p>
+    <w:p>
+      <w:pPr>
+        <w:spacing w:after="0"/>
+        <w:ind w:left="-5" w:hanging="10"/>
+        <w:rPr>
+          <w:color w:val="202020"/>
+          <w:sz w:val="24"/>
+          <w:lang w:val="en-US"/>
+        </w:rPr>
+      </w:pPr>
+    </w:p>
+    <w:p>
+      <w:pPr>
+        <w:spacing w:after="0"/>
+        <w:ind w:left="-5" w:hanging="10"/>
+        <w:rPr>
+          <w:color w:val="202020"/>
+          <w:sz w:val="24"/>
+          <w:lang w:val="en-US"/>
+        </w:rPr>
+      </w:pPr>
+    </w:p>
+    <w:p>
+      <w:pPr>
+        <w:spacing w:after="0"/>
+        <w:ind w:left="-5" w:hanging="10"/>
+        <w:rPr>
+          <w:b/>
+          <w:bCs/>
+          <w:lang w:val="en-US"/>
+        </w:rPr>
+      </w:pPr>
+      <w:r>
+        <w:rPr>
+          <w:b/>
+          <w:bCs/>
+          <w:color w:val="202020"/>
+          <w:sz w:val="24"/>
+          <w:lang w:val="en-US"/>
+        </w:rPr>
+        <w:t>Success Metrics:</w:t>
+      </w:r>
+    </w:p>
+    <w:tbl>
+      <w:tblPr>
+        <w:tblStyle w:val="TableGrid"/>
+        <w:tblW w:w="7393" w:type="dxa"/>
+        <w:tblInd w:w="159" w:type="dxa"/>
+        <w:tblCellMar>
+          <w:top w:w="0" w:type="dxa"/>
+          <w:left w:w="156" w:type="dxa"/>
+          <w:bottom w:w="0" w:type="dxa"/>
+          <w:right w:w="115" w:type="dxa"/>
+        </w:tblCellMar>
+        <w:tblLook w:val="04A0" w:firstRow="1" w:lastRow="0" w:firstColumn="1" w:lastColumn="0" w:noHBand="0" w:noVBand="1"/>
+      </w:tblPr>
+      <w:tblGrid>
+        <w:gridCol w:w="3508"/>
+        <w:gridCol w:w="3885"/>
+      </w:tblGrid>
+      <w:tr>
+        <w:trPr>
+          <w:trHeight w:val="536"/>
+        </w:trPr>
+        <w:tc>
+          <w:tcPr>
+            <w:tcW w:w="3508" w:type="dxa"/>
+            <w:tcBorders>
+              <w:top w:val="single" w:sz="6" w:space="0" w:color="CECECE"/>
+              <w:left w:val="single" w:sz="6" w:space="0" w:color="CECECE"/>
+              <w:bottom w:val="single" w:sz="6" w:space="0" w:color="CECECE"/>
+              <w:right w:val="single" w:sz="6" w:space="0" w:color="CECECE"/>
+            </w:tcBorders>
+            <w:shd w:val="clear" w:color="auto" w:fill="D9DAFF"/>
+            <w:vAlign w:val="center"/>
+          </w:tcPr>
+          <w:p>
+            <w:pPr>
+              <w:spacing w:after="0"/>
+            </w:pPr>
+            <w:r>
+              <w:rPr>
+                <w:b/>
+                <w:color w:val="202020"/>
+                <w:sz w:val="24"/>
+              </w:rPr>
+              <w:t>KPI</w:t>
+            </w:r>
+          </w:p>
+        </w:tc>
+        <w:tc>
+          <w:tcPr>
+            <w:tcW w:w="3885" w:type="dxa"/>
+            <w:tcBorders>
+              <w:top w:val="single" w:sz="6" w:space="0" w:color="CECECE"/>
+              <w:left w:val="single" w:sz="6" w:space="0" w:color="CECECE"/>
+              <w:bottom w:val="single" w:sz="6" w:space="0" w:color="CECECE"/>
+              <w:right w:val="single" w:sz="6" w:space="0" w:color="CECECE"/>
+            </w:tcBorders>
+            <w:shd w:val="clear" w:color="auto" w:fill="D9DAFF"/>
+            <w:vAlign w:val="center"/>
+          </w:tcPr>
+          <w:p>
+            <w:pPr>
+              <w:spacing w:after="0"/>
+              <w:ind w:left="2"/>
+            </w:pPr>
+            <w:proofErr w:type="spellStart"/>
+            <w:r>
+              <w:rPr>
+                <w:b/>
+                <w:color w:val="202020"/>
+                <w:sz w:val="24"/>
+              </w:rPr>
+              <w:t>Goal</w:t>
+            </w:r>
+            <w:proofErr w:type="spellEnd"/>
+          </w:p>
+        </w:tc>
+      </w:tr>
+      <w:tr>
+        <w:trPr>
+          <w:trHeight w:val="542"/>
+        </w:trPr>
+        <w:tc>
+          <w:tcPr>
+            <w:tcW w:w="3508" w:type="dxa"/>
+            <w:tcBorders>
+              <w:top w:val="single" w:sz="6" w:space="0" w:color="CECECE"/>
+              <w:left w:val="single" w:sz="6" w:space="0" w:color="CECECE"/>
+              <w:bottom w:val="single" w:sz="6" w:space="0" w:color="CECECE"/>
+              <w:right w:val="single" w:sz="6" w:space="0" w:color="CECECE"/>
+            </w:tcBorders>
+          </w:tcPr>
+          <w:p>
+            <w:r>
+              <w:t xml:space="preserve">Digital </w:t>
+            </w:r>
+            <w:proofErr w:type="spellStart"/>
+            <w:r>
+              <w:t>register</w:t>
+            </w:r>
+            <w:proofErr w:type="spellEnd"/>
+          </w:p>
+        </w:tc>
+        <w:tc>
+          <w:tcPr>
+            <w:tcW w:w="3885" w:type="dxa"/>
+            <w:tcBorders>
+              <w:top w:val="single" w:sz="6" w:space="0" w:color="CECECE"/>
+              <w:left w:val="single" w:sz="6" w:space="0" w:color="CECECE"/>
+              <w:bottom w:val="single" w:sz="6" w:space="0" w:color="CECECE"/>
+              <w:right w:val="single" w:sz="6" w:space="0" w:color="CECECE"/>
+            </w:tcBorders>
+          </w:tcPr>
+          <w:p>
+            <w:r>
+              <w:t>100%</w:t>
+            </w:r>
+          </w:p>
+        </w:tc>
+      </w:tr>
+      <w:tr>
+        <w:trPr>
+          <w:trHeight w:val="540"/>
+        </w:trPr>
+        <w:tc>
+          <w:tcPr>
+            <w:tcW w:w="3508" w:type="dxa"/>
+            <w:tcBorders>
+              <w:top w:val="single" w:sz="6" w:space="0" w:color="CECECE"/>
+              <w:left w:val="single" w:sz="6" w:space="0" w:color="CECECE"/>
+              <w:bottom w:val="single" w:sz="6" w:space="0" w:color="CECECE"/>
+              <w:right w:val="single" w:sz="6" w:space="0" w:color="CECECE"/>
+            </w:tcBorders>
+          </w:tcPr>
+          <w:p>
+            <w:proofErr w:type="spellStart"/>
+            <w:r>
+              <w:t>Whatsapp</w:t>
+            </w:r>
+            <w:proofErr w:type="spellEnd"/>
+            <w:r>
+              <w:t xml:space="preserve"> Used</w:t>
+            </w:r>
+          </w:p>
+        </w:tc>
+        <w:tc>
+          <w:tcPr>
+            <w:tcW w:w="3885" w:type="dxa"/>
+            <w:tcBorders>
+              <w:top w:val="single" w:sz="6" w:space="0" w:color="CECECE"/>
+              <w:left w:val="single" w:sz="6" w:space="0" w:color="CECECE"/>
+              <w:bottom w:val="single" w:sz="6" w:space="0" w:color="CECECE"/>
+              <w:right w:val="single" w:sz="6" w:space="0" w:color="CECECE"/>
+            </w:tcBorders>
+          </w:tcPr>
+          <w:p>
+            <w:r>
+              <w:t>0%</w:t>
+            </w:r>
+          </w:p>
+        </w:tc>
+      </w:tr>
+      <w:tr>
+        <w:trPr>
+          <w:trHeight w:val="540"/>
+        </w:trPr>
+        <w:tc>
+          <w:tcPr>
+            <w:tcW w:w="3508" w:type="dxa"/>
+            <w:tcBorders>
+              <w:top w:val="single" w:sz="6" w:space="0" w:color="CECECE"/>
+              <w:left w:val="single" w:sz="6" w:space="0" w:color="CECECE"/>
+              <w:bottom w:val="single" w:sz="6" w:space="0" w:color="CECECE"/>
+              <w:right w:val="single" w:sz="6" w:space="0" w:color="CECECE"/>
+            </w:tcBorders>
+          </w:tcPr>
+          <w:p>
+            <w:r>
+              <w:t>Register time</w:t>
+            </w:r>
+          </w:p>
+        </w:tc>
+        <w:tc>
+          <w:tcPr>
+            <w:tcW w:w="3885" w:type="dxa"/>
+            <w:tcBorders>
+              <w:top w:val="single" w:sz="6" w:space="0" w:color="CECECE"/>
+              <w:left w:val="single" w:sz="6" w:space="0" w:color="CECECE"/>
+              <w:bottom w:val="single" w:sz="6" w:space="0" w:color="CECECE"/>
+              <w:right w:val="single" w:sz="6" w:space="0" w:color="CECECE"/>
+            </w:tcBorders>
+          </w:tcPr>
+          <w:p>
+            <w:r>
+              <w:t>-70%</w:t>
+            </w:r>
+          </w:p>
+        </w:tc>
+      </w:tr>
+      <w:tr>
+        <w:trPr>
+          <w:trHeight w:val="540"/>
+        </w:trPr>
+        <w:tc>
+          <w:tcPr>
+            <w:tcW w:w="3508" w:type="dxa"/>
+            <w:tcBorders>
+              <w:top w:val="single" w:sz="6" w:space="0" w:color="CECECE"/>
+              <w:left w:val="single" w:sz="6" w:space="0" w:color="CECECE"/>
+              <w:bottom w:val="single" w:sz="6" w:space="0" w:color="CECECE"/>
+              <w:right w:val="single" w:sz="6" w:space="0" w:color="CECECE"/>
+            </w:tcBorders>
+          </w:tcPr>
+          <w:p>
+            <w:proofErr w:type="spellStart"/>
+            <w:r>
+              <w:t>Reports</w:t>
+            </w:r>
+            <w:proofErr w:type="spellEnd"/>
+          </w:p>
+        </w:tc>
+        <w:tc>
+          <w:tcPr>
+            <w:tcW w:w="3885" w:type="dxa"/>
+            <w:tcBorders>
+              <w:top w:val="single" w:sz="6" w:space="0" w:color="CECECE"/>
+              <w:left w:val="single" w:sz="6" w:space="0" w:color="CECECE"/>
+              <w:bottom w:val="single" w:sz="6" w:space="0" w:color="CECECE"/>
+              <w:right w:val="single" w:sz="6" w:space="0" w:color="CECECE"/>
+            </w:tcBorders>
+          </w:tcPr>
+          <w:p>
+            <w:r>
+              <w:t>Real time</w:t>
+            </w:r>
+          </w:p>
+        </w:tc>
+      </w:tr>
+    </w:tbl>
+    <w:p>
+      <w:pPr>
+        <w:spacing w:after="0"/>
+        <w:ind w:left="-5" w:hanging="10"/>
+      </w:pPr>
       <w:r>
         <w:rPr>
           <w:color w:val="202020"/>
           <w:sz w:val="24"/>
         </w:rPr>
-        <w:t>Business Background</w:t>
+        <w:t xml:space="preserve">Scope </w:t>
       </w:r>
+      <w:proofErr w:type="spellStart"/>
+      <w:r>
+        <w:rPr>
+          <w:color w:val="202020"/>
+          <w:sz w:val="24"/>
+        </w:rPr>
+        <w:t>of</w:t>
+      </w:r>
+      <w:proofErr w:type="spellEnd"/>
+      <w:r>
+        <w:rPr>
+          <w:color w:val="202020"/>
+          <w:sz w:val="24"/>
+        </w:rPr>
+        <w:t xml:space="preserve"> Work: </w:t>
+      </w:r>
+    </w:p>
+    <w:tbl>
+      <w:tblPr>
+        <w:tblStyle w:val="TableGrid"/>
+        <w:tblW w:w="10661" w:type="dxa"/>
+        <w:tblInd w:w="159" w:type="dxa"/>
+        <w:tblCellMar>
+          <w:top w:w="0" w:type="dxa"/>
+          <w:left w:w="0" w:type="dxa"/>
+          <w:bottom w:w="46" w:type="dxa"/>
+          <w:right w:w="115" w:type="dxa"/>
+        </w:tblCellMar>
+        <w:tblLook w:val="04A0" w:firstRow="1" w:lastRow="0" w:firstColumn="1" w:lastColumn="0" w:noHBand="0" w:noVBand="1"/>
+      </w:tblPr>
+      <w:tblGrid>
+        <w:gridCol w:w="2413"/>
+        <w:gridCol w:w="2151"/>
+        <w:gridCol w:w="6097"/>
+      </w:tblGrid>
+      <w:tr>
+        <w:trPr>
+          <w:trHeight w:val="536"/>
+        </w:trPr>
+        <w:tc>
+          <w:tcPr>
+            <w:tcW w:w="2413" w:type="dxa"/>
+            <w:tcBorders>
+              <w:top w:val="single" w:sz="6" w:space="0" w:color="CECECE"/>
+              <w:left w:val="single" w:sz="6" w:space="0" w:color="CECECE"/>
+              <w:bottom w:val="single" w:sz="6" w:space="0" w:color="CECECE"/>
+              <w:right w:val="nil"/>
+            </w:tcBorders>
+            <w:shd w:val="clear" w:color="auto" w:fill="D9DAFF"/>
+          </w:tcPr>
+          <w:p/>
+        </w:tc>
+        <w:tc>
+          <w:tcPr>
+            <w:tcW w:w="2151" w:type="dxa"/>
+            <w:tcBorders>
+              <w:top w:val="single" w:sz="6" w:space="0" w:color="CECECE"/>
+              <w:left w:val="nil"/>
+              <w:bottom w:val="single" w:sz="6" w:space="0" w:color="CECECE"/>
+              <w:right w:val="nil"/>
+            </w:tcBorders>
+            <w:shd w:val="clear" w:color="auto" w:fill="D9DAFF"/>
+          </w:tcPr>
+          <w:p/>
+        </w:tc>
+        <w:tc>
+          <w:tcPr>
+            <w:tcW w:w="6097" w:type="dxa"/>
+            <w:tcBorders>
+              <w:top w:val="single" w:sz="6" w:space="0" w:color="CECECE"/>
+              <w:left w:val="nil"/>
+              <w:bottom w:val="single" w:sz="6" w:space="0" w:color="CECECE"/>
+              <w:right w:val="single" w:sz="6" w:space="0" w:color="CECECE"/>
+            </w:tcBorders>
+            <w:shd w:val="clear" w:color="auto" w:fill="D9DAFF"/>
+            <w:vAlign w:val="center"/>
+          </w:tcPr>
+          <w:p>
+            <w:pPr>
+              <w:spacing w:after="0"/>
+              <w:ind w:left="97"/>
+            </w:pPr>
+            <w:r>
+              <w:rPr>
+                <w:b/>
+                <w:color w:val="202020"/>
+                <w:sz w:val="24"/>
+              </w:rPr>
+              <w:t>In-Scope</w:t>
+            </w:r>
+          </w:p>
+        </w:tc>
+      </w:tr>
+      <w:tr>
+        <w:trPr>
+          <w:trHeight w:val="542"/>
+        </w:trPr>
+        <w:tc>
+          <w:tcPr>
+            <w:tcW w:w="2413" w:type="dxa"/>
+            <w:tcBorders>
+              <w:top w:val="single" w:sz="6" w:space="0" w:color="CECECE"/>
+              <w:left w:val="single" w:sz="6" w:space="0" w:color="CECECE"/>
+              <w:bottom w:val="single" w:sz="6" w:space="0" w:color="CECECE"/>
+              <w:right w:val="single" w:sz="6" w:space="0" w:color="CECECE"/>
+            </w:tcBorders>
+            <w:vAlign w:val="center"/>
+          </w:tcPr>
+          <w:p>
+            <w:pPr>
+              <w:spacing w:after="0"/>
+            </w:pPr>
+            <w:proofErr w:type="spellStart"/>
+            <w:r>
+              <w:rPr>
+                <w:b/>
+                <w:color w:val="202020"/>
+                <w:sz w:val="24"/>
+              </w:rPr>
+              <w:t>Functionalit</w:t>
+            </w:r>
+            <w:proofErr w:type="spellEnd"/>
+          </w:p>
+        </w:tc>
+        <w:tc>
+          <w:tcPr>
+            <w:tcW w:w="2151" w:type="dxa"/>
+            <w:tcBorders>
+              <w:top w:val="single" w:sz="6" w:space="0" w:color="CECECE"/>
+              <w:left w:val="single" w:sz="6" w:space="0" w:color="CECECE"/>
+              <w:bottom w:val="single" w:sz="6" w:space="0" w:color="CECECE"/>
+              <w:right w:val="nil"/>
+            </w:tcBorders>
+            <w:vAlign w:val="center"/>
+          </w:tcPr>
+          <w:p>
+            <w:pPr>
+              <w:spacing w:after="0"/>
+              <w:ind w:left="2"/>
+            </w:pPr>
+            <w:proofErr w:type="spellStart"/>
+            <w:r>
+              <w:rPr>
+                <w:b/>
+                <w:color w:val="202020"/>
+                <w:sz w:val="24"/>
+              </w:rPr>
+              <w:t>Description</w:t>
+            </w:r>
+            <w:proofErr w:type="spellEnd"/>
+          </w:p>
+        </w:tc>
+        <w:tc>
+          <w:tcPr>
+            <w:tcW w:w="6097" w:type="dxa"/>
+            <w:tcBorders>
+              <w:top w:val="single" w:sz="6" w:space="0" w:color="CECECE"/>
+              <w:left w:val="nil"/>
+              <w:bottom w:val="single" w:sz="6" w:space="0" w:color="CECECE"/>
+              <w:right w:val="single" w:sz="6" w:space="0" w:color="CECECE"/>
+            </w:tcBorders>
+          </w:tcPr>
+          <w:p/>
+        </w:tc>
+      </w:tr>
+      <w:tr>
+        <w:trPr>
+          <w:trHeight w:val="1185"/>
+        </w:trPr>
+        <w:tc>
+          <w:tcPr>
+            <w:tcW w:w="2413" w:type="dxa"/>
+            <w:tcBorders>
+              <w:top w:val="single" w:sz="6" w:space="0" w:color="CECECE"/>
+              <w:left w:val="single" w:sz="6" w:space="0" w:color="CECECE"/>
+              <w:bottom w:val="single" w:sz="6" w:space="0" w:color="CECECE"/>
+              <w:right w:val="single" w:sz="6" w:space="0" w:color="CECECE"/>
+            </w:tcBorders>
+          </w:tcPr>
+          <w:p/>
+        </w:tc>
+        <w:tc>
+          <w:tcPr>
+            <w:tcW w:w="2151" w:type="dxa"/>
+            <w:tcBorders>
+              <w:top w:val="single" w:sz="6" w:space="0" w:color="CECECE"/>
+              <w:left w:val="single" w:sz="6" w:space="0" w:color="CECECE"/>
+              <w:bottom w:val="single" w:sz="6" w:space="0" w:color="CECECE"/>
+              <w:right w:val="nil"/>
+            </w:tcBorders>
+            <w:vAlign w:val="bottom"/>
+          </w:tcPr>
+          <w:p>
+            <w:pPr>
+              <w:spacing w:after="93"/>
+              <w:ind w:left="114"/>
+            </w:pPr>
+            <w:r>
+              <w:rPr>
+                <w:color w:val="202020"/>
+                <w:sz w:val="36"/>
+              </w:rPr>
+              <w:t>•</w:t>
+            </w:r>
+            <w:r>
+              <w:rPr>
+                <w:color w:val="202020"/>
+                <w:sz w:val="24"/>
+              </w:rPr>
+              <w:t xml:space="preserve"> </w:t>
+            </w:r>
+          </w:p>
+          <w:p>
+            <w:pPr>
+              <w:spacing w:after="0"/>
+              <w:ind w:left="114"/>
+            </w:pPr>
+            <w:r>
+              <w:rPr>
+                <w:color w:val="202020"/>
+                <w:sz w:val="36"/>
+              </w:rPr>
+              <w:t>•</w:t>
+            </w:r>
+            <w:r>
+              <w:rPr>
+                <w:color w:val="202020"/>
+                <w:sz w:val="24"/>
+              </w:rPr>
+              <w:t xml:space="preserve">  </w:t>
+            </w:r>
+          </w:p>
+        </w:tc>
+        <w:tc>
+          <w:tcPr>
+            <w:tcW w:w="6097" w:type="dxa"/>
+            <w:tcBorders>
+              <w:top w:val="single" w:sz="6" w:space="0" w:color="CECECE"/>
+              <w:left w:val="nil"/>
+              <w:bottom w:val="single" w:sz="6" w:space="0" w:color="CECECE"/>
+              <w:right w:val="single" w:sz="6" w:space="0" w:color="CECECE"/>
+            </w:tcBorders>
+          </w:tcPr>
+          <w:p/>
+        </w:tc>
+      </w:tr>
+      <w:tr>
+        <w:trPr>
+          <w:trHeight w:val="1185"/>
+        </w:trPr>
+        <w:tc>
+          <w:tcPr>
+            <w:tcW w:w="2413" w:type="dxa"/>
+            <w:tcBorders>
+              <w:top w:val="single" w:sz="6" w:space="0" w:color="CECECE"/>
+              <w:left w:val="single" w:sz="6" w:space="0" w:color="CECECE"/>
+              <w:bottom w:val="single" w:sz="6" w:space="0" w:color="CECECE"/>
+              <w:right w:val="single" w:sz="6" w:space="0" w:color="CECECE"/>
+            </w:tcBorders>
+          </w:tcPr>
+          <w:p/>
+        </w:tc>
+        <w:tc>
+          <w:tcPr>
+            <w:tcW w:w="2151" w:type="dxa"/>
+            <w:tcBorders>
+              <w:top w:val="single" w:sz="6" w:space="0" w:color="CECECE"/>
+              <w:left w:val="single" w:sz="6" w:space="0" w:color="CECECE"/>
+              <w:bottom w:val="single" w:sz="6" w:space="0" w:color="CECECE"/>
+              <w:right w:val="nil"/>
+            </w:tcBorders>
+            <w:vAlign w:val="bottom"/>
+          </w:tcPr>
+          <w:p>
+            <w:pPr>
+              <w:spacing w:after="93"/>
+              <w:ind w:left="114"/>
+            </w:pPr>
+            <w:r>
+              <w:rPr>
+                <w:color w:val="202020"/>
+                <w:sz w:val="36"/>
+              </w:rPr>
+              <w:t>•</w:t>
+            </w:r>
+            <w:r>
+              <w:rPr>
+                <w:color w:val="202020"/>
+                <w:sz w:val="24"/>
+              </w:rPr>
+              <w:t xml:space="preserve"> </w:t>
+            </w:r>
+          </w:p>
+          <w:p>
+            <w:pPr>
+              <w:spacing w:after="0"/>
+              <w:ind w:left="114"/>
+            </w:pPr>
+            <w:r>
+              <w:rPr>
+                <w:color w:val="202020"/>
+                <w:sz w:val="36"/>
+              </w:rPr>
+              <w:t>•</w:t>
+            </w:r>
+            <w:r>
+              <w:rPr>
+                <w:color w:val="202020"/>
+                <w:sz w:val="24"/>
+              </w:rPr>
+              <w:t xml:space="preserve">  </w:t>
+            </w:r>
+          </w:p>
+        </w:tc>
+        <w:tc>
+          <w:tcPr>
+            <w:tcW w:w="6097" w:type="dxa"/>
+            <w:tcBorders>
+              <w:top w:val="single" w:sz="6" w:space="0" w:color="CECECE"/>
+              <w:left w:val="nil"/>
+              <w:bottom w:val="single" w:sz="6" w:space="0" w:color="CECECE"/>
+              <w:right w:val="single" w:sz="6" w:space="0" w:color="CECECE"/>
+            </w:tcBorders>
+          </w:tcPr>
+          <w:p/>
+        </w:tc>
+      </w:tr>
+      <w:tr>
+        <w:trPr>
+          <w:trHeight w:val="536"/>
+        </w:trPr>
+        <w:tc>
+          <w:tcPr>
+            <w:tcW w:w="2413" w:type="dxa"/>
+            <w:tcBorders>
+              <w:top w:val="single" w:sz="6" w:space="0" w:color="CECECE"/>
+              <w:left w:val="single" w:sz="6" w:space="0" w:color="CECECE"/>
+              <w:bottom w:val="single" w:sz="6" w:space="0" w:color="CECECE"/>
+              <w:right w:val="nil"/>
+            </w:tcBorders>
+            <w:shd w:val="clear" w:color="auto" w:fill="D9DAFF"/>
+          </w:tcPr>
+          <w:p/>
+        </w:tc>
+        <w:tc>
+          <w:tcPr>
+            <w:tcW w:w="2151" w:type="dxa"/>
+            <w:tcBorders>
+              <w:top w:val="single" w:sz="6" w:space="0" w:color="CECECE"/>
+              <w:left w:val="nil"/>
+              <w:bottom w:val="single" w:sz="6" w:space="0" w:color="CECECE"/>
+              <w:right w:val="nil"/>
+            </w:tcBorders>
+            <w:shd w:val="clear" w:color="auto" w:fill="D9DAFF"/>
+          </w:tcPr>
+          <w:p/>
+        </w:tc>
+        <w:tc>
+          <w:tcPr>
+            <w:tcW w:w="6097" w:type="dxa"/>
+            <w:tcBorders>
+              <w:top w:val="single" w:sz="6" w:space="0" w:color="CECECE"/>
+              <w:left w:val="nil"/>
+              <w:bottom w:val="single" w:sz="6" w:space="0" w:color="CECECE"/>
+              <w:right w:val="single" w:sz="6" w:space="0" w:color="CECECE"/>
+            </w:tcBorders>
+            <w:shd w:val="clear" w:color="auto" w:fill="D9DAFF"/>
+            <w:vAlign w:val="center"/>
+          </w:tcPr>
+          <w:p>
+            <w:pPr>
+              <w:spacing w:after="0"/>
+            </w:pPr>
+            <w:proofErr w:type="spellStart"/>
+            <w:r>
+              <w:rPr>
+                <w:b/>
+                <w:color w:val="202020"/>
+                <w:sz w:val="24"/>
+              </w:rPr>
+              <w:t>Out</w:t>
+            </w:r>
+            <w:proofErr w:type="spellEnd"/>
+            <w:r>
+              <w:rPr>
+                <w:b/>
+                <w:color w:val="202020"/>
+                <w:sz w:val="24"/>
+              </w:rPr>
+              <w:t xml:space="preserve"> </w:t>
+            </w:r>
+            <w:proofErr w:type="spellStart"/>
+            <w:r>
+              <w:rPr>
+                <w:b/>
+                <w:color w:val="202020"/>
+                <w:sz w:val="24"/>
+              </w:rPr>
+              <w:t>of</w:t>
+            </w:r>
+            <w:proofErr w:type="spellEnd"/>
+            <w:r>
+              <w:rPr>
+                <w:b/>
+                <w:color w:val="202020"/>
+                <w:sz w:val="24"/>
+              </w:rPr>
+              <w:t xml:space="preserve"> Scope</w:t>
+            </w:r>
+          </w:p>
+        </w:tc>
+      </w:tr>
+      <w:tr>
+        <w:trPr>
+          <w:trHeight w:val="542"/>
+        </w:trPr>
+        <w:tc>
+          <w:tcPr>
+            <w:tcW w:w="2413" w:type="dxa"/>
+            <w:tcBorders>
+              <w:top w:val="single" w:sz="6" w:space="0" w:color="CECECE"/>
+              <w:left w:val="single" w:sz="6" w:space="0" w:color="CECECE"/>
+              <w:bottom w:val="single" w:sz="6" w:space="0" w:color="CECECE"/>
+              <w:right w:val="single" w:sz="6" w:space="0" w:color="CECECE"/>
+            </w:tcBorders>
+            <w:vAlign w:val="center"/>
+          </w:tcPr>
+          <w:p>
+            <w:pPr>
+              <w:spacing w:after="0"/>
+              <w:ind w:left="156"/>
+            </w:pPr>
+            <w:r>
+              <w:rPr>
+                <w:b/>
+                <w:color w:val="202020"/>
+                <w:sz w:val="24"/>
+              </w:rPr>
+              <w:t>Owner/Team</w:t>
+            </w:r>
+          </w:p>
+        </w:tc>
+        <w:tc>
+          <w:tcPr>
+            <w:tcW w:w="2151" w:type="dxa"/>
+            <w:tcBorders>
+              <w:top w:val="single" w:sz="6" w:space="0" w:color="CECECE"/>
+              <w:left w:val="single" w:sz="6" w:space="0" w:color="CECECE"/>
+              <w:bottom w:val="single" w:sz="6" w:space="0" w:color="CECECE"/>
+              <w:right w:val="nil"/>
+            </w:tcBorders>
+            <w:vAlign w:val="center"/>
+          </w:tcPr>
+          <w:p>
+            <w:pPr>
+              <w:spacing w:after="0"/>
+              <w:ind w:left="158"/>
+            </w:pPr>
+            <w:proofErr w:type="spellStart"/>
+            <w:r>
+              <w:rPr>
+                <w:b/>
+                <w:color w:val="202020"/>
+                <w:sz w:val="24"/>
+              </w:rPr>
+              <w:t>Description</w:t>
+            </w:r>
+            <w:proofErr w:type="spellEnd"/>
+          </w:p>
+        </w:tc>
+        <w:tc>
+          <w:tcPr>
+            <w:tcW w:w="6097" w:type="dxa"/>
+            <w:tcBorders>
+              <w:top w:val="single" w:sz="6" w:space="0" w:color="CECECE"/>
+              <w:left w:val="nil"/>
+              <w:bottom w:val="single" w:sz="6" w:space="0" w:color="CECECE"/>
+              <w:right w:val="single" w:sz="6" w:space="0" w:color="CECECE"/>
+            </w:tcBorders>
+          </w:tcPr>
+          <w:p/>
+        </w:tc>
+      </w:tr>
+      <w:tr>
+        <w:trPr>
+          <w:trHeight w:val="1185"/>
+        </w:trPr>
+        <w:tc>
+          <w:tcPr>
+            <w:tcW w:w="2413" w:type="dxa"/>
+            <w:tcBorders>
+              <w:top w:val="single" w:sz="6" w:space="0" w:color="CECECE"/>
+              <w:left w:val="single" w:sz="6" w:space="0" w:color="CECECE"/>
+              <w:bottom w:val="single" w:sz="6" w:space="0" w:color="CECECE"/>
+              <w:right w:val="single" w:sz="6" w:space="0" w:color="CECECE"/>
+            </w:tcBorders>
+          </w:tcPr>
+          <w:p/>
+        </w:tc>
+        <w:tc>
+          <w:tcPr>
+            <w:tcW w:w="2151" w:type="dxa"/>
+            <w:tcBorders>
+              <w:top w:val="single" w:sz="6" w:space="0" w:color="CECECE"/>
+              <w:left w:val="single" w:sz="6" w:space="0" w:color="CECECE"/>
+              <w:bottom w:val="single" w:sz="6" w:space="0" w:color="CECECE"/>
+              <w:right w:val="nil"/>
+            </w:tcBorders>
+            <w:vAlign w:val="bottom"/>
+          </w:tcPr>
+          <w:p>
+            <w:pPr>
+              <w:spacing w:after="93"/>
+              <w:ind w:left="270"/>
+            </w:pPr>
+            <w:r>
+              <w:rPr>
+                <w:color w:val="202020"/>
+                <w:sz w:val="36"/>
+              </w:rPr>
+              <w:t>•</w:t>
+            </w:r>
+            <w:r>
+              <w:rPr>
+                <w:color w:val="202020"/>
+                <w:sz w:val="24"/>
+              </w:rPr>
+              <w:t xml:space="preserve"> </w:t>
+            </w:r>
+          </w:p>
+          <w:p>
+            <w:pPr>
+              <w:spacing w:after="0"/>
+              <w:ind w:left="270"/>
+            </w:pPr>
+            <w:r>
+              <w:rPr>
+                <w:color w:val="202020"/>
+                <w:sz w:val="36"/>
+              </w:rPr>
+              <w:t>•</w:t>
+            </w:r>
+            <w:r>
+              <w:rPr>
+                <w:color w:val="202020"/>
+                <w:sz w:val="24"/>
+              </w:rPr>
+              <w:t xml:space="preserve">  </w:t>
+            </w:r>
+          </w:p>
+        </w:tc>
+        <w:tc>
+          <w:tcPr>
+            <w:tcW w:w="6097" w:type="dxa"/>
+            <w:tcBorders>
+              <w:top w:val="single" w:sz="6" w:space="0" w:color="CECECE"/>
+              <w:left w:val="nil"/>
+              <w:bottom w:val="single" w:sz="6" w:space="0" w:color="CECECE"/>
+              <w:right w:val="single" w:sz="6" w:space="0" w:color="CECECE"/>
+            </w:tcBorders>
+          </w:tcPr>
+          <w:p/>
+        </w:tc>
+      </w:tr>
+      <w:tr>
+        <w:trPr>
+          <w:trHeight w:val="1185"/>
+        </w:trPr>
+        <w:tc>
+          <w:tcPr>
+            <w:tcW w:w="2413" w:type="dxa"/>
+            <w:tcBorders>
+              <w:top w:val="single" w:sz="6" w:space="0" w:color="CECECE"/>
+              <w:left w:val="single" w:sz="6" w:space="0" w:color="CECECE"/>
+              <w:bottom w:val="single" w:sz="6" w:space="0" w:color="CECECE"/>
+              <w:right w:val="single" w:sz="6" w:space="0" w:color="CECECE"/>
+            </w:tcBorders>
+          </w:tcPr>
+          <w:p/>
+          <w:p/>
+          <w:p/>
+        </w:tc>
+        <w:tc>
+          <w:tcPr>
+            <w:tcW w:w="2151" w:type="dxa"/>
+            <w:tcBorders>
+              <w:top w:val="single" w:sz="6" w:space="0" w:color="CECECE"/>
+              <w:left w:val="single" w:sz="6" w:space="0" w:color="CECECE"/>
+              <w:bottom w:val="single" w:sz="6" w:space="0" w:color="CECECE"/>
+              <w:right w:val="nil"/>
+            </w:tcBorders>
+            <w:vAlign w:val="bottom"/>
+          </w:tcPr>
+          <w:p>
+            <w:pPr>
+              <w:spacing w:after="94"/>
+              <w:ind w:left="270"/>
+            </w:pPr>
+            <w:r>
+              <w:rPr>
+                <w:color w:val="202020"/>
+                <w:sz w:val="36"/>
+              </w:rPr>
+              <w:t>•</w:t>
+            </w:r>
+            <w:r>
+              <w:rPr>
+                <w:color w:val="202020"/>
+                <w:sz w:val="24"/>
+              </w:rPr>
+              <w:t xml:space="preserve"> </w:t>
+            </w:r>
+          </w:p>
+          <w:p>
+            <w:pPr>
+              <w:spacing w:after="0"/>
+              <w:ind w:left="270"/>
+            </w:pPr>
+            <w:r>
+              <w:rPr>
+                <w:color w:val="202020"/>
+                <w:sz w:val="36"/>
+              </w:rPr>
+              <w:t>•</w:t>
+            </w:r>
+            <w:r>
+              <w:rPr>
+                <w:color w:val="202020"/>
+                <w:sz w:val="24"/>
+              </w:rPr>
+              <w:t xml:space="preserve"> </w:t>
+            </w:r>
+          </w:p>
+        </w:tc>
+        <w:tc>
+          <w:tcPr>
+            <w:tcW w:w="6097" w:type="dxa"/>
+            <w:tcBorders>
+              <w:top w:val="single" w:sz="6" w:space="0" w:color="CECECE"/>
+              <w:left w:val="nil"/>
+              <w:bottom w:val="single" w:sz="6" w:space="0" w:color="CECECE"/>
+              <w:right w:val="single" w:sz="6" w:space="0" w:color="CECECE"/>
+            </w:tcBorders>
+          </w:tcPr>
+          <w:p/>
+        </w:tc>
+      </w:tr>
+    </w:tbl>
+    <w:p>
+      <w:pPr>
+        <w:spacing w:after="0"/>
+        <w:ind w:left="-5" w:hanging="10"/>
+        <w:rPr>
+          <w:color w:val="202020"/>
+          <w:sz w:val="24"/>
+        </w:rPr>
+      </w:pPr>
+      <w:proofErr w:type="spellStart"/>
+      <w:r>
+        <w:rPr>
+          <w:color w:val="202020"/>
+          <w:sz w:val="24"/>
+        </w:rPr>
+        <w:t>Porpuse</w:t>
+      </w:r>
+      <w:proofErr w:type="spellEnd"/>
+      <w:r>
+        <w:rPr>
+          <w:color w:val="202020"/>
+          <w:sz w:val="24"/>
+        </w:rPr>
+        <w:t xml:space="preserve"> </w:t>
+      </w:r>
+      <w:proofErr w:type="spellStart"/>
+      <w:r>
+        <w:rPr>
+          <w:color w:val="202020"/>
+          <w:sz w:val="24"/>
+        </w:rPr>
+        <w:t>Solution</w:t>
+      </w:r>
+      <w:proofErr w:type="spellEnd"/>
       <w:r>
         <w:rPr>
           <w:color w:val="202020"/>
@@ -1245,953 +2447,21 @@
         <w:spacing w:after="0"/>
         <w:ind w:left="-5" w:hanging="10"/>
       </w:pPr>
+      <w:proofErr w:type="spellStart"/>
       <w:r>
         <w:rPr>
           <w:color w:val="202020"/>
           <w:sz w:val="24"/>
         </w:rPr>
-        <w:t>Business Problem</w:t>
+        <w:t>Deliverables</w:t>
       </w:r>
+      <w:proofErr w:type="spellEnd"/>
       <w:r>
         <w:rPr>
           <w:color w:val="202020"/>
           <w:sz w:val="24"/>
         </w:rPr>
         <w:t>:</w:t>
-      </w:r>
-    </w:p>
-    <w:p>
-      <w:pPr>
-        <w:spacing w:after="0"/>
-        <w:ind w:left="-5" w:hanging="10"/>
-      </w:pPr>
-    </w:p>
-    <w:p>
-      <w:pPr>
-        <w:spacing w:after="0"/>
-        <w:ind w:left="-5" w:hanging="10"/>
-        <w:rPr>
-          <w:color w:val="202020"/>
-          <w:sz w:val="24"/>
-        </w:rPr>
-      </w:pPr>
-    </w:p>
-    <w:p>
-      <w:pPr>
-        <w:spacing w:after="0"/>
-        <w:ind w:left="-5" w:hanging="10"/>
-        <w:rPr>
-          <w:color w:val="202020"/>
-          <w:sz w:val="24"/>
-        </w:rPr>
-      </w:pPr>
-    </w:p>
-    <w:p>
-      <w:pPr>
-        <w:spacing w:after="0"/>
-        <w:ind w:left="-5" w:hanging="10"/>
-      </w:pPr>
-      <w:r>
-        <w:rPr>
-          <w:color w:val="202020"/>
-          <w:sz w:val="24"/>
-        </w:rPr>
-        <w:t>Success Metrics:</w:t>
-      </w:r>
-    </w:p>
-    <w:tbl>
-      <w:tblPr>
-        <w:tblStyle w:val="TableGrid"/>
-        <w:tblW w:w="7393" w:type="dxa"/>
-        <w:tblInd w:w="159" w:type="dxa"/>
-        <w:tblCellMar>
-          <w:top w:w="0" w:type="dxa"/>
-          <w:left w:w="156" w:type="dxa"/>
-          <w:bottom w:w="0" w:type="dxa"/>
-          <w:right w:w="115" w:type="dxa"/>
-        </w:tblCellMar>
-        <w:tblLook w:val="04A0" w:firstRow="1" w:lastRow="0" w:firstColumn="1" w:lastColumn="0" w:noHBand="0" w:noVBand="1"/>
-      </w:tblPr>
-      <w:tblGrid>
-        <w:gridCol w:w="3508"/>
-        <w:gridCol w:w="3885"/>
-      </w:tblGrid>
-      <w:tr>
-        <w:trPr>
-          <w:trHeight w:val="536"/>
-        </w:trPr>
-        <w:tc>
-          <w:tcPr>
-            <w:tcW w:w="3508" w:type="dxa"/>
-            <w:tcBorders>
-              <w:top w:val="single" w:sz="6" w:space="0" w:color="CECECE"/>
-              <w:left w:val="single" w:sz="6" w:space="0" w:color="CECECE"/>
-              <w:bottom w:val="single" w:sz="6" w:space="0" w:color="CECECE"/>
-              <w:right w:val="single" w:sz="6" w:space="0" w:color="CECECE"/>
-            </w:tcBorders>
-            <w:shd w:val="clear" w:color="auto" w:fill="D9DAFF"/>
-            <w:vAlign w:val="center"/>
-          </w:tcPr>
-          <w:p>
-            <w:pPr>
-              <w:spacing w:after="0"/>
-            </w:pPr>
-            <w:r>
-              <w:rPr>
-                <w:b/>
-                <w:color w:val="202020"/>
-                <w:sz w:val="24"/>
-              </w:rPr>
-              <w:t>KPI</w:t>
-            </w:r>
-          </w:p>
-        </w:tc>
-        <w:tc>
-          <w:tcPr>
-            <w:tcW w:w="3885" w:type="dxa"/>
-            <w:tcBorders>
-              <w:top w:val="single" w:sz="6" w:space="0" w:color="CECECE"/>
-              <w:left w:val="single" w:sz="6" w:space="0" w:color="CECECE"/>
-              <w:bottom w:val="single" w:sz="6" w:space="0" w:color="CECECE"/>
-              <w:right w:val="single" w:sz="6" w:space="0" w:color="CECECE"/>
-            </w:tcBorders>
-            <w:shd w:val="clear" w:color="auto" w:fill="D9DAFF"/>
-            <w:vAlign w:val="center"/>
-          </w:tcPr>
-          <w:p>
-            <w:pPr>
-              <w:spacing w:after="0"/>
-              <w:ind w:left="2"/>
-            </w:pPr>
-            <w:r>
-              <w:rPr>
-                <w:b/>
-                <w:color w:val="202020"/>
-                <w:sz w:val="24"/>
-              </w:rPr>
-              <w:t>Goal</w:t>
-            </w:r>
-          </w:p>
-        </w:tc>
-      </w:tr>
-      <w:tr>
-        <w:trPr>
-          <w:trHeight w:val="542"/>
-        </w:trPr>
-        <w:tc>
-          <w:tcPr>
-            <w:tcW w:w="3508" w:type="dxa"/>
-            <w:tcBorders>
-              <w:top w:val="single" w:sz="6" w:space="0" w:color="CECECE"/>
-              <w:left w:val="single" w:sz="6" w:space="0" w:color="CECECE"/>
-              <w:bottom w:val="single" w:sz="6" w:space="0" w:color="CECECE"/>
-              <w:right w:val="single" w:sz="6" w:space="0" w:color="CECECE"/>
-            </w:tcBorders>
-          </w:tcPr>
-          <w:p>
-            <w:r>
-              <w:t>Digital register</w:t>
-            </w:r>
-          </w:p>
-        </w:tc>
-        <w:tc>
-          <w:tcPr>
-            <w:tcW w:w="3885" w:type="dxa"/>
-            <w:tcBorders>
-              <w:top w:val="single" w:sz="6" w:space="0" w:color="CECECE"/>
-              <w:left w:val="single" w:sz="6" w:space="0" w:color="CECECE"/>
-              <w:bottom w:val="single" w:sz="6" w:space="0" w:color="CECECE"/>
-              <w:right w:val="single" w:sz="6" w:space="0" w:color="CECECE"/>
-            </w:tcBorders>
-          </w:tcPr>
-          <w:p>
-            <w:r>
-              <w:t>100%</w:t>
-            </w:r>
-          </w:p>
-        </w:tc>
-      </w:tr>
-      <w:tr>
-        <w:trPr>
-          <w:trHeight w:val="540"/>
-        </w:trPr>
-        <w:tc>
-          <w:tcPr>
-            <w:tcW w:w="3508" w:type="dxa"/>
-            <w:tcBorders>
-              <w:top w:val="single" w:sz="6" w:space="0" w:color="CECECE"/>
-              <w:left w:val="single" w:sz="6" w:space="0" w:color="CECECE"/>
-              <w:bottom w:val="single" w:sz="6" w:space="0" w:color="CECECE"/>
-              <w:right w:val="single" w:sz="6" w:space="0" w:color="CECECE"/>
-            </w:tcBorders>
-          </w:tcPr>
-          <w:p>
-            <w:r>
-              <w:t>Whatsapp Used</w:t>
-            </w:r>
-          </w:p>
-        </w:tc>
-        <w:tc>
-          <w:tcPr>
-            <w:tcW w:w="3885" w:type="dxa"/>
-            <w:tcBorders>
-              <w:top w:val="single" w:sz="6" w:space="0" w:color="CECECE"/>
-              <w:left w:val="single" w:sz="6" w:space="0" w:color="CECECE"/>
-              <w:bottom w:val="single" w:sz="6" w:space="0" w:color="CECECE"/>
-              <w:right w:val="single" w:sz="6" w:space="0" w:color="CECECE"/>
-            </w:tcBorders>
-          </w:tcPr>
-          <w:p>
-            <w:r>
-              <w:t>0%</w:t>
-            </w:r>
-          </w:p>
-        </w:tc>
-      </w:tr>
-      <w:tr>
-        <w:trPr>
-          <w:trHeight w:val="540"/>
-        </w:trPr>
-        <w:tc>
-          <w:tcPr>
-            <w:tcW w:w="3508" w:type="dxa"/>
-            <w:tcBorders>
-              <w:top w:val="single" w:sz="6" w:space="0" w:color="CECECE"/>
-              <w:left w:val="single" w:sz="6" w:space="0" w:color="CECECE"/>
-              <w:bottom w:val="single" w:sz="6" w:space="0" w:color="CECECE"/>
-              <w:right w:val="single" w:sz="6" w:space="0" w:color="CECECE"/>
-            </w:tcBorders>
-          </w:tcPr>
-          <w:p>
-            <w:r>
-              <w:t>Register time</w:t>
-            </w:r>
-          </w:p>
-        </w:tc>
-        <w:tc>
-          <w:tcPr>
-            <w:tcW w:w="3885" w:type="dxa"/>
-            <w:tcBorders>
-              <w:top w:val="single" w:sz="6" w:space="0" w:color="CECECE"/>
-              <w:left w:val="single" w:sz="6" w:space="0" w:color="CECECE"/>
-              <w:bottom w:val="single" w:sz="6" w:space="0" w:color="CECECE"/>
-              <w:right w:val="single" w:sz="6" w:space="0" w:color="CECECE"/>
-            </w:tcBorders>
-          </w:tcPr>
-          <w:p>
-            <w:r>
-              <w:t>-70%</w:t>
-            </w:r>
-          </w:p>
-        </w:tc>
-      </w:tr>
-      <w:tr>
-        <w:trPr>
-          <w:trHeight w:val="540"/>
-        </w:trPr>
-        <w:tc>
-          <w:tcPr>
-            <w:tcW w:w="3508" w:type="dxa"/>
-            <w:tcBorders>
-              <w:top w:val="single" w:sz="6" w:space="0" w:color="CECECE"/>
-              <w:left w:val="single" w:sz="6" w:space="0" w:color="CECECE"/>
-              <w:bottom w:val="single" w:sz="6" w:space="0" w:color="CECECE"/>
-              <w:right w:val="single" w:sz="6" w:space="0" w:color="CECECE"/>
-            </w:tcBorders>
-          </w:tcPr>
-          <w:p>
-            <w:r>
-              <w:t>Reports</w:t>
-            </w:r>
-          </w:p>
-        </w:tc>
-        <w:tc>
-          <w:tcPr>
-            <w:tcW w:w="3885" w:type="dxa"/>
-            <w:tcBorders>
-              <w:top w:val="single" w:sz="6" w:space="0" w:color="CECECE"/>
-              <w:left w:val="single" w:sz="6" w:space="0" w:color="CECECE"/>
-              <w:bottom w:val="single" w:sz="6" w:space="0" w:color="CECECE"/>
-              <w:right w:val="single" w:sz="6" w:space="0" w:color="CECECE"/>
-            </w:tcBorders>
-          </w:tcPr>
-          <w:p>
-            <w:r>
-              <w:t>Real time</w:t>
-            </w:r>
-          </w:p>
-        </w:tc>
-      </w:tr>
-    </w:tbl>
-    <w:p>
-      <w:pPr>
-        <w:spacing w:after="0"/>
-        <w:ind w:left="-5" w:hanging="10"/>
-      </w:pPr>
-      <w:r>
-        <w:rPr>
-          <w:color w:val="202020"/>
-          <w:sz w:val="24"/>
-        </w:rPr>
-        <w:t xml:space="preserve">Scope of Work: </w:t>
-      </w:r>
-    </w:p>
-    <w:tbl>
-      <w:tblPr>
-        <w:tblStyle w:val="TableGrid"/>
-        <w:tblW w:w="10661" w:type="dxa"/>
-        <w:tblInd w:w="159" w:type="dxa"/>
-        <w:tblCellMar>
-          <w:top w:w="0" w:type="dxa"/>
-          <w:left w:w="0" w:type="dxa"/>
-          <w:bottom w:w="46" w:type="dxa"/>
-          <w:right w:w="115" w:type="dxa"/>
-        </w:tblCellMar>
-        <w:tblLook w:val="04A0" w:firstRow="1" w:lastRow="0" w:firstColumn="1" w:lastColumn="0" w:noHBand="0" w:noVBand="1"/>
-      </w:tblPr>
-      <w:tblGrid>
-        <w:gridCol w:w="2413"/>
-        <w:gridCol w:w="2151"/>
-        <w:gridCol w:w="6097"/>
-      </w:tblGrid>
-      <w:tr>
-        <w:trPr>
-          <w:trHeight w:val="536"/>
-        </w:trPr>
-        <w:tc>
-          <w:tcPr>
-            <w:tcW w:w="2413" w:type="dxa"/>
-            <w:tcBorders>
-              <w:top w:val="single" w:sz="6" w:space="0" w:color="CECECE"/>
-              <w:left w:val="single" w:sz="6" w:space="0" w:color="CECECE"/>
-              <w:bottom w:val="single" w:sz="6" w:space="0" w:color="CECECE"/>
-              <w:right w:val="nil"/>
-            </w:tcBorders>
-            <w:shd w:val="clear" w:color="auto" w:fill="D9DAFF"/>
-          </w:tcPr>
-          <w:p/>
-        </w:tc>
-        <w:tc>
-          <w:tcPr>
-            <w:tcW w:w="2151" w:type="dxa"/>
-            <w:tcBorders>
-              <w:top w:val="single" w:sz="6" w:space="0" w:color="CECECE"/>
-              <w:left w:val="nil"/>
-              <w:bottom w:val="single" w:sz="6" w:space="0" w:color="CECECE"/>
-              <w:right w:val="nil"/>
-            </w:tcBorders>
-            <w:shd w:val="clear" w:color="auto" w:fill="D9DAFF"/>
-          </w:tcPr>
-          <w:p/>
-        </w:tc>
-        <w:tc>
-          <w:tcPr>
-            <w:tcW w:w="6097" w:type="dxa"/>
-            <w:tcBorders>
-              <w:top w:val="single" w:sz="6" w:space="0" w:color="CECECE"/>
-              <w:left w:val="nil"/>
-              <w:bottom w:val="single" w:sz="6" w:space="0" w:color="CECECE"/>
-              <w:right w:val="single" w:sz="6" w:space="0" w:color="CECECE"/>
-            </w:tcBorders>
-            <w:shd w:val="clear" w:color="auto" w:fill="D9DAFF"/>
-            <w:vAlign w:val="center"/>
-          </w:tcPr>
-          <w:p>
-            <w:pPr>
-              <w:spacing w:after="0"/>
-              <w:ind w:left="97"/>
-            </w:pPr>
-            <w:r>
-              <w:rPr>
-                <w:b/>
-                <w:color w:val="202020"/>
-                <w:sz w:val="24"/>
-              </w:rPr>
-              <w:t>In-Scope</w:t>
-            </w:r>
-          </w:p>
-        </w:tc>
-      </w:tr>
-      <w:tr>
-        <w:trPr>
-          <w:trHeight w:val="542"/>
-        </w:trPr>
-        <w:tc>
-          <w:tcPr>
-            <w:tcW w:w="2413" w:type="dxa"/>
-            <w:tcBorders>
-              <w:top w:val="single" w:sz="6" w:space="0" w:color="CECECE"/>
-              <w:left w:val="single" w:sz="6" w:space="0" w:color="CECECE"/>
-              <w:bottom w:val="single" w:sz="6" w:space="0" w:color="CECECE"/>
-              <w:right w:val="single" w:sz="6" w:space="0" w:color="CECECE"/>
-            </w:tcBorders>
-            <w:vAlign w:val="center"/>
-          </w:tcPr>
-          <w:p>
-            <w:pPr>
-              <w:spacing w:after="0"/>
-            </w:pPr>
-            <w:r>
-              <w:rPr>
-                <w:b/>
-                <w:color w:val="202020"/>
-                <w:sz w:val="24"/>
-              </w:rPr>
-              <w:t>Functionalit</w:t>
-            </w:r>
-          </w:p>
-        </w:tc>
-        <w:tc>
-          <w:tcPr>
-            <w:tcW w:w="2151" w:type="dxa"/>
-            <w:tcBorders>
-              <w:top w:val="single" w:sz="6" w:space="0" w:color="CECECE"/>
-              <w:left w:val="single" w:sz="6" w:space="0" w:color="CECECE"/>
-              <w:bottom w:val="single" w:sz="6" w:space="0" w:color="CECECE"/>
-              <w:right w:val="nil"/>
-            </w:tcBorders>
-            <w:vAlign w:val="center"/>
-          </w:tcPr>
-          <w:p>
-            <w:pPr>
-              <w:spacing w:after="0"/>
-              <w:ind w:left="2"/>
-            </w:pPr>
-            <w:r>
-              <w:rPr>
-                <w:b/>
-                <w:color w:val="202020"/>
-                <w:sz w:val="24"/>
-              </w:rPr>
-              <w:t>Description</w:t>
-            </w:r>
-          </w:p>
-        </w:tc>
-        <w:tc>
-          <w:tcPr>
-            <w:tcW w:w="6097" w:type="dxa"/>
-            <w:tcBorders>
-              <w:top w:val="single" w:sz="6" w:space="0" w:color="CECECE"/>
-              <w:left w:val="nil"/>
-              <w:bottom w:val="single" w:sz="6" w:space="0" w:color="CECECE"/>
-              <w:right w:val="single" w:sz="6" w:space="0" w:color="CECECE"/>
-            </w:tcBorders>
-          </w:tcPr>
-          <w:p/>
-        </w:tc>
-      </w:tr>
-      <w:tr>
-        <w:trPr>
-          <w:trHeight w:val="1185"/>
-        </w:trPr>
-        <w:tc>
-          <w:tcPr>
-            <w:tcW w:w="2413" w:type="dxa"/>
-            <w:tcBorders>
-              <w:top w:val="single" w:sz="6" w:space="0" w:color="CECECE"/>
-              <w:left w:val="single" w:sz="6" w:space="0" w:color="CECECE"/>
-              <w:bottom w:val="single" w:sz="6" w:space="0" w:color="CECECE"/>
-              <w:right w:val="single" w:sz="6" w:space="0" w:color="CECECE"/>
-            </w:tcBorders>
-          </w:tcPr>
-          <w:p/>
-        </w:tc>
-        <w:tc>
-          <w:tcPr>
-            <w:tcW w:w="2151" w:type="dxa"/>
-            <w:tcBorders>
-              <w:top w:val="single" w:sz="6" w:space="0" w:color="CECECE"/>
-              <w:left w:val="single" w:sz="6" w:space="0" w:color="CECECE"/>
-              <w:bottom w:val="single" w:sz="6" w:space="0" w:color="CECECE"/>
-              <w:right w:val="nil"/>
-            </w:tcBorders>
-            <w:vAlign w:val="bottom"/>
-          </w:tcPr>
-          <w:p>
-            <w:pPr>
-              <w:spacing w:after="93"/>
-              <w:ind w:left="114"/>
-            </w:pPr>
-            <w:r>
-              <w:rPr>
-                <w:color w:val="202020"/>
-                <w:sz w:val="36"/>
-              </w:rPr>
-              <w:t>•</w:t>
-            </w:r>
-            <w:r>
-              <w:rPr>
-                <w:color w:val="202020"/>
-                <w:sz w:val="24"/>
-              </w:rPr>
-              <w:t xml:space="preserve"> </w:t>
-            </w:r>
-          </w:p>
-          <w:p>
-            <w:pPr>
-              <w:spacing w:after="0"/>
-              <w:ind w:left="114"/>
-            </w:pPr>
-            <w:r>
-              <w:rPr>
-                <w:color w:val="202020"/>
-                <w:sz w:val="36"/>
-              </w:rPr>
-              <w:t>•</w:t>
-            </w:r>
-            <w:r>
-              <w:rPr>
-                <w:color w:val="202020"/>
-                <w:sz w:val="24"/>
-              </w:rPr>
-              <w:t xml:space="preserve">  </w:t>
-            </w:r>
-          </w:p>
-        </w:tc>
-        <w:tc>
-          <w:tcPr>
-            <w:tcW w:w="6097" w:type="dxa"/>
-            <w:tcBorders>
-              <w:top w:val="single" w:sz="6" w:space="0" w:color="CECECE"/>
-              <w:left w:val="nil"/>
-              <w:bottom w:val="single" w:sz="6" w:space="0" w:color="CECECE"/>
-              <w:right w:val="single" w:sz="6" w:space="0" w:color="CECECE"/>
-            </w:tcBorders>
-          </w:tcPr>
-          <w:p/>
-        </w:tc>
-      </w:tr>
-      <w:tr>
-        <w:trPr>
-          <w:trHeight w:val="1185"/>
-        </w:trPr>
-        <w:tc>
-          <w:tcPr>
-            <w:tcW w:w="2413" w:type="dxa"/>
-            <w:tcBorders>
-              <w:top w:val="single" w:sz="6" w:space="0" w:color="CECECE"/>
-              <w:left w:val="single" w:sz="6" w:space="0" w:color="CECECE"/>
-              <w:bottom w:val="single" w:sz="6" w:space="0" w:color="CECECE"/>
-              <w:right w:val="single" w:sz="6" w:space="0" w:color="CECECE"/>
-            </w:tcBorders>
-          </w:tcPr>
-          <w:p/>
-        </w:tc>
-        <w:tc>
-          <w:tcPr>
-            <w:tcW w:w="2151" w:type="dxa"/>
-            <w:tcBorders>
-              <w:top w:val="single" w:sz="6" w:space="0" w:color="CECECE"/>
-              <w:left w:val="single" w:sz="6" w:space="0" w:color="CECECE"/>
-              <w:bottom w:val="single" w:sz="6" w:space="0" w:color="CECECE"/>
-              <w:right w:val="nil"/>
-            </w:tcBorders>
-            <w:vAlign w:val="bottom"/>
-          </w:tcPr>
-          <w:p>
-            <w:pPr>
-              <w:spacing w:after="93"/>
-              <w:ind w:left="114"/>
-            </w:pPr>
-            <w:r>
-              <w:rPr>
-                <w:color w:val="202020"/>
-                <w:sz w:val="36"/>
-              </w:rPr>
-              <w:t>•</w:t>
-            </w:r>
-            <w:r>
-              <w:rPr>
-                <w:color w:val="202020"/>
-                <w:sz w:val="24"/>
-              </w:rPr>
-              <w:t xml:space="preserve"> </w:t>
-            </w:r>
-          </w:p>
-          <w:p>
-            <w:pPr>
-              <w:spacing w:after="0"/>
-              <w:ind w:left="114"/>
-            </w:pPr>
-            <w:r>
-              <w:rPr>
-                <w:color w:val="202020"/>
-                <w:sz w:val="36"/>
-              </w:rPr>
-              <w:t>•</w:t>
-            </w:r>
-            <w:r>
-              <w:rPr>
-                <w:color w:val="202020"/>
-                <w:sz w:val="24"/>
-              </w:rPr>
-              <w:t xml:space="preserve">  </w:t>
-            </w:r>
-          </w:p>
-        </w:tc>
-        <w:tc>
-          <w:tcPr>
-            <w:tcW w:w="6097" w:type="dxa"/>
-            <w:tcBorders>
-              <w:top w:val="single" w:sz="6" w:space="0" w:color="CECECE"/>
-              <w:left w:val="nil"/>
-              <w:bottom w:val="single" w:sz="6" w:space="0" w:color="CECECE"/>
-              <w:right w:val="single" w:sz="6" w:space="0" w:color="CECECE"/>
-            </w:tcBorders>
-          </w:tcPr>
-          <w:p/>
-        </w:tc>
-      </w:tr>
-      <w:tr>
-        <w:trPr>
-          <w:trHeight w:val="536"/>
-        </w:trPr>
-        <w:tc>
-          <w:tcPr>
-            <w:tcW w:w="2413" w:type="dxa"/>
-            <w:tcBorders>
-              <w:top w:val="single" w:sz="6" w:space="0" w:color="CECECE"/>
-              <w:left w:val="single" w:sz="6" w:space="0" w:color="CECECE"/>
-              <w:bottom w:val="single" w:sz="6" w:space="0" w:color="CECECE"/>
-              <w:right w:val="nil"/>
-            </w:tcBorders>
-            <w:shd w:val="clear" w:color="auto" w:fill="D9DAFF"/>
-          </w:tcPr>
-          <w:p/>
-        </w:tc>
-        <w:tc>
-          <w:tcPr>
-            <w:tcW w:w="2151" w:type="dxa"/>
-            <w:tcBorders>
-              <w:top w:val="single" w:sz="6" w:space="0" w:color="CECECE"/>
-              <w:left w:val="nil"/>
-              <w:bottom w:val="single" w:sz="6" w:space="0" w:color="CECECE"/>
-              <w:right w:val="nil"/>
-            </w:tcBorders>
-            <w:shd w:val="clear" w:color="auto" w:fill="D9DAFF"/>
-          </w:tcPr>
-          <w:p/>
-        </w:tc>
-        <w:tc>
-          <w:tcPr>
-            <w:tcW w:w="6097" w:type="dxa"/>
-            <w:tcBorders>
-              <w:top w:val="single" w:sz="6" w:space="0" w:color="CECECE"/>
-              <w:left w:val="nil"/>
-              <w:bottom w:val="single" w:sz="6" w:space="0" w:color="CECECE"/>
-              <w:right w:val="single" w:sz="6" w:space="0" w:color="CECECE"/>
-            </w:tcBorders>
-            <w:shd w:val="clear" w:color="auto" w:fill="D9DAFF"/>
-            <w:vAlign w:val="center"/>
-          </w:tcPr>
-          <w:p>
-            <w:pPr>
-              <w:spacing w:after="0"/>
-            </w:pPr>
-            <w:r>
-              <w:rPr>
-                <w:b/>
-                <w:color w:val="202020"/>
-                <w:sz w:val="24"/>
-              </w:rPr>
-              <w:t>Out of Scope</w:t>
-            </w:r>
-          </w:p>
-        </w:tc>
-      </w:tr>
-      <w:tr>
-        <w:trPr>
-          <w:trHeight w:val="542"/>
-        </w:trPr>
-        <w:tc>
-          <w:tcPr>
-            <w:tcW w:w="2413" w:type="dxa"/>
-            <w:tcBorders>
-              <w:top w:val="single" w:sz="6" w:space="0" w:color="CECECE"/>
-              <w:left w:val="single" w:sz="6" w:space="0" w:color="CECECE"/>
-              <w:bottom w:val="single" w:sz="6" w:space="0" w:color="CECECE"/>
-              <w:right w:val="single" w:sz="6" w:space="0" w:color="CECECE"/>
-            </w:tcBorders>
-            <w:vAlign w:val="center"/>
-          </w:tcPr>
-          <w:p>
-            <w:pPr>
-              <w:spacing w:after="0"/>
-              <w:ind w:left="156"/>
-            </w:pPr>
-            <w:r>
-              <w:rPr>
-                <w:b/>
-                <w:color w:val="202020"/>
-                <w:sz w:val="24"/>
-              </w:rPr>
-              <w:t>Owner/Team</w:t>
-            </w:r>
-          </w:p>
-        </w:tc>
-        <w:tc>
-          <w:tcPr>
-            <w:tcW w:w="2151" w:type="dxa"/>
-            <w:tcBorders>
-              <w:top w:val="single" w:sz="6" w:space="0" w:color="CECECE"/>
-              <w:left w:val="single" w:sz="6" w:space="0" w:color="CECECE"/>
-              <w:bottom w:val="single" w:sz="6" w:space="0" w:color="CECECE"/>
-              <w:right w:val="nil"/>
-            </w:tcBorders>
-            <w:vAlign w:val="center"/>
-          </w:tcPr>
-          <w:p>
-            <w:pPr>
-              <w:spacing w:after="0"/>
-              <w:ind w:left="158"/>
-            </w:pPr>
-            <w:r>
-              <w:rPr>
-                <w:b/>
-                <w:color w:val="202020"/>
-                <w:sz w:val="24"/>
-              </w:rPr>
-              <w:t>Description</w:t>
-            </w:r>
-          </w:p>
-        </w:tc>
-        <w:tc>
-          <w:tcPr>
-            <w:tcW w:w="6097" w:type="dxa"/>
-            <w:tcBorders>
-              <w:top w:val="single" w:sz="6" w:space="0" w:color="CECECE"/>
-              <w:left w:val="nil"/>
-              <w:bottom w:val="single" w:sz="6" w:space="0" w:color="CECECE"/>
-              <w:right w:val="single" w:sz="6" w:space="0" w:color="CECECE"/>
-            </w:tcBorders>
-          </w:tcPr>
-          <w:p/>
-        </w:tc>
-      </w:tr>
-      <w:tr>
-        <w:trPr>
-          <w:trHeight w:val="1185"/>
-        </w:trPr>
-        <w:tc>
-          <w:tcPr>
-            <w:tcW w:w="2413" w:type="dxa"/>
-            <w:tcBorders>
-              <w:top w:val="single" w:sz="6" w:space="0" w:color="CECECE"/>
-              <w:left w:val="single" w:sz="6" w:space="0" w:color="CECECE"/>
-              <w:bottom w:val="single" w:sz="6" w:space="0" w:color="CECECE"/>
-              <w:right w:val="single" w:sz="6" w:space="0" w:color="CECECE"/>
-            </w:tcBorders>
-          </w:tcPr>
-          <w:p/>
-        </w:tc>
-        <w:tc>
-          <w:tcPr>
-            <w:tcW w:w="2151" w:type="dxa"/>
-            <w:tcBorders>
-              <w:top w:val="single" w:sz="6" w:space="0" w:color="CECECE"/>
-              <w:left w:val="single" w:sz="6" w:space="0" w:color="CECECE"/>
-              <w:bottom w:val="single" w:sz="6" w:space="0" w:color="CECECE"/>
-              <w:right w:val="nil"/>
-            </w:tcBorders>
-            <w:vAlign w:val="bottom"/>
-          </w:tcPr>
-          <w:p>
-            <w:pPr>
-              <w:spacing w:after="93"/>
-              <w:ind w:left="270"/>
-            </w:pPr>
-            <w:r>
-              <w:rPr>
-                <w:color w:val="202020"/>
-                <w:sz w:val="36"/>
-              </w:rPr>
-              <w:t>•</w:t>
-            </w:r>
-            <w:r>
-              <w:rPr>
-                <w:color w:val="202020"/>
-                <w:sz w:val="24"/>
-              </w:rPr>
-              <w:t xml:space="preserve"> </w:t>
-            </w:r>
-          </w:p>
-          <w:p>
-            <w:pPr>
-              <w:spacing w:after="0"/>
-              <w:ind w:left="270"/>
-            </w:pPr>
-            <w:r>
-              <w:rPr>
-                <w:color w:val="202020"/>
-                <w:sz w:val="36"/>
-              </w:rPr>
-              <w:t>•</w:t>
-            </w:r>
-            <w:r>
-              <w:rPr>
-                <w:color w:val="202020"/>
-                <w:sz w:val="24"/>
-              </w:rPr>
-              <w:t xml:space="preserve">  </w:t>
-            </w:r>
-          </w:p>
-        </w:tc>
-        <w:tc>
-          <w:tcPr>
-            <w:tcW w:w="6097" w:type="dxa"/>
-            <w:tcBorders>
-              <w:top w:val="single" w:sz="6" w:space="0" w:color="CECECE"/>
-              <w:left w:val="nil"/>
-              <w:bottom w:val="single" w:sz="6" w:space="0" w:color="CECECE"/>
-              <w:right w:val="single" w:sz="6" w:space="0" w:color="CECECE"/>
-            </w:tcBorders>
-          </w:tcPr>
-          <w:p/>
-        </w:tc>
-      </w:tr>
-      <w:tr>
-        <w:trPr>
-          <w:trHeight w:val="1185"/>
-        </w:trPr>
-        <w:tc>
-          <w:tcPr>
-            <w:tcW w:w="2413" w:type="dxa"/>
-            <w:tcBorders>
-              <w:top w:val="single" w:sz="6" w:space="0" w:color="CECECE"/>
-              <w:left w:val="single" w:sz="6" w:space="0" w:color="CECECE"/>
-              <w:bottom w:val="single" w:sz="6" w:space="0" w:color="CECECE"/>
-              <w:right w:val="single" w:sz="6" w:space="0" w:color="CECECE"/>
-            </w:tcBorders>
-          </w:tcPr>
-          <w:p/>
-          <w:p/>
-          <w:p/>
-        </w:tc>
-        <w:tc>
-          <w:tcPr>
-            <w:tcW w:w="2151" w:type="dxa"/>
-            <w:tcBorders>
-              <w:top w:val="single" w:sz="6" w:space="0" w:color="CECECE"/>
-              <w:left w:val="single" w:sz="6" w:space="0" w:color="CECECE"/>
-              <w:bottom w:val="single" w:sz="6" w:space="0" w:color="CECECE"/>
-              <w:right w:val="nil"/>
-            </w:tcBorders>
-            <w:vAlign w:val="bottom"/>
-          </w:tcPr>
-          <w:p>
-            <w:pPr>
-              <w:spacing w:after="94"/>
-              <w:ind w:left="270"/>
-            </w:pPr>
-            <w:r>
-              <w:rPr>
-                <w:color w:val="202020"/>
-                <w:sz w:val="36"/>
-              </w:rPr>
-              <w:t>•</w:t>
-            </w:r>
-            <w:r>
-              <w:rPr>
-                <w:color w:val="202020"/>
-                <w:sz w:val="24"/>
-              </w:rPr>
-              <w:t xml:space="preserve"> </w:t>
-            </w:r>
-          </w:p>
-          <w:p>
-            <w:pPr>
-              <w:spacing w:after="0"/>
-              <w:ind w:left="270"/>
-            </w:pPr>
-            <w:r>
-              <w:rPr>
-                <w:color w:val="202020"/>
-                <w:sz w:val="36"/>
-              </w:rPr>
-              <w:t>•</w:t>
-            </w:r>
-            <w:r>
-              <w:rPr>
-                <w:color w:val="202020"/>
-                <w:sz w:val="24"/>
-              </w:rPr>
-              <w:t xml:space="preserve"> </w:t>
-            </w:r>
-          </w:p>
-        </w:tc>
-        <w:tc>
-          <w:tcPr>
-            <w:tcW w:w="6097" w:type="dxa"/>
-            <w:tcBorders>
-              <w:top w:val="single" w:sz="6" w:space="0" w:color="CECECE"/>
-              <w:left w:val="nil"/>
-              <w:bottom w:val="single" w:sz="6" w:space="0" w:color="CECECE"/>
-              <w:right w:val="single" w:sz="6" w:space="0" w:color="CECECE"/>
-            </w:tcBorders>
-          </w:tcPr>
-          <w:p/>
-        </w:tc>
-      </w:tr>
-    </w:tbl>
-    <w:p>
-      <w:pPr>
-        <w:spacing w:after="0"/>
-        <w:ind w:left="-5" w:hanging="10"/>
-        <w:rPr>
-          <w:color w:val="202020"/>
-          <w:sz w:val="24"/>
-        </w:rPr>
-      </w:pPr>
-      <w:r>
-        <w:rPr>
-          <w:color w:val="202020"/>
-          <w:sz w:val="24"/>
-        </w:rPr>
-        <w:lastRenderedPageBreak/>
-        <w:t>Porpuse Solution:</w:t>
-      </w:r>
-    </w:p>
-    <w:p>
-      <w:pPr>
-        <w:spacing w:after="0"/>
-        <w:ind w:left="-5" w:hanging="10"/>
-        <w:rPr>
-          <w:color w:val="202020"/>
-          <w:sz w:val="24"/>
-        </w:rPr>
-      </w:pPr>
-    </w:p>
-    <w:p>
-      <w:pPr>
-        <w:spacing w:after="0"/>
-        <w:ind w:left="-5" w:hanging="10"/>
-        <w:rPr>
-          <w:color w:val="202020"/>
-          <w:sz w:val="24"/>
-        </w:rPr>
-      </w:pPr>
-    </w:p>
-    <w:p>
-      <w:pPr>
-        <w:spacing w:after="0"/>
-        <w:ind w:left="-5" w:hanging="10"/>
-        <w:rPr>
-          <w:color w:val="202020"/>
-          <w:sz w:val="24"/>
-        </w:rPr>
-      </w:pPr>
-    </w:p>
-    <w:p>
-      <w:pPr>
-        <w:spacing w:after="0"/>
-        <w:ind w:left="-5" w:hanging="10"/>
-      </w:pPr>
-      <w:r>
-        <w:rPr>
-          <w:color w:val="202020"/>
-          <w:sz w:val="24"/>
-        </w:rPr>
-        <w:t>Deliverables:</w:t>
       </w:r>
     </w:p>
     <w:tbl>
@@ -2259,6 +2529,7 @@
               <w:spacing w:after="0"/>
               <w:ind w:left="151"/>
             </w:pPr>
+            <w:proofErr w:type="spellStart"/>
             <w:r>
               <w:rPr>
                 <w:b/>
@@ -2267,6 +2538,7 @@
               </w:rPr>
               <w:t>Document</w:t>
             </w:r>
+            <w:proofErr w:type="spellEnd"/>
           </w:p>
         </w:tc>
       </w:tr>
@@ -2323,6 +2595,7 @@
               <w:spacing w:after="0"/>
               <w:ind w:left="2"/>
             </w:pPr>
+            <w:proofErr w:type="spellStart"/>
             <w:r>
               <w:rPr>
                 <w:b/>
@@ -2331,6 +2604,7 @@
               </w:rPr>
               <w:t>Event</w:t>
             </w:r>
+            <w:proofErr w:type="spellEnd"/>
           </w:p>
         </w:tc>
         <w:tc>
@@ -2376,8 +2650,14 @@
           <w:p>
             <w:pPr>
               <w:spacing w:after="0"/>
-              <w:ind w:left="422"/>
-            </w:pPr>
+            </w:pPr>
+            <w:r>
+              <w:rPr>
+                <w:color w:val="202020"/>
+                <w:sz w:val="36"/>
+              </w:rPr>
+              <w:t>•</w:t>
+            </w:r>
             <w:r>
               <w:rPr>
                 <w:color w:val="202020"/>
@@ -2436,14 +2716,7 @@
                 <w:color w:val="202020"/>
                 <w:sz w:val="36"/>
               </w:rPr>
-              <w:t>••</w:t>
-            </w:r>
-            <w:r>
-              <w:rPr>
-                <w:color w:val="202020"/>
-                <w:sz w:val="24"/>
-              </w:rPr>
-              <w:t xml:space="preserve"> </w:t>
+              <w:t>•</w:t>
             </w:r>
           </w:p>
           <w:p>
@@ -2502,6 +2775,7 @@
               <w:spacing w:after="0"/>
               <w:ind w:left="2317"/>
             </w:pPr>
+            <w:proofErr w:type="spellStart"/>
             <w:r>
               <w:rPr>
                 <w:b/>
@@ -2510,6 +2784,7 @@
               </w:rPr>
               <w:t>Document</w:t>
             </w:r>
+            <w:proofErr w:type="spellEnd"/>
             <w:r>
               <w:rPr>
                 <w:b/>
@@ -2575,6 +2850,7 @@
               <w:spacing w:after="0"/>
               <w:ind w:left="2"/>
             </w:pPr>
+            <w:proofErr w:type="spellStart"/>
             <w:r>
               <w:rPr>
                 <w:b/>
@@ -2583,6 +2859,7 @@
               </w:rPr>
               <w:t>Event</w:t>
             </w:r>
+            <w:proofErr w:type="spellEnd"/>
           </w:p>
         </w:tc>
       </w:tr>
@@ -2711,6 +2988,7 @@
               <w:spacing w:after="0"/>
               <w:ind w:left="2317"/>
             </w:pPr>
+            <w:proofErr w:type="spellStart"/>
             <w:r>
               <w:rPr>
                 <w:b/>
@@ -2719,6 +2997,7 @@
               </w:rPr>
               <w:t>Document</w:t>
             </w:r>
+            <w:proofErr w:type="spellEnd"/>
           </w:p>
         </w:tc>
       </w:tr>
@@ -2776,6 +3055,7 @@
               <w:spacing w:after="0"/>
               <w:ind w:left="2"/>
             </w:pPr>
+            <w:proofErr w:type="spellStart"/>
             <w:r>
               <w:rPr>
                 <w:b/>
@@ -2784,6 +3064,7 @@
               </w:rPr>
               <w:t>Event</w:t>
             </w:r>
+            <w:proofErr w:type="spellEnd"/>
           </w:p>
         </w:tc>
       </w:tr>
@@ -2883,12 +3164,21 @@
         <w:spacing w:after="0"/>
         <w:ind w:left="-5" w:hanging="10"/>
       </w:pPr>
+      <w:proofErr w:type="spellStart"/>
       <w:r>
         <w:rPr>
           <w:color w:val="202020"/>
           <w:sz w:val="24"/>
         </w:rPr>
-        <w:t>Milestones:</w:t>
+        <w:t>Milestones</w:t>
+      </w:r>
+      <w:proofErr w:type="spellEnd"/>
+      <w:r>
+        <w:rPr>
+          <w:color w:val="202020"/>
+          <w:sz w:val="24"/>
+        </w:rPr>
+        <w:t>:</w:t>
       </w:r>
     </w:p>
     <w:tbl>
@@ -2955,6 +3245,7 @@
               <w:spacing w:after="0"/>
               <w:ind w:left="2"/>
             </w:pPr>
+            <w:proofErr w:type="spellStart"/>
             <w:r>
               <w:rPr>
                 <w:b/>
@@ -2963,6 +3254,7 @@
               </w:rPr>
               <w:t>Event</w:t>
             </w:r>
+            <w:proofErr w:type="spellEnd"/>
           </w:p>
         </w:tc>
       </w:tr>
@@ -3059,12 +3351,21 @@
         <w:spacing w:after="0"/>
         <w:ind w:left="-5" w:hanging="10"/>
       </w:pPr>
+      <w:proofErr w:type="spellStart"/>
       <w:r>
         <w:rPr>
           <w:color w:val="202020"/>
           <w:sz w:val="24"/>
         </w:rPr>
-        <w:t>Risks &amp; Issues:</w:t>
+        <w:t>Risks</w:t>
+      </w:r>
+      <w:proofErr w:type="spellEnd"/>
+      <w:r>
+        <w:rPr>
+          <w:color w:val="202020"/>
+          <w:sz w:val="24"/>
+        </w:rPr>
+        <w:t xml:space="preserve"> &amp; Issues:</w:t>
       </w:r>
     </w:p>
     <w:tbl>
@@ -3105,13 +3406,23 @@
             <w:pPr>
               <w:spacing w:after="0"/>
             </w:pPr>
+            <w:proofErr w:type="spellStart"/>
             <w:r>
               <w:rPr>
                 <w:b/>
                 <w:color w:val="202020"/>
                 <w:sz w:val="24"/>
               </w:rPr>
-              <w:t>Potential Risk</w:t>
+              <w:t>Potential</w:t>
+            </w:r>
+            <w:proofErr w:type="spellEnd"/>
+            <w:r>
+              <w:rPr>
+                <w:b/>
+                <w:color w:val="202020"/>
+                <w:sz w:val="24"/>
+              </w:rPr>
+              <w:t xml:space="preserve"> Risk</w:t>
             </w:r>
           </w:p>
         </w:tc>
@@ -3132,14 +3443,34 @@
               <w:spacing w:after="0"/>
               <w:ind w:left="2"/>
             </w:pPr>
+            <w:proofErr w:type="spellStart"/>
             <w:r>
               <w:rPr>
                 <w:b/>
                 <w:color w:val="202020"/>
                 <w:sz w:val="24"/>
               </w:rPr>
-              <w:t>Perceived Impact</w:t>
-            </w:r>
+              <w:t>Perceived</w:t>
+            </w:r>
+            <w:proofErr w:type="spellEnd"/>
+            <w:r>
+              <w:rPr>
+                <w:b/>
+                <w:color w:val="202020"/>
+                <w:sz w:val="24"/>
+              </w:rPr>
+              <w:t xml:space="preserve"> </w:t>
+            </w:r>
+            <w:proofErr w:type="spellStart"/>
+            <w:r>
+              <w:rPr>
+                <w:b/>
+                <w:color w:val="202020"/>
+                <w:sz w:val="24"/>
+              </w:rPr>
+              <w:t>Impact</w:t>
+            </w:r>
+            <w:proofErr w:type="spellEnd"/>
           </w:p>
         </w:tc>
         <w:tc>
@@ -3159,14 +3490,34 @@
               <w:spacing w:after="0"/>
               <w:ind w:left="2"/>
             </w:pPr>
+            <w:proofErr w:type="spellStart"/>
             <w:r>
               <w:rPr>
                 <w:b/>
                 <w:color w:val="202020"/>
                 <w:sz w:val="24"/>
               </w:rPr>
-              <w:t>Mitigation Strategy</w:t>
-            </w:r>
+              <w:t>Mitigation</w:t>
+            </w:r>
+            <w:proofErr w:type="spellEnd"/>
+            <w:r>
+              <w:rPr>
+                <w:b/>
+                <w:color w:val="202020"/>
+                <w:sz w:val="24"/>
+              </w:rPr>
+              <w:t xml:space="preserve"> </w:t>
+            </w:r>
+            <w:proofErr w:type="spellStart"/>
+            <w:r>
+              <w:rPr>
+                <w:b/>
+                <w:color w:val="202020"/>
+                <w:sz w:val="24"/>
+              </w:rPr>
+              <w:t>Strategy</w:t>
+            </w:r>
+            <w:proofErr w:type="spellEnd"/>
           </w:p>
         </w:tc>
       </w:tr>
@@ -3299,9 +3650,13 @@
         <w:pStyle w:val="Heading1"/>
         <w:ind w:left="-5"/>
       </w:pPr>
+      <w:proofErr w:type="spellStart"/>
       <w:r>
-        <w:lastRenderedPageBreak/>
-        <w:t>Sign-Off</w:t>
+        <w:t>Sign</w:t>
+      </w:r>
+      <w:proofErr w:type="spellEnd"/>
+      <w:r>
+        <w:t>-Off</w:t>
       </w:r>
     </w:p>
     <w:tbl>
@@ -3342,6 +3697,7 @@
             <w:pPr>
               <w:spacing w:after="0"/>
             </w:pPr>
+            <w:proofErr w:type="spellStart"/>
             <w:r>
               <w:rPr>
                 <w:b/>
@@ -3350,6 +3706,7 @@
               </w:rPr>
               <w:t>Approved</w:t>
             </w:r>
+            <w:proofErr w:type="spellEnd"/>
           </w:p>
         </w:tc>
         <w:tc>
@@ -4550,9 +4907,11 @@
         <w:r>
           <w:t xml:space="preserve">                                                                    </w:t>
         </w:r>
+        <w:proofErr w:type="spellStart"/>
         <w:r>
           <w:t>WashPedre</w:t>
         </w:r>
+        <w:proofErr w:type="spellEnd"/>
       </w:p>
     </w:sdtContent>
   </w:sdt>
@@ -4655,6 +5014,7 @@
         </wp:anchor>
       </w:drawing>
     </w:r>
+    <w:proofErr w:type="spellStart"/>
     <w:r>
       <w:rPr>
         <w:color w:val="156082" w:themeColor="accent1"/>
@@ -4662,7 +5022,17 @@
         <w:szCs w:val="28"/>
         <w:lang w:val="en-US"/>
       </w:rPr>
-      <w:t xml:space="preserve">WashPedre – Enterprise Operations Platform | </w:t>
+      <w:t>WashPedre</w:t>
+    </w:r>
+    <w:proofErr w:type="spellEnd"/>
+    <w:r>
+      <w:rPr>
+        <w:color w:val="156082" w:themeColor="accent1"/>
+        <w:sz w:val="24"/>
+        <w:szCs w:val="28"/>
+        <w:lang w:val="en-US"/>
+      </w:rPr>
+      <w:t xml:space="preserve"> – Enterprise Operations Platform | </w:t>
     </w:r>
     <w:r>
       <w:rPr>

</xml_diff>

<commit_message>
complete field business background
</commit_message>
<xml_diff>
--- a/Doc's/Program CharterV1.docx
+++ b/Doc's/Program CharterV1.docx
@@ -89,7 +89,7 @@
           </mc:Choice>
           <mc:Fallback>
             <w:pict>
-              <v:line w14:anchorId="060FE929" id="Straight Connector 9" o:spid="_x0000_s1026" style="position:absolute;z-index:251659264;visibility:visible;mso-wrap-style:square;mso-wrap-distance-left:9pt;mso-wrap-distance-top:0;mso-wrap-distance-right:9pt;mso-wrap-distance-bottom:0;mso-position-horizontal:absolute;mso-position-horizontal-relative:text;mso-position-vertical:absolute;mso-position-vertical-relative:text" from="60pt,34.8pt" to="566.4pt,34.8pt" o:gfxdata="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" strokecolor="#156082 [3204]" strokeweight="1.5pt">
+              <v:line w14:anchorId="3E5E621E" id="Straight Connector 9" o:spid="_x0000_s1026" style="position:absolute;z-index:251659264;visibility:visible;mso-wrap-style:square;mso-wrap-distance-left:9pt;mso-wrap-distance-top:0;mso-wrap-distance-right:9pt;mso-wrap-distance-bottom:0;mso-position-horizontal:absolute;mso-position-horizontal-relative:text;mso-position-vertical:absolute;mso-position-vertical-relative:text" from="60pt,34.8pt" to="566.4pt,34.8pt" o:gfxdata="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" strokecolor="#156082 [3204]" strokeweight="1.5pt">
                 <v:stroke joinstyle="miter"/>
               </v:line>
             </w:pict>
@@ -161,19 +161,9 @@
         <w:pStyle w:val="Heading1"/>
         <w:ind w:left="-5"/>
       </w:pPr>
-      <w:proofErr w:type="spellStart"/>
       <w:r>
-        <w:t>Document</w:t>
+        <w:t>Document information</w:t>
       </w:r>
-      <w:proofErr w:type="spellEnd"/>
-      <w:r>
-        <w:t xml:space="preserve"> </w:t>
-      </w:r>
-      <w:proofErr w:type="spellStart"/>
-      <w:r>
-        <w:t>information</w:t>
-      </w:r>
-      <w:proofErr w:type="spellEnd"/>
     </w:p>
     <w:tbl>
       <w:tblPr>
@@ -218,18 +208,8 @@
                 <w:color w:val="202020"/>
                 <w:sz w:val="24"/>
               </w:rPr>
-              <w:t xml:space="preserve">Project </w:t>
-            </w:r>
-            <w:proofErr w:type="spellStart"/>
-            <w:r>
-              <w:rPr>
-                <w:b/>
-                <w:color w:val="202020"/>
-                <w:sz w:val="24"/>
-              </w:rPr>
-              <w:t>name</w:t>
-            </w:r>
-            <w:proofErr w:type="spellEnd"/>
+              <w:t>Project name</w:t>
+            </w:r>
           </w:p>
         </w:tc>
         <w:tc>
@@ -251,7 +231,6 @@
                 <w:lang w:val="en-US"/>
               </w:rPr>
             </w:pPr>
-            <w:proofErr w:type="spellStart"/>
             <w:r>
               <w:rPr>
                 <w:color w:val="202020"/>
@@ -260,7 +239,6 @@
               </w:rPr>
               <w:t>WashPedre</w:t>
             </w:r>
-            <w:proofErr w:type="spellEnd"/>
             <w:r>
               <w:rPr>
                 <w:color w:val="202020"/>
@@ -292,34 +270,14 @@
             <w:pPr>
               <w:spacing w:after="0"/>
             </w:pPr>
-            <w:proofErr w:type="spellStart"/>
             <w:r>
               <w:rPr>
                 <w:b/>
                 <w:color w:val="202020"/>
                 <w:sz w:val="24"/>
               </w:rPr>
-              <w:t>Document</w:t>
-            </w:r>
-            <w:proofErr w:type="spellEnd"/>
-            <w:r>
-              <w:rPr>
-                <w:b/>
-                <w:color w:val="202020"/>
-                <w:sz w:val="24"/>
-              </w:rPr>
-              <w:t xml:space="preserve"> </w:t>
-            </w:r>
-            <w:proofErr w:type="spellStart"/>
-            <w:r>
-              <w:rPr>
-                <w:b/>
-                <w:color w:val="202020"/>
-                <w:sz w:val="24"/>
-              </w:rPr>
-              <w:t>code</w:t>
-            </w:r>
-            <w:proofErr w:type="spellEnd"/>
+              <w:t>Document code</w:t>
+            </w:r>
           </w:p>
         </w:tc>
         <w:tc>
@@ -368,7 +326,6 @@
             <w:pPr>
               <w:spacing w:after="0"/>
             </w:pPr>
-            <w:proofErr w:type="spellStart"/>
             <w:r>
               <w:rPr>
                 <w:b/>
@@ -377,7 +334,6 @@
               </w:rPr>
               <w:t>Version</w:t>
             </w:r>
-            <w:proofErr w:type="spellEnd"/>
           </w:p>
         </w:tc>
         <w:tc>
@@ -426,7 +382,6 @@
             <w:pPr>
               <w:spacing w:after="0"/>
             </w:pPr>
-            <w:proofErr w:type="gramStart"/>
             <w:r>
               <w:rPr>
                 <w:b/>
@@ -435,7 +390,6 @@
               </w:rPr>
               <w:t>Status</w:t>
             </w:r>
-            <w:proofErr w:type="gramEnd"/>
           </w:p>
         </w:tc>
         <w:tc>
@@ -600,25 +554,7 @@
           <w:color w:val="202020"/>
           <w:sz w:val="24"/>
         </w:rPr>
-        <w:t xml:space="preserve">Key </w:t>
-      </w:r>
-      <w:proofErr w:type="spellStart"/>
-      <w:r>
-        <w:rPr>
-          <w:b/>
-          <w:color w:val="202020"/>
-          <w:sz w:val="24"/>
-        </w:rPr>
-        <w:t>Stakeholders</w:t>
-      </w:r>
-      <w:proofErr w:type="spellEnd"/>
-      <w:r>
-        <w:rPr>
-          <w:b/>
-          <w:color w:val="202020"/>
-          <w:sz w:val="24"/>
-        </w:rPr>
-        <w:t>:</w:t>
+        <w:t>Key Stakeholders:</w:t>
       </w:r>
     </w:p>
     <w:tbl>
@@ -686,7 +622,6 @@
               <w:spacing w:after="0"/>
               <w:ind w:left="2"/>
             </w:pPr>
-            <w:proofErr w:type="spellStart"/>
             <w:r>
               <w:rPr>
                 <w:b/>
@@ -695,7 +630,6 @@
               </w:rPr>
               <w:t>Department</w:t>
             </w:r>
-            <w:proofErr w:type="spellEnd"/>
           </w:p>
         </w:tc>
         <w:tc>
@@ -715,41 +649,13 @@
               <w:spacing w:after="0"/>
               <w:ind w:left="2"/>
             </w:pPr>
-            <w:proofErr w:type="spellStart"/>
             <w:r>
               <w:rPr>
                 <w:b/>
                 <w:color w:val="202020"/>
                 <w:sz w:val="24"/>
               </w:rPr>
-              <w:t>Internal</w:t>
-            </w:r>
-            <w:proofErr w:type="spellEnd"/>
-            <w:r>
-              <w:rPr>
-                <w:b/>
-                <w:color w:val="202020"/>
-                <w:sz w:val="24"/>
-              </w:rPr>
-              <w:t>/</w:t>
-            </w:r>
-            <w:proofErr w:type="spellStart"/>
-            <w:r>
-              <w:rPr>
-                <w:b/>
-                <w:color w:val="202020"/>
-                <w:sz w:val="24"/>
-              </w:rPr>
-              <w:t>External</w:t>
-            </w:r>
-            <w:proofErr w:type="spellEnd"/>
-            <w:r>
-              <w:rPr>
-                <w:b/>
-                <w:color w:val="202020"/>
-                <w:sz w:val="24"/>
-              </w:rPr>
-              <w:t xml:space="preserve"> </w:t>
+              <w:t xml:space="preserve">Internal/External </w:t>
             </w:r>
           </w:p>
         </w:tc>
@@ -805,11 +711,9 @@
             </w:tcBorders>
           </w:tcPr>
           <w:p>
-            <w:proofErr w:type="spellStart"/>
             <w:r>
               <w:t>Internal</w:t>
             </w:r>
-            <w:proofErr w:type="spellEnd"/>
           </w:p>
         </w:tc>
       </w:tr>
@@ -860,11 +764,9 @@
             </w:tcBorders>
           </w:tcPr>
           <w:p>
-            <w:proofErr w:type="spellStart"/>
             <w:r>
               <w:t>Internal</w:t>
             </w:r>
-            <w:proofErr w:type="spellEnd"/>
           </w:p>
         </w:tc>
       </w:tr>
@@ -915,11 +817,9 @@
             </w:tcBorders>
           </w:tcPr>
           <w:p>
-            <w:proofErr w:type="spellStart"/>
             <w:r>
               <w:t>Internal</w:t>
             </w:r>
-            <w:proofErr w:type="spellEnd"/>
           </w:p>
         </w:tc>
       </w:tr>
@@ -929,21 +829,12 @@
         <w:spacing w:after="0"/>
         <w:ind w:left="-5" w:hanging="10"/>
       </w:pPr>
-      <w:proofErr w:type="spellStart"/>
       <w:r>
         <w:rPr>
           <w:color w:val="202020"/>
           <w:sz w:val="24"/>
         </w:rPr>
-        <w:t>Resources</w:t>
-      </w:r>
-      <w:proofErr w:type="spellEnd"/>
-      <w:r>
-        <w:rPr>
-          <w:color w:val="202020"/>
-          <w:sz w:val="24"/>
-        </w:rPr>
-        <w:t>:</w:t>
+        <w:t>Resources:</w:t>
       </w:r>
     </w:p>
     <w:tbl>
@@ -982,34 +873,14 @@
             <w:pPr>
               <w:spacing w:after="0"/>
             </w:pPr>
-            <w:proofErr w:type="spellStart"/>
             <w:r>
               <w:rPr>
                 <w:b/>
                 <w:color w:val="202020"/>
                 <w:sz w:val="24"/>
               </w:rPr>
-              <w:t>Tecnology</w:t>
-            </w:r>
-            <w:proofErr w:type="spellEnd"/>
-            <w:r>
-              <w:rPr>
-                <w:b/>
-                <w:color w:val="202020"/>
-                <w:sz w:val="24"/>
-              </w:rPr>
-              <w:t xml:space="preserve"> </w:t>
-            </w:r>
-            <w:proofErr w:type="spellStart"/>
-            <w:r>
-              <w:rPr>
-                <w:b/>
-                <w:color w:val="202020"/>
-                <w:sz w:val="24"/>
-              </w:rPr>
-              <w:t>stack</w:t>
-            </w:r>
-            <w:proofErr w:type="spellEnd"/>
+              <w:t>Tecnology stack</w:t>
+            </w:r>
           </w:p>
         </w:tc>
       </w:tr>
@@ -1051,7 +922,6 @@
               </w:rPr>
               <w:t xml:space="preserve"> </w:t>
             </w:r>
-            <w:proofErr w:type="spellStart"/>
             <w:r>
               <w:rPr>
                 <w:color w:val="202020"/>
@@ -1059,7 +929,6 @@
               </w:rPr>
               <w:t>React</w:t>
             </w:r>
-            <w:proofErr w:type="spellEnd"/>
           </w:p>
           <w:p>
             <w:pPr>
@@ -1272,43 +1141,33 @@
         <w:pStyle w:val="Heading1"/>
         <w:ind w:left="-5"/>
       </w:pPr>
-      <w:proofErr w:type="spellStart"/>
       <w:r>
         <w:rPr>
           <w:b/>
         </w:rPr>
         <w:lastRenderedPageBreak/>
-        <w:t>Program</w:t>
+        <w:t>Pro</w:t>
       </w:r>
-      <w:proofErr w:type="spellEnd"/>
       <w:r>
-        <w:t xml:space="preserve"> </w:t>
+        <w:rPr>
+          <w:b/>
+        </w:rPr>
+        <w:t>ject</w:t>
       </w:r>
-      <w:proofErr w:type="spellStart"/>
       <w:r>
-        <w:t>Overview</w:t>
+        <w:t xml:space="preserve"> Overview</w:t>
       </w:r>
-      <w:proofErr w:type="spellEnd"/>
     </w:p>
     <w:p>
       <w:pPr>
         <w:spacing w:after="435" w:line="295" w:lineRule="auto"/>
       </w:pPr>
-      <w:proofErr w:type="spellStart"/>
       <w:r>
         <w:rPr>
           <w:color w:val="202020"/>
           <w:sz w:val="24"/>
         </w:rPr>
-        <w:t>WashPedre</w:t>
-      </w:r>
-      <w:proofErr w:type="spellEnd"/>
-      <w:r>
-        <w:rPr>
-          <w:color w:val="202020"/>
-          <w:sz w:val="24"/>
-        </w:rPr>
-        <w:t xml:space="preserve"> es una Plataforma web o</w:t>
+        <w:t>WashPedre es una Plataforma web o</w:t>
       </w:r>
       <w:r>
         <w:rPr>
@@ -1327,6 +1186,7 @@
           <w:bCs/>
           <w:color w:val="202020"/>
           <w:sz w:val="24"/>
+          <w:lang w:val="en-US"/>
         </w:rPr>
       </w:pPr>
       <w:r>
@@ -1335,26 +1195,17 @@
           <w:bCs/>
           <w:color w:val="202020"/>
           <w:sz w:val="24"/>
+          <w:lang w:val="en-US"/>
         </w:rPr>
-        <w:t xml:space="preserve">Business </w:t>
+        <w:t>Business Background</w:t>
       </w:r>
-      <w:proofErr w:type="spellStart"/>
       <w:r>
         <w:rPr>
           <w:b/>
           <w:bCs/>
           <w:color w:val="202020"/>
           <w:sz w:val="24"/>
-        </w:rPr>
-        <w:t>Background</w:t>
-      </w:r>
-      <w:proofErr w:type="spellEnd"/>
-      <w:r>
-        <w:rPr>
-          <w:b/>
-          <w:bCs/>
-          <w:color w:val="202020"/>
-          <w:sz w:val="24"/>
+          <w:lang w:val="en-US"/>
         </w:rPr>
         <w:t>:</w:t>
       </w:r>
@@ -1368,6 +1219,20 @@
           <w:sz w:val="24"/>
         </w:rPr>
       </w:pPr>
+      <w:r>
+        <w:rPr>
+          <w:color w:val="202020"/>
+          <w:sz w:val="24"/>
+        </w:rPr>
+        <w:t>Actualmente este proceso de r</w:t>
+      </w:r>
+      <w:r>
+        <w:rPr>
+          <w:color w:val="202020"/>
+          <w:sz w:val="24"/>
+        </w:rPr>
+        <w:t>ealiza de forma manual. El supervisor envia la información via whatsapp a la encargada del área de desarrollo. Luego ella digita la data en una hoja de cálculo Excel, realiza el análisis de datos, procede a generar KPIs y finalmente lo comparte con gerencia. Esto ocasiona demoras, errores de digitación y baja trazabilidad y confiabilidad de los datos</w:t>
+      </w:r>
     </w:p>
     <w:p>
       <w:pPr>
@@ -1536,7 +1401,6 @@
               <w:spacing w:after="0"/>
               <w:ind w:left="2"/>
             </w:pPr>
-            <w:proofErr w:type="spellStart"/>
             <w:r>
               <w:rPr>
                 <w:b/>
@@ -1545,7 +1409,6 @@
               </w:rPr>
               <w:t>Goal</w:t>
             </w:r>
-            <w:proofErr w:type="spellEnd"/>
           </w:p>
         </w:tc>
       </w:tr>
@@ -1565,13 +1428,8 @@
           </w:tcPr>
           <w:p>
             <w:r>
-              <w:t xml:space="preserve">Digital </w:t>
-            </w:r>
-            <w:proofErr w:type="spellStart"/>
-            <w:r>
-              <w:t>register</w:t>
-            </w:r>
-            <w:proofErr w:type="spellEnd"/>
+              <w:t>Digital register</w:t>
+            </w:r>
           </w:p>
         </w:tc>
         <w:tc>
@@ -1606,13 +1464,8 @@
             </w:tcBorders>
           </w:tcPr>
           <w:p>
-            <w:proofErr w:type="spellStart"/>
-            <w:r>
-              <w:t>Whatsapp</w:t>
-            </w:r>
-            <w:proofErr w:type="spellEnd"/>
-            <w:r>
-              <w:t xml:space="preserve"> Used</w:t>
+            <w:r>
+              <w:t>Whatsapp Used</w:t>
             </w:r>
           </w:p>
         </w:tc>
@@ -1685,11 +1538,9 @@
             </w:tcBorders>
           </w:tcPr>
           <w:p>
-            <w:proofErr w:type="spellStart"/>
             <w:r>
               <w:t>Reports</w:t>
             </w:r>
-            <w:proofErr w:type="spellEnd"/>
           </w:p>
         </w:tc>
         <w:tc>
@@ -1720,23 +1571,7 @@
           <w:color w:val="202020"/>
           <w:sz w:val="24"/>
         </w:rPr>
-        <w:t xml:space="preserve">Scope </w:t>
-      </w:r>
-      <w:proofErr w:type="spellStart"/>
-      <w:r>
-        <w:rPr>
-          <w:color w:val="202020"/>
-          <w:sz w:val="24"/>
-        </w:rPr>
-        <w:t>of</w:t>
-      </w:r>
-      <w:proofErr w:type="spellEnd"/>
-      <w:r>
-        <w:rPr>
-          <w:color w:val="202020"/>
-          <w:sz w:val="24"/>
-        </w:rPr>
-        <w:t xml:space="preserve"> Work: </w:t>
+        <w:t xml:space="preserve">Scope of Work: </w:t>
       </w:r>
     </w:p>
     <w:tbl>
@@ -1834,7 +1669,6 @@
             <w:pPr>
               <w:spacing w:after="0"/>
             </w:pPr>
-            <w:proofErr w:type="spellStart"/>
             <w:r>
               <w:rPr>
                 <w:b/>
@@ -1843,7 +1677,6 @@
               </w:rPr>
               <w:t>Functionalit</w:t>
             </w:r>
-            <w:proofErr w:type="spellEnd"/>
           </w:p>
         </w:tc>
         <w:tc>
@@ -1862,7 +1695,6 @@
               <w:spacing w:after="0"/>
               <w:ind w:left="2"/>
             </w:pPr>
-            <w:proofErr w:type="spellStart"/>
             <w:r>
               <w:rPr>
                 <w:b/>
@@ -1871,7 +1703,6 @@
               </w:rPr>
               <w:t>Description</w:t>
             </w:r>
-            <w:proofErr w:type="spellEnd"/>
           </w:p>
         </w:tc>
         <w:tc>
@@ -2095,41 +1926,13 @@
             <w:pPr>
               <w:spacing w:after="0"/>
             </w:pPr>
-            <w:proofErr w:type="spellStart"/>
             <w:r>
               <w:rPr>
                 <w:b/>
                 <w:color w:val="202020"/>
                 <w:sz w:val="24"/>
               </w:rPr>
-              <w:t>Out</w:t>
-            </w:r>
-            <w:proofErr w:type="spellEnd"/>
-            <w:r>
-              <w:rPr>
-                <w:b/>
-                <w:color w:val="202020"/>
-                <w:sz w:val="24"/>
-              </w:rPr>
-              <w:t xml:space="preserve"> </w:t>
-            </w:r>
-            <w:proofErr w:type="spellStart"/>
-            <w:r>
-              <w:rPr>
-                <w:b/>
-                <w:color w:val="202020"/>
-                <w:sz w:val="24"/>
-              </w:rPr>
-              <w:t>of</w:t>
-            </w:r>
-            <w:proofErr w:type="spellEnd"/>
-            <w:r>
-              <w:rPr>
-                <w:b/>
-                <w:color w:val="202020"/>
-                <w:sz w:val="24"/>
-              </w:rPr>
-              <w:t xml:space="preserve"> Scope</w:t>
+              <w:t>Out of Scope</w:t>
             </w:r>
           </w:p>
         </w:tc>
@@ -2180,7 +1983,6 @@
               <w:spacing w:after="0"/>
               <w:ind w:left="158"/>
             </w:pPr>
-            <w:proofErr w:type="spellStart"/>
             <w:r>
               <w:rPr>
                 <w:b/>
@@ -2189,7 +1991,6 @@
               </w:rPr>
               <w:t>Description</w:t>
             </w:r>
-            <w:proofErr w:type="spellEnd"/>
           </w:p>
         </w:tc>
         <w:tc>
@@ -2379,37 +2180,12 @@
           <w:sz w:val="24"/>
         </w:rPr>
       </w:pPr>
-      <w:proofErr w:type="spellStart"/>
       <w:r>
         <w:rPr>
           <w:color w:val="202020"/>
           <w:sz w:val="24"/>
         </w:rPr>
-        <w:t>Porpuse</w:t>
-      </w:r>
-      <w:proofErr w:type="spellEnd"/>
-      <w:r>
-        <w:rPr>
-          <w:color w:val="202020"/>
-          <w:sz w:val="24"/>
-        </w:rPr>
-        <w:t xml:space="preserve"> </w:t>
-      </w:r>
-      <w:proofErr w:type="spellStart"/>
-      <w:r>
-        <w:rPr>
-          <w:color w:val="202020"/>
-          <w:sz w:val="24"/>
-        </w:rPr>
-        <w:t>Solution</w:t>
-      </w:r>
-      <w:proofErr w:type="spellEnd"/>
-      <w:r>
-        <w:rPr>
-          <w:color w:val="202020"/>
-          <w:sz w:val="24"/>
-        </w:rPr>
-        <w:t>:</w:t>
+        <w:t>Porpuse Solution:</w:t>
       </w:r>
     </w:p>
     <w:p>
@@ -2447,21 +2223,12 @@
         <w:spacing w:after="0"/>
         <w:ind w:left="-5" w:hanging="10"/>
       </w:pPr>
-      <w:proofErr w:type="spellStart"/>
       <w:r>
         <w:rPr>
           <w:color w:val="202020"/>
           <w:sz w:val="24"/>
         </w:rPr>
-        <w:t>Deliverables</w:t>
-      </w:r>
-      <w:proofErr w:type="spellEnd"/>
-      <w:r>
-        <w:rPr>
-          <w:color w:val="202020"/>
-          <w:sz w:val="24"/>
-        </w:rPr>
-        <w:t>:</w:t>
+        <w:t>Deliverables:</w:t>
       </w:r>
     </w:p>
     <w:tbl>
@@ -2529,7 +2296,6 @@
               <w:spacing w:after="0"/>
               <w:ind w:left="151"/>
             </w:pPr>
-            <w:proofErr w:type="spellStart"/>
             <w:r>
               <w:rPr>
                 <w:b/>
@@ -2538,7 +2304,6 @@
               </w:rPr>
               <w:t>Document</w:t>
             </w:r>
-            <w:proofErr w:type="spellEnd"/>
           </w:p>
         </w:tc>
       </w:tr>
@@ -2595,7 +2360,6 @@
               <w:spacing w:after="0"/>
               <w:ind w:left="2"/>
             </w:pPr>
-            <w:proofErr w:type="spellStart"/>
             <w:r>
               <w:rPr>
                 <w:b/>
@@ -2604,7 +2368,6 @@
               </w:rPr>
               <w:t>Event</w:t>
             </w:r>
-            <w:proofErr w:type="spellEnd"/>
           </w:p>
         </w:tc>
         <w:tc>
@@ -2775,7 +2538,6 @@
               <w:spacing w:after="0"/>
               <w:ind w:left="2317"/>
             </w:pPr>
-            <w:proofErr w:type="spellStart"/>
             <w:r>
               <w:rPr>
                 <w:b/>
@@ -2784,7 +2546,6 @@
               </w:rPr>
               <w:t>Document</w:t>
             </w:r>
-            <w:proofErr w:type="spellEnd"/>
             <w:r>
               <w:rPr>
                 <w:b/>
@@ -2850,7 +2611,6 @@
               <w:spacing w:after="0"/>
               <w:ind w:left="2"/>
             </w:pPr>
-            <w:proofErr w:type="spellStart"/>
             <w:r>
               <w:rPr>
                 <w:b/>
@@ -2859,7 +2619,6 @@
               </w:rPr>
               <w:t>Event</w:t>
             </w:r>
-            <w:proofErr w:type="spellEnd"/>
           </w:p>
         </w:tc>
       </w:tr>
@@ -2988,7 +2747,6 @@
               <w:spacing w:after="0"/>
               <w:ind w:left="2317"/>
             </w:pPr>
-            <w:proofErr w:type="spellStart"/>
             <w:r>
               <w:rPr>
                 <w:b/>
@@ -2997,7 +2755,6 @@
               </w:rPr>
               <w:t>Document</w:t>
             </w:r>
-            <w:proofErr w:type="spellEnd"/>
           </w:p>
         </w:tc>
       </w:tr>
@@ -3055,7 +2812,6 @@
               <w:spacing w:after="0"/>
               <w:ind w:left="2"/>
             </w:pPr>
-            <w:proofErr w:type="spellStart"/>
             <w:r>
               <w:rPr>
                 <w:b/>
@@ -3064,7 +2820,6 @@
               </w:rPr>
               <w:t>Event</w:t>
             </w:r>
-            <w:proofErr w:type="spellEnd"/>
           </w:p>
         </w:tc>
       </w:tr>
@@ -3164,21 +2919,12 @@
         <w:spacing w:after="0"/>
         <w:ind w:left="-5" w:hanging="10"/>
       </w:pPr>
-      <w:proofErr w:type="spellStart"/>
       <w:r>
         <w:rPr>
           <w:color w:val="202020"/>
           <w:sz w:val="24"/>
         </w:rPr>
-        <w:t>Milestones</w:t>
-      </w:r>
-      <w:proofErr w:type="spellEnd"/>
-      <w:r>
-        <w:rPr>
-          <w:color w:val="202020"/>
-          <w:sz w:val="24"/>
-        </w:rPr>
-        <w:t>:</w:t>
+        <w:t>Milestones:</w:t>
       </w:r>
     </w:p>
     <w:tbl>
@@ -3245,7 +2991,6 @@
               <w:spacing w:after="0"/>
               <w:ind w:left="2"/>
             </w:pPr>
-            <w:proofErr w:type="spellStart"/>
             <w:r>
               <w:rPr>
                 <w:b/>
@@ -3254,7 +2999,6 @@
               </w:rPr>
               <w:t>Event</w:t>
             </w:r>
-            <w:proofErr w:type="spellEnd"/>
           </w:p>
         </w:tc>
       </w:tr>
@@ -3351,21 +3095,12 @@
         <w:spacing w:after="0"/>
         <w:ind w:left="-5" w:hanging="10"/>
       </w:pPr>
-      <w:proofErr w:type="spellStart"/>
       <w:r>
         <w:rPr>
           <w:color w:val="202020"/>
           <w:sz w:val="24"/>
         </w:rPr>
-        <w:t>Risks</w:t>
-      </w:r>
-      <w:proofErr w:type="spellEnd"/>
-      <w:r>
-        <w:rPr>
-          <w:color w:val="202020"/>
-          <w:sz w:val="24"/>
-        </w:rPr>
-        <w:t xml:space="preserve"> &amp; Issues:</w:t>
+        <w:t>Risks &amp; Issues:</w:t>
       </w:r>
     </w:p>
     <w:tbl>
@@ -3406,23 +3141,13 @@
             <w:pPr>
               <w:spacing w:after="0"/>
             </w:pPr>
-            <w:proofErr w:type="spellStart"/>
             <w:r>
               <w:rPr>
                 <w:b/>
                 <w:color w:val="202020"/>
                 <w:sz w:val="24"/>
               </w:rPr>
-              <w:t>Potential</w:t>
-            </w:r>
-            <w:proofErr w:type="spellEnd"/>
-            <w:r>
-              <w:rPr>
-                <w:b/>
-                <w:color w:val="202020"/>
-                <w:sz w:val="24"/>
-              </w:rPr>
-              <w:t xml:space="preserve"> Risk</w:t>
+              <w:t>Potential Risk</w:t>
             </w:r>
           </w:p>
         </w:tc>
@@ -3443,34 +3168,14 @@
               <w:spacing w:after="0"/>
               <w:ind w:left="2"/>
             </w:pPr>
-            <w:proofErr w:type="spellStart"/>
             <w:r>
               <w:rPr>
                 <w:b/>
                 <w:color w:val="202020"/>
                 <w:sz w:val="24"/>
               </w:rPr>
-              <w:t>Perceived</w:t>
-            </w:r>
-            <w:proofErr w:type="spellEnd"/>
-            <w:r>
-              <w:rPr>
-                <w:b/>
-                <w:color w:val="202020"/>
-                <w:sz w:val="24"/>
-              </w:rPr>
-              <w:t xml:space="preserve"> </w:t>
-            </w:r>
-            <w:proofErr w:type="spellStart"/>
-            <w:r>
-              <w:rPr>
-                <w:b/>
-                <w:color w:val="202020"/>
-                <w:sz w:val="24"/>
-              </w:rPr>
-              <w:t>Impact</w:t>
-            </w:r>
-            <w:proofErr w:type="spellEnd"/>
+              <w:t>Perceived Impact</w:t>
+            </w:r>
           </w:p>
         </w:tc>
         <w:tc>
@@ -3490,34 +3195,14 @@
               <w:spacing w:after="0"/>
               <w:ind w:left="2"/>
             </w:pPr>
-            <w:proofErr w:type="spellStart"/>
             <w:r>
               <w:rPr>
                 <w:b/>
                 <w:color w:val="202020"/>
                 <w:sz w:val="24"/>
               </w:rPr>
-              <w:t>Mitigation</w:t>
-            </w:r>
-            <w:proofErr w:type="spellEnd"/>
-            <w:r>
-              <w:rPr>
-                <w:b/>
-                <w:color w:val="202020"/>
-                <w:sz w:val="24"/>
-              </w:rPr>
-              <w:t xml:space="preserve"> </w:t>
-            </w:r>
-            <w:proofErr w:type="spellStart"/>
-            <w:r>
-              <w:rPr>
-                <w:b/>
-                <w:color w:val="202020"/>
-                <w:sz w:val="24"/>
-              </w:rPr>
-              <w:t>Strategy</w:t>
-            </w:r>
-            <w:proofErr w:type="spellEnd"/>
+              <w:t>Mitigation Strategy</w:t>
+            </w:r>
           </w:p>
         </w:tc>
       </w:tr>
@@ -3650,13 +3335,8 @@
         <w:pStyle w:val="Heading1"/>
         <w:ind w:left="-5"/>
       </w:pPr>
-      <w:proofErr w:type="spellStart"/>
       <w:r>
-        <w:t>Sign</w:t>
-      </w:r>
-      <w:proofErr w:type="spellEnd"/>
-      <w:r>
-        <w:t>-Off</w:t>
+        <w:t>Sign-Off</w:t>
       </w:r>
     </w:p>
     <w:tbl>
@@ -3697,7 +3377,6 @@
             <w:pPr>
               <w:spacing w:after="0"/>
             </w:pPr>
-            <w:proofErr w:type="spellStart"/>
             <w:r>
               <w:rPr>
                 <w:b/>
@@ -3706,7 +3385,6 @@
               </w:rPr>
               <w:t>Approved</w:t>
             </w:r>
-            <w:proofErr w:type="spellEnd"/>
           </w:p>
         </w:tc>
         <w:tc>
@@ -4907,11 +4585,9 @@
         <w:r>
           <w:t xml:space="preserve">                                                                    </w:t>
         </w:r>
-        <w:proofErr w:type="spellStart"/>
         <w:r>
           <w:t>WashPedre</w:t>
         </w:r>
-        <w:proofErr w:type="spellEnd"/>
       </w:p>
     </w:sdtContent>
   </w:sdt>
@@ -5014,7 +4690,6 @@
         </wp:anchor>
       </w:drawing>
     </w:r>
-    <w:proofErr w:type="spellStart"/>
     <w:r>
       <w:rPr>
         <w:color w:val="156082" w:themeColor="accent1"/>
@@ -5022,17 +4697,7 @@
         <w:szCs w:val="28"/>
         <w:lang w:val="en-US"/>
       </w:rPr>
-      <w:t>WashPedre</w:t>
-    </w:r>
-    <w:proofErr w:type="spellEnd"/>
-    <w:r>
-      <w:rPr>
-        <w:color w:val="156082" w:themeColor="accent1"/>
-        <w:sz w:val="24"/>
-        <w:szCs w:val="28"/>
-        <w:lang w:val="en-US"/>
-      </w:rPr>
-      <w:t xml:space="preserve"> – Enterprise Operations Platform | </w:t>
+      <w:t xml:space="preserve">WashPedre – Enterprise Operations Platform | </w:t>
     </w:r>
     <w:r>
       <w:rPr>

</xml_diff>

<commit_message>
complete field business problem
</commit_message>
<xml_diff>
--- a/Doc's/Program CharterV1.docx
+++ b/Doc's/Program CharterV1.docx
@@ -89,7 +89,7 @@
           </mc:Choice>
           <mc:Fallback>
             <w:pict>
-              <v:line w14:anchorId="3E5E621E" id="Straight Connector 9" o:spid="_x0000_s1026" style="position:absolute;z-index:251659264;visibility:visible;mso-wrap-style:square;mso-wrap-distance-left:9pt;mso-wrap-distance-top:0;mso-wrap-distance-right:9pt;mso-wrap-distance-bottom:0;mso-position-horizontal:absolute;mso-position-horizontal-relative:text;mso-position-vertical:absolute;mso-position-vertical-relative:text" from="60pt,34.8pt" to="566.4pt,34.8pt" o:gfxdata="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" strokecolor="#156082 [3204]" strokeweight="1.5pt">
+              <v:line w14:anchorId="14B0817E" id="Straight Connector 9" o:spid="_x0000_s1026" style="position:absolute;z-index:251659264;visibility:visible;mso-wrap-style:square;mso-wrap-distance-left:9pt;mso-wrap-distance-top:0;mso-wrap-distance-right:9pt;mso-wrap-distance-bottom:0;mso-position-horizontal:absolute;mso-position-horizontal-relative:text;mso-position-vertical:absolute;mso-position-vertical-relative:text" from="60pt,34.8pt" to="566.4pt,34.8pt" o:gfxdata="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" strokecolor="#156082 [3204]" strokeweight="1.5pt">
                 <v:stroke joinstyle="miter"/>
               </v:line>
             </w:pict>
@@ -199,33 +199,29 @@
             <w:vAlign w:val="center"/>
           </w:tcPr>
           <w:p>
+            <w:r>
+              <w:rPr>
+                <w:b/>
+                <w:color w:val="202020"/>
+                <w:sz w:val="24"/>
+              </w:rPr>
+              <w:t>Project name</w:t>
+            </w:r>
+          </w:p>
+        </w:tc>
+        <w:tc>
+          <w:tcPr>
+            <w:tcW w:w="7157" w:type="dxa"/>
+            <w:tcBorders>
+              <w:top w:val="single" w:sz="6" w:space="0" w:color="CECECE"/>
+              <w:left w:val="single" w:sz="6" w:space="0" w:color="CECECE"/>
+              <w:bottom w:val="single" w:sz="6" w:space="0" w:color="CECECE"/>
+              <w:right w:val="single" w:sz="6" w:space="0" w:color="CECECE"/>
+            </w:tcBorders>
+            <w:vAlign w:val="center"/>
+          </w:tcPr>
+          <w:p>
             <w:pPr>
-              <w:spacing w:after="0"/>
-            </w:pPr>
-            <w:r>
-              <w:rPr>
-                <w:b/>
-                <w:color w:val="202020"/>
-                <w:sz w:val="24"/>
-              </w:rPr>
-              <w:t>Project name</w:t>
-            </w:r>
-          </w:p>
-        </w:tc>
-        <w:tc>
-          <w:tcPr>
-            <w:tcW w:w="7157" w:type="dxa"/>
-            <w:tcBorders>
-              <w:top w:val="single" w:sz="6" w:space="0" w:color="CECECE"/>
-              <w:left w:val="single" w:sz="6" w:space="0" w:color="CECECE"/>
-              <w:bottom w:val="single" w:sz="6" w:space="0" w:color="CECECE"/>
-              <w:right w:val="single" w:sz="6" w:space="0" w:color="CECECE"/>
-            </w:tcBorders>
-            <w:vAlign w:val="center"/>
-          </w:tcPr>
-          <w:p>
-            <w:pPr>
-              <w:spacing w:after="0"/>
               <w:ind w:left="4"/>
               <w:rPr>
                 <w:lang w:val="en-US"/>
@@ -267,33 +263,29 @@
             <w:vAlign w:val="center"/>
           </w:tcPr>
           <w:p>
+            <w:r>
+              <w:rPr>
+                <w:b/>
+                <w:color w:val="202020"/>
+                <w:sz w:val="24"/>
+              </w:rPr>
+              <w:t>Document code</w:t>
+            </w:r>
+          </w:p>
+        </w:tc>
+        <w:tc>
+          <w:tcPr>
+            <w:tcW w:w="7157" w:type="dxa"/>
+            <w:tcBorders>
+              <w:top w:val="single" w:sz="6" w:space="0" w:color="CECECE"/>
+              <w:left w:val="single" w:sz="6" w:space="0" w:color="CECECE"/>
+              <w:bottom w:val="single" w:sz="6" w:space="0" w:color="CECECE"/>
+              <w:right w:val="single" w:sz="6" w:space="0" w:color="CECECE"/>
+            </w:tcBorders>
+            <w:vAlign w:val="center"/>
+          </w:tcPr>
+          <w:p>
             <w:pPr>
-              <w:spacing w:after="0"/>
-            </w:pPr>
-            <w:r>
-              <w:rPr>
-                <w:b/>
-                <w:color w:val="202020"/>
-                <w:sz w:val="24"/>
-              </w:rPr>
-              <w:t>Document code</w:t>
-            </w:r>
-          </w:p>
-        </w:tc>
-        <w:tc>
-          <w:tcPr>
-            <w:tcW w:w="7157" w:type="dxa"/>
-            <w:tcBorders>
-              <w:top w:val="single" w:sz="6" w:space="0" w:color="CECECE"/>
-              <w:left w:val="single" w:sz="6" w:space="0" w:color="CECECE"/>
-              <w:bottom w:val="single" w:sz="6" w:space="0" w:color="CECECE"/>
-              <w:right w:val="single" w:sz="6" w:space="0" w:color="CECECE"/>
-            </w:tcBorders>
-            <w:vAlign w:val="center"/>
-          </w:tcPr>
-          <w:p>
-            <w:pPr>
-              <w:spacing w:after="0"/>
               <w:ind w:left="4"/>
             </w:pPr>
             <w:r>
@@ -323,33 +315,29 @@
             <w:vAlign w:val="center"/>
           </w:tcPr>
           <w:p>
+            <w:r>
+              <w:rPr>
+                <w:b/>
+                <w:color w:val="202020"/>
+                <w:sz w:val="24"/>
+              </w:rPr>
+              <w:t>Version</w:t>
+            </w:r>
+          </w:p>
+        </w:tc>
+        <w:tc>
+          <w:tcPr>
+            <w:tcW w:w="7157" w:type="dxa"/>
+            <w:tcBorders>
+              <w:top w:val="single" w:sz="6" w:space="0" w:color="CECECE"/>
+              <w:left w:val="single" w:sz="6" w:space="0" w:color="CECECE"/>
+              <w:bottom w:val="single" w:sz="6" w:space="0" w:color="CECECE"/>
+              <w:right w:val="single" w:sz="6" w:space="0" w:color="CECECE"/>
+            </w:tcBorders>
+            <w:vAlign w:val="center"/>
+          </w:tcPr>
+          <w:p>
             <w:pPr>
-              <w:spacing w:after="0"/>
-            </w:pPr>
-            <w:r>
-              <w:rPr>
-                <w:b/>
-                <w:color w:val="202020"/>
-                <w:sz w:val="24"/>
-              </w:rPr>
-              <w:t>Version</w:t>
-            </w:r>
-          </w:p>
-        </w:tc>
-        <w:tc>
-          <w:tcPr>
-            <w:tcW w:w="7157" w:type="dxa"/>
-            <w:tcBorders>
-              <w:top w:val="single" w:sz="6" w:space="0" w:color="CECECE"/>
-              <w:left w:val="single" w:sz="6" w:space="0" w:color="CECECE"/>
-              <w:bottom w:val="single" w:sz="6" w:space="0" w:color="CECECE"/>
-              <w:right w:val="single" w:sz="6" w:space="0" w:color="CECECE"/>
-            </w:tcBorders>
-            <w:vAlign w:val="center"/>
-          </w:tcPr>
-          <w:p>
-            <w:pPr>
-              <w:spacing w:after="0"/>
               <w:ind w:left="4"/>
             </w:pPr>
             <w:r>
@@ -379,33 +367,29 @@
             <w:vAlign w:val="center"/>
           </w:tcPr>
           <w:p>
+            <w:r>
+              <w:rPr>
+                <w:b/>
+                <w:color w:val="202020"/>
+                <w:sz w:val="24"/>
+              </w:rPr>
+              <w:t>Status</w:t>
+            </w:r>
+          </w:p>
+        </w:tc>
+        <w:tc>
+          <w:tcPr>
+            <w:tcW w:w="7157" w:type="dxa"/>
+            <w:tcBorders>
+              <w:top w:val="single" w:sz="6" w:space="0" w:color="CECECE"/>
+              <w:left w:val="single" w:sz="6" w:space="0" w:color="CECECE"/>
+              <w:bottom w:val="single" w:sz="6" w:space="0" w:color="CECECE"/>
+              <w:right w:val="single" w:sz="6" w:space="0" w:color="CECECE"/>
+            </w:tcBorders>
+            <w:vAlign w:val="center"/>
+          </w:tcPr>
+          <w:p>
             <w:pPr>
-              <w:spacing w:after="0"/>
-            </w:pPr>
-            <w:r>
-              <w:rPr>
-                <w:b/>
-                <w:color w:val="202020"/>
-                <w:sz w:val="24"/>
-              </w:rPr>
-              <w:t>Status</w:t>
-            </w:r>
-          </w:p>
-        </w:tc>
-        <w:tc>
-          <w:tcPr>
-            <w:tcW w:w="7157" w:type="dxa"/>
-            <w:tcBorders>
-              <w:top w:val="single" w:sz="6" w:space="0" w:color="CECECE"/>
-              <w:left w:val="single" w:sz="6" w:space="0" w:color="CECECE"/>
-              <w:bottom w:val="single" w:sz="6" w:space="0" w:color="CECECE"/>
-              <w:right w:val="single" w:sz="6" w:space="0" w:color="CECECE"/>
-            </w:tcBorders>
-            <w:vAlign w:val="center"/>
-          </w:tcPr>
-          <w:p>
-            <w:pPr>
-              <w:spacing w:after="0"/>
               <w:ind w:left="4"/>
             </w:pPr>
             <w:r>
@@ -430,9 +414,6 @@
             <w:shd w:val="clear" w:color="auto" w:fill="D9DAFF"/>
           </w:tcPr>
           <w:p>
-            <w:pPr>
-              <w:spacing w:after="0"/>
-            </w:pPr>
             <w:r>
               <w:rPr>
                 <w:b/>
@@ -471,7 +452,6 @@
           </w:p>
           <w:p>
             <w:pPr>
-              <w:spacing w:after="0"/>
               <w:ind w:left="4"/>
               <w:rPr>
                 <w:lang w:val="en-US"/>
@@ -497,7 +477,6 @@
           </w:tcPr>
           <w:p>
             <w:pPr>
-              <w:spacing w:after="0"/>
               <w:rPr>
                 <w:b/>
                 <w:color w:val="202020"/>
@@ -592,9 +571,6 @@
             <w:vAlign w:val="center"/>
           </w:tcPr>
           <w:p>
-            <w:pPr>
-              <w:spacing w:after="0"/>
-            </w:pPr>
             <w:r>
               <w:rPr>
                 <w:b/>
@@ -619,7 +595,6 @@
           </w:tcPr>
           <w:p>
             <w:pPr>
-              <w:spacing w:after="0"/>
               <w:ind w:left="2"/>
             </w:pPr>
             <w:r>
@@ -646,7 +621,6 @@
           </w:tcPr>
           <w:p>
             <w:pPr>
-              <w:spacing w:after="0"/>
               <w:ind w:left="2"/>
             </w:pPr>
             <w:r>
@@ -676,9 +650,6 @@
             <w:vAlign w:val="center"/>
           </w:tcPr>
           <w:p>
-            <w:pPr>
-              <w:spacing w:after="0"/>
-            </w:pPr>
             <w:r>
               <w:t>Jefatura</w:t>
             </w:r>
@@ -870,9 +841,6 @@
             <w:vAlign w:val="center"/>
           </w:tcPr>
           <w:p>
-            <w:pPr>
-              <w:spacing w:after="0"/>
-            </w:pPr>
             <w:r>
               <w:rPr>
                 <w:b/>
@@ -963,7 +931,6 @@
           </w:p>
           <w:p>
             <w:pPr>
-              <w:spacing w:after="0"/>
               <w:ind w:left="112"/>
               <w:rPr>
                 <w:color w:val="202020"/>
@@ -994,7 +961,6 @@
           </w:p>
           <w:p>
             <w:pPr>
-              <w:spacing w:after="0"/>
               <w:ind w:left="112"/>
               <w:rPr>
                 <w:color w:val="202020"/>
@@ -1029,7 +995,6 @@
           </w:p>
           <w:p>
             <w:pPr>
-              <w:spacing w:after="0"/>
               <w:ind w:left="112"/>
               <w:rPr>
                 <w:color w:val="202020"/>
@@ -1056,7 +1021,6 @@
           </w:p>
           <w:p>
             <w:pPr>
-              <w:spacing w:after="0"/>
               <w:ind w:left="112"/>
               <w:rPr>
                 <w:color w:val="202020"/>
@@ -1091,7 +1055,6 @@
           </w:p>
           <w:p>
             <w:pPr>
-              <w:spacing w:after="0"/>
               <w:ind w:left="112"/>
               <w:rPr>
                 <w:color w:val="202020"/>
@@ -1126,7 +1089,6 @@
           </w:p>
           <w:p>
             <w:pPr>
-              <w:spacing w:after="0"/>
               <w:ind w:left="112"/>
               <w:rPr>
                 <w:lang w:val="en-US"/>
@@ -1231,18 +1193,15 @@
           <w:color w:val="202020"/>
           <w:sz w:val="24"/>
         </w:rPr>
-        <w:t>ealiza de forma manual. El supervisor envia la información via whatsapp a la encargada del área de desarrollo. Luego ella digita la data en una hoja de cálculo Excel, realiza el análisis de datos, procede a generar KPIs y finalmente lo comparte con gerencia. Esto ocasiona demoras, errores de digitación y baja trazabilidad y confiabilidad de los datos</w:t>
+        <w:t>ealiza de forma manual. El supervisor envia la información via whatsapp a la encargada del área de desarrollo. Luego ella digita la data en una hoja de cálculo Excel, realiza el análisis de datos, procede a generar KPIs y finalmente lo comparte con gerencia. Esto ocasiona demoras, errores de digitación y baja trazabilidad y confiabilidad de los dato</w:t>
       </w:r>
-    </w:p>
-    <w:p>
-      <w:pPr>
-        <w:spacing w:after="0"/>
-        <w:ind w:left="-5" w:hanging="10"/>
+      <w:r>
         <w:rPr>
           <w:color w:val="202020"/>
           <w:sz w:val="24"/>
         </w:rPr>
-      </w:pPr>
+        <w:t>s.</w:t>
+      </w:r>
     </w:p>
     <w:p>
       <w:pPr>
@@ -1285,26 +1244,324 @@
         <w:t>:</w:t>
       </w:r>
     </w:p>
-    <w:p>
-      <w:pPr>
-        <w:spacing w:after="0"/>
-        <w:ind w:left="-5" w:hanging="10"/>
-        <w:rPr>
-          <w:lang w:val="en-US"/>
-        </w:rPr>
-      </w:pPr>
-    </w:p>
-    <w:p>
-      <w:pPr>
-        <w:spacing w:after="0"/>
-        <w:ind w:left="-5" w:hanging="10"/>
-        <w:rPr>
-          <w:color w:val="202020"/>
-          <w:sz w:val="24"/>
-          <w:lang w:val="en-US"/>
-        </w:rPr>
-      </w:pPr>
-    </w:p>
+    <w:tbl>
+      <w:tblPr>
+        <w:tblStyle w:val="TableGrid"/>
+        <w:tblW w:w="7393" w:type="dxa"/>
+        <w:tblInd w:w="159" w:type="dxa"/>
+        <w:tblCellMar>
+          <w:top w:w="0" w:type="dxa"/>
+          <w:left w:w="156" w:type="dxa"/>
+          <w:bottom w:w="0" w:type="dxa"/>
+          <w:right w:w="115" w:type="dxa"/>
+        </w:tblCellMar>
+        <w:tblLook w:val="04A0" w:firstRow="1" w:lastRow="0" w:firstColumn="1" w:lastColumn="0" w:noHBand="0" w:noVBand="1"/>
+      </w:tblPr>
+      <w:tblGrid>
+        <w:gridCol w:w="3508"/>
+        <w:gridCol w:w="3885"/>
+      </w:tblGrid>
+      <w:tr>
+        <w:trPr>
+          <w:trHeight w:val="536"/>
+        </w:trPr>
+        <w:tc>
+          <w:tcPr>
+            <w:tcW w:w="3508" w:type="dxa"/>
+            <w:tcBorders>
+              <w:top w:val="single" w:sz="6" w:space="0" w:color="CECECE"/>
+              <w:left w:val="single" w:sz="6" w:space="0" w:color="CECECE"/>
+              <w:bottom w:val="single" w:sz="6" w:space="0" w:color="CECECE"/>
+              <w:right w:val="single" w:sz="6" w:space="0" w:color="CECECE"/>
+            </w:tcBorders>
+            <w:shd w:val="clear" w:color="auto" w:fill="D9DAFF"/>
+            <w:vAlign w:val="center"/>
+          </w:tcPr>
+          <w:p>
+            <w:r>
+              <w:rPr>
+                <w:b/>
+                <w:color w:val="202020"/>
+                <w:sz w:val="24"/>
+              </w:rPr>
+              <w:t>Problem</w:t>
+            </w:r>
+          </w:p>
+        </w:tc>
+        <w:tc>
+          <w:tcPr>
+            <w:tcW w:w="3885" w:type="dxa"/>
+            <w:tcBorders>
+              <w:top w:val="single" w:sz="6" w:space="0" w:color="CECECE"/>
+              <w:left w:val="single" w:sz="6" w:space="0" w:color="CECECE"/>
+              <w:bottom w:val="single" w:sz="6" w:space="0" w:color="CECECE"/>
+              <w:right w:val="single" w:sz="6" w:space="0" w:color="CECECE"/>
+            </w:tcBorders>
+            <w:shd w:val="clear" w:color="auto" w:fill="D9DAFF"/>
+            <w:vAlign w:val="center"/>
+          </w:tcPr>
+          <w:p>
+            <w:pPr>
+              <w:ind w:left="2"/>
+            </w:pPr>
+            <w:r>
+              <w:rPr>
+                <w:b/>
+                <w:color w:val="202020"/>
+                <w:sz w:val="24"/>
+              </w:rPr>
+              <w:t>Impact</w:t>
+            </w:r>
+          </w:p>
+        </w:tc>
+      </w:tr>
+      <w:tr>
+        <w:trPr>
+          <w:trHeight w:val="542"/>
+        </w:trPr>
+        <w:tc>
+          <w:tcPr>
+            <w:tcW w:w="3508" w:type="dxa"/>
+            <w:tcBorders>
+              <w:top w:val="single" w:sz="6" w:space="0" w:color="CECECE"/>
+              <w:left w:val="single" w:sz="6" w:space="0" w:color="CECECE"/>
+              <w:bottom w:val="single" w:sz="6" w:space="0" w:color="CECECE"/>
+              <w:right w:val="single" w:sz="6" w:space="0" w:color="CECECE"/>
+            </w:tcBorders>
+          </w:tcPr>
+          <w:p>
+            <w:r>
+              <w:t>Distruited information</w:t>
+            </w:r>
+          </w:p>
+        </w:tc>
+        <w:tc>
+          <w:tcPr>
+            <w:tcW w:w="3885" w:type="dxa"/>
+            <w:tcBorders>
+              <w:top w:val="single" w:sz="6" w:space="0" w:color="CECECE"/>
+              <w:left w:val="single" w:sz="6" w:space="0" w:color="CECECE"/>
+              <w:bottom w:val="single" w:sz="6" w:space="0" w:color="CECECE"/>
+              <w:right w:val="single" w:sz="6" w:space="0" w:color="CECECE"/>
+            </w:tcBorders>
+          </w:tcPr>
+          <w:p>
+            <w:r>
+              <w:t>Hinders consultations</w:t>
+            </w:r>
+          </w:p>
+        </w:tc>
+      </w:tr>
+      <w:tr>
+        <w:trPr>
+          <w:trHeight w:val="540"/>
+        </w:trPr>
+        <w:tc>
+          <w:tcPr>
+            <w:tcW w:w="3508" w:type="dxa"/>
+            <w:tcBorders>
+              <w:top w:val="single" w:sz="6" w:space="0" w:color="CECECE"/>
+              <w:left w:val="single" w:sz="6" w:space="0" w:color="CECECE"/>
+              <w:bottom w:val="single" w:sz="6" w:space="0" w:color="CECECE"/>
+              <w:right w:val="single" w:sz="6" w:space="0" w:color="CECECE"/>
+            </w:tcBorders>
+          </w:tcPr>
+          <w:p>
+            <w:r>
+              <w:t>Manual reports</w:t>
+            </w:r>
+          </w:p>
+        </w:tc>
+        <w:tc>
+          <w:tcPr>
+            <w:tcW w:w="3885" w:type="dxa"/>
+            <w:tcBorders>
+              <w:top w:val="single" w:sz="6" w:space="0" w:color="CECECE"/>
+              <w:left w:val="single" w:sz="6" w:space="0" w:color="CECECE"/>
+              <w:bottom w:val="single" w:sz="6" w:space="0" w:color="CECECE"/>
+              <w:right w:val="single" w:sz="6" w:space="0" w:color="CECECE"/>
+            </w:tcBorders>
+          </w:tcPr>
+          <w:p>
+            <w:r>
+              <w:t>More time</w:t>
+            </w:r>
+          </w:p>
+        </w:tc>
+      </w:tr>
+      <w:tr>
+        <w:trPr>
+          <w:trHeight w:val="540"/>
+        </w:trPr>
+        <w:tc>
+          <w:tcPr>
+            <w:tcW w:w="3508" w:type="dxa"/>
+            <w:tcBorders>
+              <w:top w:val="single" w:sz="6" w:space="0" w:color="CECECE"/>
+              <w:left w:val="single" w:sz="6" w:space="0" w:color="CECECE"/>
+              <w:bottom w:val="single" w:sz="6" w:space="0" w:color="CECECE"/>
+              <w:right w:val="single" w:sz="6" w:space="0" w:color="CECECE"/>
+            </w:tcBorders>
+          </w:tcPr>
+          <w:p>
+            <w:r>
+              <w:t>Typing errors</w:t>
+            </w:r>
+          </w:p>
+        </w:tc>
+        <w:tc>
+          <w:tcPr>
+            <w:tcW w:w="3885" w:type="dxa"/>
+            <w:tcBorders>
+              <w:top w:val="single" w:sz="6" w:space="0" w:color="CECECE"/>
+              <w:left w:val="single" w:sz="6" w:space="0" w:color="CECECE"/>
+              <w:bottom w:val="single" w:sz="6" w:space="0" w:color="CECECE"/>
+              <w:right w:val="single" w:sz="6" w:space="0" w:color="CECECE"/>
+            </w:tcBorders>
+          </w:tcPr>
+          <w:p>
+            <w:r>
+              <w:t>Inconsistent information</w:t>
+            </w:r>
+          </w:p>
+        </w:tc>
+      </w:tr>
+      <w:tr>
+        <w:trPr>
+          <w:trHeight w:val="540"/>
+        </w:trPr>
+        <w:tc>
+          <w:tcPr>
+            <w:tcW w:w="3508" w:type="dxa"/>
+            <w:tcBorders>
+              <w:top w:val="single" w:sz="6" w:space="0" w:color="CECECE"/>
+              <w:left w:val="single" w:sz="6" w:space="0" w:color="CECECE"/>
+              <w:bottom w:val="single" w:sz="6" w:space="0" w:color="CECECE"/>
+              <w:right w:val="single" w:sz="6" w:space="0" w:color="CECECE"/>
+            </w:tcBorders>
+          </w:tcPr>
+          <w:p>
+            <w:r>
+              <w:t>Lack of traceability</w:t>
+            </w:r>
+          </w:p>
+        </w:tc>
+        <w:tc>
+          <w:tcPr>
+            <w:tcW w:w="3885" w:type="dxa"/>
+            <w:tcBorders>
+              <w:top w:val="single" w:sz="6" w:space="0" w:color="CECECE"/>
+              <w:left w:val="single" w:sz="6" w:space="0" w:color="CECECE"/>
+              <w:bottom w:val="single" w:sz="6" w:space="0" w:color="CECECE"/>
+              <w:right w:val="single" w:sz="6" w:space="0" w:color="CECECE"/>
+            </w:tcBorders>
+          </w:tcPr>
+          <w:p>
+            <w:pPr>
+              <w:rPr>
+                <w:lang w:val="en-US"/>
+              </w:rPr>
+            </w:pPr>
+            <w:r>
+              <w:rPr>
+                <w:lang w:val="en-US"/>
+              </w:rPr>
+              <w:t>Difficult to track</w:t>
+            </w:r>
+          </w:p>
+        </w:tc>
+      </w:tr>
+      <w:tr>
+        <w:trPr>
+          <w:trHeight w:val="540"/>
+        </w:trPr>
+        <w:tc>
+          <w:tcPr>
+            <w:tcW w:w="3508" w:type="dxa"/>
+            <w:tcBorders>
+              <w:top w:val="single" w:sz="6" w:space="0" w:color="CECECE"/>
+              <w:left w:val="single" w:sz="6" w:space="0" w:color="CECECE"/>
+              <w:bottom w:val="single" w:sz="6" w:space="0" w:color="CECECE"/>
+              <w:right w:val="single" w:sz="6" w:space="0" w:color="CECECE"/>
+            </w:tcBorders>
+          </w:tcPr>
+          <w:p>
+            <w:r>
+              <w:t>No KPIs</w:t>
+            </w:r>
+          </w:p>
+        </w:tc>
+        <w:tc>
+          <w:tcPr>
+            <w:tcW w:w="3885" w:type="dxa"/>
+            <w:tcBorders>
+              <w:top w:val="single" w:sz="6" w:space="0" w:color="CECECE"/>
+              <w:left w:val="single" w:sz="6" w:space="0" w:color="CECECE"/>
+              <w:bottom w:val="single" w:sz="6" w:space="0" w:color="CECECE"/>
+              <w:right w:val="single" w:sz="6" w:space="0" w:color="CECECE"/>
+            </w:tcBorders>
+          </w:tcPr>
+          <w:p>
+            <w:pPr>
+              <w:rPr>
+                <w:lang w:val="en-US"/>
+              </w:rPr>
+            </w:pPr>
+            <w:r>
+              <w:rPr>
+                <w:lang w:val="en-US"/>
+              </w:rPr>
+              <w:t>Poor visibility</w:t>
+            </w:r>
+          </w:p>
+        </w:tc>
+      </w:tr>
+      <w:tr>
+        <w:trPr>
+          <w:trHeight w:val="540"/>
+        </w:trPr>
+        <w:tc>
+          <w:tcPr>
+            <w:tcW w:w="3508" w:type="dxa"/>
+            <w:tcBorders>
+              <w:top w:val="single" w:sz="6" w:space="0" w:color="CECECE"/>
+              <w:left w:val="single" w:sz="6" w:space="0" w:color="CECECE"/>
+              <w:bottom w:val="single" w:sz="6" w:space="0" w:color="CECECE"/>
+              <w:right w:val="single" w:sz="6" w:space="0" w:color="CECECE"/>
+            </w:tcBorders>
+          </w:tcPr>
+          <w:p>
+            <w:r>
+              <w:t>Information with errors</w:t>
+            </w:r>
+          </w:p>
+        </w:tc>
+        <w:tc>
+          <w:tcPr>
+            <w:tcW w:w="3885" w:type="dxa"/>
+            <w:tcBorders>
+              <w:top w:val="single" w:sz="6" w:space="0" w:color="CECECE"/>
+              <w:left w:val="single" w:sz="6" w:space="0" w:color="CECECE"/>
+              <w:bottom w:val="single" w:sz="6" w:space="0" w:color="CECECE"/>
+              <w:right w:val="single" w:sz="6" w:space="0" w:color="CECECE"/>
+            </w:tcBorders>
+          </w:tcPr>
+          <w:p>
+            <w:pPr>
+              <w:rPr>
+                <w:lang w:val="en-US"/>
+              </w:rPr>
+            </w:pPr>
+            <w:r>
+              <w:rPr>
+                <w:lang w:val="en-US"/>
+              </w:rPr>
+              <w:t>Not Credibility</w:t>
+            </w:r>
+          </w:p>
+        </w:tc>
+      </w:tr>
+    </w:tbl>
     <w:p>
       <w:pPr>
         <w:spacing w:after="0"/>
@@ -1371,9 +1628,6 @@
             <w:vAlign w:val="center"/>
           </w:tcPr>
           <w:p>
-            <w:pPr>
-              <w:spacing w:after="0"/>
-            </w:pPr>
             <w:r>
               <w:rPr>
                 <w:b/>
@@ -1398,7 +1652,6 @@
           </w:tcPr>
           <w:p>
             <w:pPr>
-              <w:spacing w:after="0"/>
               <w:ind w:left="2"/>
             </w:pPr>
             <w:r>
@@ -1607,7 +1860,13 @@
             </w:tcBorders>
             <w:shd w:val="clear" w:color="auto" w:fill="D9DAFF"/>
           </w:tcPr>
-          <w:p/>
+          <w:p>
+            <w:pPr>
+              <w:rPr>
+                <w:color w:val="A5C9EB" w:themeColor="text2" w:themeTint="40"/>
+              </w:rPr>
+            </w:pPr>
+          </w:p>
         </w:tc>
         <w:tc>
           <w:tcPr>
@@ -1636,7 +1895,6 @@
           </w:tcPr>
           <w:p>
             <w:pPr>
-              <w:spacing w:after="0"/>
               <w:ind w:left="97"/>
             </w:pPr>
             <w:r>
@@ -1666,33 +1924,29 @@
             <w:vAlign w:val="center"/>
           </w:tcPr>
           <w:p>
+            <w:r>
+              <w:rPr>
+                <w:b/>
+                <w:color w:val="202020"/>
+                <w:sz w:val="24"/>
+              </w:rPr>
+              <w:t>Functionalit</w:t>
+            </w:r>
+          </w:p>
+        </w:tc>
+        <w:tc>
+          <w:tcPr>
+            <w:tcW w:w="2151" w:type="dxa"/>
+            <w:tcBorders>
+              <w:top w:val="single" w:sz="6" w:space="0" w:color="CECECE"/>
+              <w:left w:val="single" w:sz="6" w:space="0" w:color="CECECE"/>
+              <w:bottom w:val="single" w:sz="6" w:space="0" w:color="CECECE"/>
+              <w:right w:val="nil"/>
+            </w:tcBorders>
+            <w:vAlign w:val="center"/>
+          </w:tcPr>
+          <w:p>
             <w:pPr>
-              <w:spacing w:after="0"/>
-            </w:pPr>
-            <w:r>
-              <w:rPr>
-                <w:b/>
-                <w:color w:val="202020"/>
-                <w:sz w:val="24"/>
-              </w:rPr>
-              <w:t>Functionalit</w:t>
-            </w:r>
-          </w:p>
-        </w:tc>
-        <w:tc>
-          <w:tcPr>
-            <w:tcW w:w="2151" w:type="dxa"/>
-            <w:tcBorders>
-              <w:top w:val="single" w:sz="6" w:space="0" w:color="CECECE"/>
-              <w:left w:val="single" w:sz="6" w:space="0" w:color="CECECE"/>
-              <w:bottom w:val="single" w:sz="6" w:space="0" w:color="CECECE"/>
-              <w:right w:val="nil"/>
-            </w:tcBorders>
-            <w:vAlign w:val="center"/>
-          </w:tcPr>
-          <w:p>
-            <w:pPr>
-              <w:spacing w:after="0"/>
               <w:ind w:left="2"/>
             </w:pPr>
             <w:r>
@@ -1767,7 +2021,6 @@
           </w:p>
           <w:p>
             <w:pPr>
-              <w:spacing w:after="0"/>
               <w:ind w:left="114"/>
             </w:pPr>
             <w:r>
@@ -1848,7 +2101,6 @@
           </w:p>
           <w:p>
             <w:pPr>
-              <w:spacing w:after="0"/>
               <w:ind w:left="114"/>
             </w:pPr>
             <w:r>
@@ -1923,9 +2175,6 @@
             <w:vAlign w:val="center"/>
           </w:tcPr>
           <w:p>
-            <w:pPr>
-              <w:spacing w:after="0"/>
-            </w:pPr>
             <w:r>
               <w:rPr>
                 <w:b/>
@@ -1954,7 +2203,6 @@
           </w:tcPr>
           <w:p>
             <w:pPr>
-              <w:spacing w:after="0"/>
               <w:ind w:left="156"/>
             </w:pPr>
             <w:r>
@@ -1980,7 +2228,6 @@
           </w:tcPr>
           <w:p>
             <w:pPr>
-              <w:spacing w:after="0"/>
               <w:ind w:left="158"/>
             </w:pPr>
             <w:r>
@@ -2055,7 +2302,6 @@
           </w:p>
           <w:p>
             <w:pPr>
-              <w:spacing w:after="0"/>
               <w:ind w:left="270"/>
             </w:pPr>
             <w:r>
@@ -2138,7 +2384,6 @@
           </w:p>
           <w:p>
             <w:pPr>
-              <w:spacing w:after="0"/>
               <w:ind w:left="270"/>
             </w:pPr>
             <w:r>
@@ -2293,7 +2538,6 @@
           </w:tcPr>
           <w:p>
             <w:pPr>
-              <w:spacing w:after="0"/>
               <w:ind w:left="151"/>
             </w:pPr>
             <w:r>
@@ -2323,41 +2567,37 @@
             <w:vAlign w:val="center"/>
           </w:tcPr>
           <w:p>
+            <w:r>
+              <w:rPr>
+                <w:b/>
+                <w:color w:val="202020"/>
+                <w:sz w:val="24"/>
+              </w:rPr>
+              <w:t>Dates</w:t>
+            </w:r>
+            <w:r>
+              <w:rPr>
+                <w:i/>
+                <w:color w:val="202020"/>
+                <w:sz w:val="24"/>
+              </w:rPr>
+              <w:t xml:space="preserve"> </w:t>
+            </w:r>
+          </w:p>
+        </w:tc>
+        <w:tc>
+          <w:tcPr>
+            <w:tcW w:w="2181" w:type="dxa"/>
+            <w:tcBorders>
+              <w:top w:val="single" w:sz="6" w:space="0" w:color="CECECE"/>
+              <w:left w:val="single" w:sz="6" w:space="0" w:color="CECECE"/>
+              <w:bottom w:val="single" w:sz="6" w:space="0" w:color="CECECE"/>
+              <w:right w:val="nil"/>
+            </w:tcBorders>
+            <w:vAlign w:val="center"/>
+          </w:tcPr>
+          <w:p>
             <w:pPr>
-              <w:spacing w:after="0"/>
-            </w:pPr>
-            <w:r>
-              <w:rPr>
-                <w:b/>
-                <w:color w:val="202020"/>
-                <w:sz w:val="24"/>
-              </w:rPr>
-              <w:t>Dates</w:t>
-            </w:r>
-            <w:r>
-              <w:rPr>
-                <w:i/>
-                <w:color w:val="202020"/>
-                <w:sz w:val="24"/>
-              </w:rPr>
-              <w:t xml:space="preserve"> </w:t>
-            </w:r>
-          </w:p>
-        </w:tc>
-        <w:tc>
-          <w:tcPr>
-            <w:tcW w:w="2181" w:type="dxa"/>
-            <w:tcBorders>
-              <w:top w:val="single" w:sz="6" w:space="0" w:color="CECECE"/>
-              <w:left w:val="single" w:sz="6" w:space="0" w:color="CECECE"/>
-              <w:bottom w:val="single" w:sz="6" w:space="0" w:color="CECECE"/>
-              <w:right w:val="nil"/>
-            </w:tcBorders>
-            <w:vAlign w:val="center"/>
-          </w:tcPr>
-          <w:p>
-            <w:pPr>
-              <w:spacing w:after="0"/>
               <w:ind w:left="2"/>
             </w:pPr>
             <w:r>
@@ -2411,9 +2651,6 @@
             <w:vAlign w:val="bottom"/>
           </w:tcPr>
           <w:p>
-            <w:pPr>
-              <w:spacing w:after="0"/>
-            </w:pPr>
             <w:r>
               <w:rPr>
                 <w:color w:val="202020"/>
@@ -2483,9 +2720,6 @@
             </w:r>
           </w:p>
           <w:p>
-            <w:pPr>
-              <w:spacing w:after="0"/>
-            </w:pPr>
             <w:r>
               <w:rPr>
                 <w:color w:val="202020"/>
@@ -2535,7 +2769,6 @@
           </w:tcPr>
           <w:p>
             <w:pPr>
-              <w:spacing w:after="0"/>
               <w:ind w:left="2317"/>
             </w:pPr>
             <w:r>
@@ -2573,9 +2806,6 @@
             <w:vAlign w:val="center"/>
           </w:tcPr>
           <w:p>
-            <w:pPr>
-              <w:spacing w:after="0"/>
-            </w:pPr>
             <w:r>
               <w:rPr>
                 <w:b/>
@@ -2608,7 +2838,6 @@
           </w:tcPr>
           <w:p>
             <w:pPr>
-              <w:spacing w:after="0"/>
               <w:ind w:left="2"/>
             </w:pPr>
             <w:r>
@@ -2692,7 +2921,6 @@
           </w:p>
           <w:p>
             <w:pPr>
-              <w:spacing w:after="0"/>
               <w:ind w:left="114"/>
             </w:pPr>
             <w:r>
@@ -2744,7 +2972,6 @@
           </w:tcPr>
           <w:p>
             <w:pPr>
-              <w:spacing w:after="0"/>
               <w:ind w:left="2317"/>
             </w:pPr>
             <w:r>
@@ -2774,9 +3001,6 @@
             <w:vAlign w:val="center"/>
           </w:tcPr>
           <w:p>
-            <w:pPr>
-              <w:spacing w:after="0"/>
-            </w:pPr>
             <w:r>
               <w:rPr>
                 <w:b/>
@@ -2809,7 +3033,6 @@
           </w:tcPr>
           <w:p>
             <w:pPr>
-              <w:spacing w:after="0"/>
               <w:ind w:left="2"/>
             </w:pPr>
             <w:r>
@@ -2893,7 +3116,6 @@
           </w:p>
           <w:p>
             <w:pPr>
-              <w:spacing w:after="0"/>
               <w:ind w:left="114"/>
             </w:pPr>
             <w:r>
@@ -2924,6 +3146,7 @@
           <w:color w:val="202020"/>
           <w:sz w:val="24"/>
         </w:rPr>
+        <w:lastRenderedPageBreak/>
         <w:t>Milestones:</w:t>
       </w:r>
     </w:p>
@@ -2961,9 +3184,6 @@
             <w:vAlign w:val="center"/>
           </w:tcPr>
           <w:p>
-            <w:pPr>
-              <w:spacing w:after="0"/>
-            </w:pPr>
             <w:r>
               <w:rPr>
                 <w:b/>
@@ -2988,7 +3208,6 @@
           </w:tcPr>
           <w:p>
             <w:pPr>
-              <w:spacing w:after="0"/>
               <w:ind w:left="2"/>
             </w:pPr>
             <w:r>
@@ -3138,9 +3357,6 @@
             <w:vAlign w:val="center"/>
           </w:tcPr>
           <w:p>
-            <w:pPr>
-              <w:spacing w:after="0"/>
-            </w:pPr>
             <w:r>
               <w:rPr>
                 <w:b/>
@@ -3165,7 +3381,6 @@
           </w:tcPr>
           <w:p>
             <w:pPr>
-              <w:spacing w:after="0"/>
               <w:ind w:left="2"/>
             </w:pPr>
             <w:r>
@@ -3192,7 +3407,6 @@
           </w:tcPr>
           <w:p>
             <w:pPr>
-              <w:spacing w:after="0"/>
               <w:ind w:left="2"/>
             </w:pPr>
             <w:r>
@@ -3374,9 +3588,6 @@
             <w:vAlign w:val="center"/>
           </w:tcPr>
           <w:p>
-            <w:pPr>
-              <w:spacing w:after="0"/>
-            </w:pPr>
             <w:r>
               <w:rPr>
                 <w:b/>
@@ -3401,7 +3612,6 @@
           </w:tcPr>
           <w:p>
             <w:pPr>
-              <w:spacing w:after="0"/>
               <w:ind w:left="2"/>
             </w:pPr>
             <w:r>
@@ -3428,7 +3638,6 @@
           </w:tcPr>
           <w:p>
             <w:pPr>
-              <w:spacing w:after="0"/>
               <w:ind w:left="2"/>
             </w:pPr>
             <w:r>
@@ -3459,7 +3668,6 @@
           </w:tcPr>
           <w:p>
             <w:pPr>
-              <w:spacing w:after="0"/>
               <w:ind w:left="98"/>
             </w:pPr>
             <w:r>
@@ -3751,7 +3959,6 @@
           </w:tcPr>
           <w:p>
             <w:pPr>
-              <w:spacing w:after="0"/>
               <w:ind w:left="98"/>
             </w:pPr>
             <w:r>
@@ -4043,7 +4250,6 @@
           </w:tcPr>
           <w:p>
             <w:pPr>
-              <w:spacing w:after="0"/>
               <w:ind w:left="98"/>
             </w:pPr>
             <w:r>
@@ -5112,6 +5318,7 @@
   <w:style w:type="paragraph" w:default="1" w:styleId="Normal">
     <w:name w:val="Normal"/>
     <w:qFormat/>
+    <w:rsid w:val="005506E7"/>
     <w:pPr>
       <w:spacing w:line="259" w:lineRule="auto"/>
     </w:pPr>
@@ -5242,6 +5449,25 @@
       <w:color w:val="000000"/>
       <w:sz w:val="22"/>
     </w:rPr>
+  </w:style>
+  <w:style w:type="table" w:styleId="TableGrid0">
+    <w:name w:val="Table Grid"/>
+    <w:basedOn w:val="TableNormal"/>
+    <w:uiPriority w:val="39"/>
+    <w:rsid w:val="005506E7"/>
+    <w:pPr>
+      <w:spacing w:after="0" w:line="240" w:lineRule="auto"/>
+    </w:pPr>
+    <w:tblPr>
+      <w:tblBorders>
+        <w:top w:val="single" w:sz="4" w:space="0" w:color="auto"/>
+        <w:left w:val="single" w:sz="4" w:space="0" w:color="auto"/>
+        <w:bottom w:val="single" w:sz="4" w:space="0" w:color="auto"/>
+        <w:right w:val="single" w:sz="4" w:space="0" w:color="auto"/>
+        <w:insideH w:val="single" w:sz="4" w:space="0" w:color="auto"/>
+        <w:insideV w:val="single" w:sz="4" w:space="0" w:color="auto"/>
+      </w:tblBorders>
+    </w:tblPr>
   </w:style>
 </w:styles>
 </file>

</xml_diff>